<commit_message>
Standardize remaining teaching documents and downloads
</commit_message>
<xml_diff>
--- a/assets/lessons/electromagnetic-spectrum/introduction.docx
+++ b/assets/lessons/electromagnetic-spectrum/introduction.docx
@@ -678,7 +678,7 @@
   <w:docDefaults>
     <w:rPrDefault>
       <w:rPr>
-        <w:rFonts w:asciiTheme="minorHAnsi" w:eastAsiaTheme="minorEastAsia" w:hAnsiTheme="minorHAnsi" w:cstheme="minorBidi"/>
+        <w:rFonts w:ascii="Arial" w:hAnsi="Arial" w:cs="Arial" w:eastAsia="Arial"/>
         <w:sz w:val="22"/>
         <w:szCs w:val="22"/>
         <w:lang w:val="en-US" w:eastAsia="en-US" w:bidi="ar-SA"/>
@@ -837,7 +837,7 @@
       <w:spacing w:after="120" w:line="264" w:lineRule="auto"/>
     </w:pPr>
     <w:rPr>
-      <w:rFonts w:ascii="Arial" w:hAnsi="Arial"/>
+      <w:rFonts w:ascii="Arial" w:hAnsi="Arial" w:cs="Arial" w:eastAsia="Arial"/>
       <w:b w:val="0"/>
       <w:color w:val="000000"/>
       <w:sz w:val="22"/>
@@ -854,7 +854,7 @@
       <w:spacing w:after="120" w:line="264" w:lineRule="auto"/>
     </w:pPr>
     <w:rPr>
-      <w:rFonts w:ascii="Arial" w:hAnsi="Arial"/>
+      <w:rFonts w:ascii="Arial" w:hAnsi="Arial" w:cs="Arial" w:eastAsia="Arial"/>
       <w:b w:val="0"/>
       <w:color w:val="000000"/>
       <w:sz w:val="18"/>
@@ -878,7 +878,7 @@
       <w:spacing w:after="120" w:line="264" w:lineRule="auto"/>
     </w:pPr>
     <w:rPr>
-      <w:rFonts w:ascii="Arial" w:hAnsi="Arial"/>
+      <w:rFonts w:ascii="Arial" w:hAnsi="Arial" w:cs="Arial" w:eastAsia="Arial"/>
       <w:b w:val="0"/>
       <w:color w:val="000000"/>
       <w:sz w:val="18"/>
@@ -906,7 +906,7 @@
       <w:outlineLvl w:val="0"/>
     </w:pPr>
     <w:rPr>
-      <w:rFonts w:asciiTheme="majorHAnsi" w:eastAsiaTheme="majorEastAsia" w:hAnsiTheme="majorHAnsi" w:cstheme="majorBidi" w:ascii="Arial" w:hAnsi="Arial"/>
+      <w:rFonts w:ascii="Arial" w:hAnsi="Arial" w:cs="Arial" w:eastAsia="Arial"/>
       <w:b/>
       <w:bCs/>
       <w:color w:val="000000"/>
@@ -930,7 +930,7 @@
       <w:outlineLvl w:val="1"/>
     </w:pPr>
     <w:rPr>
-      <w:rFonts w:asciiTheme="majorHAnsi" w:eastAsiaTheme="majorEastAsia" w:hAnsiTheme="majorHAnsi" w:cstheme="majorBidi" w:ascii="Arial" w:hAnsi="Arial"/>
+      <w:rFonts w:ascii="Arial" w:hAnsi="Arial" w:cs="Arial" w:eastAsia="Arial"/>
       <w:b/>
       <w:bCs/>
       <w:color w:val="000000"/>
@@ -954,7 +954,7 @@
       <w:outlineLvl w:val="2"/>
     </w:pPr>
     <w:rPr>
-      <w:rFonts w:asciiTheme="majorHAnsi" w:eastAsiaTheme="majorEastAsia" w:hAnsiTheme="majorHAnsi" w:cstheme="majorBidi"/>
+      <w:rFonts w:ascii="Arial" w:hAnsi="Arial" w:cs="Arial" w:eastAsia="Arial"/>
       <w:b/>
       <w:bCs/>
       <w:color w:val="4F81BD" w:themeColor="accent1"/>
@@ -977,7 +977,7 @@
       <w:outlineLvl w:val="3"/>
     </w:pPr>
     <w:rPr>
-      <w:rFonts w:asciiTheme="majorHAnsi" w:eastAsiaTheme="majorEastAsia" w:hAnsiTheme="majorHAnsi" w:cstheme="majorBidi"/>
+      <w:rFonts w:ascii="Arial" w:hAnsi="Arial" w:cs="Arial" w:eastAsia="Arial"/>
       <w:b/>
       <w:bCs/>
       <w:i/>
@@ -1002,7 +1002,7 @@
       <w:outlineLvl w:val="4"/>
     </w:pPr>
     <w:rPr>
-      <w:rFonts w:asciiTheme="majorHAnsi" w:eastAsiaTheme="majorEastAsia" w:hAnsiTheme="majorHAnsi" w:cstheme="majorBidi"/>
+      <w:rFonts w:ascii="Arial" w:hAnsi="Arial" w:cs="Arial" w:eastAsia="Arial"/>
       <w:color w:val="243F60" w:themeColor="accent1" w:themeShade="7F"/>
     </w:rPr>
   </w:style>
@@ -1023,7 +1023,7 @@
       <w:outlineLvl w:val="5"/>
     </w:pPr>
     <w:rPr>
-      <w:rFonts w:asciiTheme="majorHAnsi" w:eastAsiaTheme="majorEastAsia" w:hAnsiTheme="majorHAnsi" w:cstheme="majorBidi"/>
+      <w:rFonts w:ascii="Arial" w:hAnsi="Arial" w:cs="Arial" w:eastAsia="Arial"/>
       <w:i/>
       <w:iCs/>
       <w:color w:val="243F60" w:themeColor="accent1" w:themeShade="7F"/>
@@ -1046,7 +1046,7 @@
       <w:outlineLvl w:val="6"/>
     </w:pPr>
     <w:rPr>
-      <w:rFonts w:asciiTheme="majorHAnsi" w:eastAsiaTheme="majorEastAsia" w:hAnsiTheme="majorHAnsi" w:cstheme="majorBidi"/>
+      <w:rFonts w:ascii="Arial" w:hAnsi="Arial" w:cs="Arial" w:eastAsia="Arial"/>
       <w:i/>
       <w:iCs/>
       <w:color w:val="404040" w:themeColor="text1" w:themeTint="BF"/>
@@ -1069,7 +1069,7 @@
       <w:outlineLvl w:val="7"/>
     </w:pPr>
     <w:rPr>
-      <w:rFonts w:asciiTheme="majorHAnsi" w:eastAsiaTheme="majorEastAsia" w:hAnsiTheme="majorHAnsi" w:cstheme="majorBidi"/>
+      <w:rFonts w:ascii="Arial" w:hAnsi="Arial" w:cs="Arial" w:eastAsia="Arial"/>
       <w:color w:val="4F81BD" w:themeColor="accent1"/>
       <w:sz w:val="20"/>
       <w:szCs w:val="20"/>
@@ -1092,7 +1092,7 @@
       <w:outlineLvl w:val="8"/>
     </w:pPr>
     <w:rPr>
-      <w:rFonts w:asciiTheme="majorHAnsi" w:eastAsiaTheme="majorEastAsia" w:hAnsiTheme="majorHAnsi" w:cstheme="majorBidi"/>
+      <w:rFonts w:ascii="Arial" w:hAnsi="Arial" w:cs="Arial" w:eastAsia="Arial"/>
       <w:i/>
       <w:iCs/>
       <w:color w:val="404040" w:themeColor="text1" w:themeTint="BF"/>
@@ -1143,7 +1143,7 @@
     <w:uiPriority w:val="9"/>
     <w:rsid w:val="00FC693F"/>
     <w:rPr>
-      <w:rFonts w:asciiTheme="majorHAnsi" w:eastAsiaTheme="majorEastAsia" w:hAnsiTheme="majorHAnsi" w:cstheme="majorBidi"/>
+      <w:rFonts w:ascii="Arial" w:hAnsi="Arial" w:cs="Arial" w:eastAsia="Arial"/>
       <w:b/>
       <w:bCs/>
       <w:color w:val="365F91" w:themeColor="accent1" w:themeShade="BF"/>
@@ -1158,7 +1158,7 @@
     <w:uiPriority w:val="9"/>
     <w:rsid w:val="00FC693F"/>
     <w:rPr>
-      <w:rFonts w:asciiTheme="majorHAnsi" w:eastAsiaTheme="majorEastAsia" w:hAnsiTheme="majorHAnsi" w:cstheme="majorBidi"/>
+      <w:rFonts w:ascii="Arial" w:hAnsi="Arial" w:cs="Arial" w:eastAsia="Arial"/>
       <w:b/>
       <w:bCs/>
       <w:color w:val="4F81BD" w:themeColor="accent1"/>
@@ -1173,7 +1173,7 @@
     <w:uiPriority w:val="9"/>
     <w:rsid w:val="00FC693F"/>
     <w:rPr>
-      <w:rFonts w:asciiTheme="majorHAnsi" w:eastAsiaTheme="majorEastAsia" w:hAnsiTheme="majorHAnsi" w:cstheme="majorBidi"/>
+      <w:rFonts w:ascii="Arial" w:hAnsi="Arial" w:cs="Arial" w:eastAsia="Arial"/>
       <w:b/>
       <w:bCs/>
       <w:color w:val="4F81BD" w:themeColor="accent1"/>
@@ -1192,7 +1192,7 @@
       <w:contextualSpacing/>
     </w:pPr>
     <w:rPr>
-      <w:rFonts w:asciiTheme="majorHAnsi" w:eastAsiaTheme="majorEastAsia" w:hAnsiTheme="majorHAnsi" w:cstheme="majorBidi" w:ascii="Arial" w:hAnsi="Arial"/>
+      <w:rFonts w:ascii="Arial" w:hAnsi="Arial" w:cs="Arial" w:eastAsia="Arial"/>
       <w:b/>
       <w:color w:val="000000"/>
       <w:spacing w:val="5"/>
@@ -1208,7 +1208,7 @@
     <w:uiPriority w:val="10"/>
     <w:rsid w:val="00FC693F"/>
     <w:rPr>
-      <w:rFonts w:asciiTheme="majorHAnsi" w:eastAsiaTheme="majorEastAsia" w:hAnsiTheme="majorHAnsi" w:cstheme="majorBidi"/>
+      <w:rFonts w:ascii="Arial" w:hAnsi="Arial" w:cs="Arial" w:eastAsia="Arial"/>
       <w:color w:val="17365D" w:themeColor="text2" w:themeShade="BF"/>
       <w:spacing w:val="5"/>
       <w:kern w:val="28"/>
@@ -1231,7 +1231,7 @@
       <w:spacing w:after="120" w:line="264" w:lineRule="auto"/>
     </w:pPr>
     <w:rPr>
-      <w:rFonts w:asciiTheme="majorHAnsi" w:eastAsiaTheme="majorEastAsia" w:hAnsiTheme="majorHAnsi" w:cstheme="majorBidi" w:ascii="Arial" w:hAnsi="Arial"/>
+      <w:rFonts w:ascii="Arial" w:hAnsi="Arial" w:cs="Arial" w:eastAsia="Arial"/>
       <w:b w:val="0"/>
       <w:i/>
       <w:iCs/>
@@ -1248,7 +1248,7 @@
     <w:uiPriority w:val="11"/>
     <w:rsid w:val="00FC693F"/>
     <w:rPr>
-      <w:rFonts w:asciiTheme="majorHAnsi" w:eastAsiaTheme="majorEastAsia" w:hAnsiTheme="majorHAnsi" w:cstheme="majorBidi"/>
+      <w:rFonts w:ascii="Arial" w:hAnsi="Arial" w:cs="Arial" w:eastAsia="Arial"/>
       <w:i/>
       <w:iCs/>
       <w:color w:val="4F81BD" w:themeColor="accent1"/>
@@ -1377,7 +1377,7 @@
       <w:contextualSpacing/>
     </w:pPr>
     <w:rPr>
-      <w:rFonts w:ascii="Arial" w:hAnsi="Arial"/>
+      <w:rFonts w:ascii="Arial" w:hAnsi="Arial" w:cs="Arial" w:eastAsia="Arial"/>
       <w:b w:val="0"/>
       <w:color w:val="000000"/>
       <w:sz w:val="22"/>
@@ -1423,7 +1423,7 @@
       <w:contextualSpacing/>
     </w:pPr>
     <w:rPr>
-      <w:rFonts w:ascii="Arial" w:hAnsi="Arial"/>
+      <w:rFonts w:ascii="Arial" w:hAnsi="Arial" w:cs="Arial" w:eastAsia="Arial"/>
       <w:b w:val="0"/>
       <w:color w:val="000000"/>
       <w:sz w:val="22"/>
@@ -1509,7 +1509,7 @@
       </w:tabs>
     </w:pPr>
     <w:rPr>
-      <w:rFonts w:ascii="Courier" w:hAnsi="Courier"/>
+      <w:rFonts w:ascii="Arial" w:hAnsi="Arial" w:cs="Arial" w:eastAsia="Arial"/>
       <w:sz w:val="20"/>
       <w:szCs w:val="20"/>
     </w:rPr>
@@ -1521,7 +1521,7 @@
     <w:uiPriority w:val="99"/>
     <w:rsid w:val="0029639D"/>
     <w:rPr>
-      <w:rFonts w:ascii="Courier" w:hAnsi="Courier"/>
+      <w:rFonts w:ascii="Arial" w:hAnsi="Arial" w:cs="Arial" w:eastAsia="Arial"/>
       <w:sz w:val="20"/>
       <w:szCs w:val="20"/>
     </w:rPr>
@@ -1560,7 +1560,7 @@
     <w:semiHidden/>
     <w:rsid w:val="00FC693F"/>
     <w:rPr>
-      <w:rFonts w:asciiTheme="majorHAnsi" w:eastAsiaTheme="majorEastAsia" w:hAnsiTheme="majorHAnsi" w:cstheme="majorBidi"/>
+      <w:rFonts w:ascii="Arial" w:hAnsi="Arial" w:cs="Arial" w:eastAsia="Arial"/>
       <w:b/>
       <w:bCs/>
       <w:i/>
@@ -1576,7 +1576,7 @@
     <w:semiHidden/>
     <w:rsid w:val="00FC693F"/>
     <w:rPr>
-      <w:rFonts w:asciiTheme="majorHAnsi" w:eastAsiaTheme="majorEastAsia" w:hAnsiTheme="majorHAnsi" w:cstheme="majorBidi"/>
+      <w:rFonts w:ascii="Arial" w:hAnsi="Arial" w:cs="Arial" w:eastAsia="Arial"/>
       <w:color w:val="243F60" w:themeColor="accent1" w:themeShade="7F"/>
     </w:rPr>
   </w:style>
@@ -1588,7 +1588,7 @@
     <w:semiHidden/>
     <w:rsid w:val="00FC693F"/>
     <w:rPr>
-      <w:rFonts w:asciiTheme="majorHAnsi" w:eastAsiaTheme="majorEastAsia" w:hAnsiTheme="majorHAnsi" w:cstheme="majorBidi"/>
+      <w:rFonts w:ascii="Arial" w:hAnsi="Arial" w:cs="Arial" w:eastAsia="Arial"/>
       <w:i/>
       <w:iCs/>
       <w:color w:val="243F60" w:themeColor="accent1" w:themeShade="7F"/>
@@ -1602,7 +1602,7 @@
     <w:semiHidden/>
     <w:rsid w:val="00FC693F"/>
     <w:rPr>
-      <w:rFonts w:asciiTheme="majorHAnsi" w:eastAsiaTheme="majorEastAsia" w:hAnsiTheme="majorHAnsi" w:cstheme="majorBidi"/>
+      <w:rFonts w:ascii="Arial" w:hAnsi="Arial" w:cs="Arial" w:eastAsia="Arial"/>
       <w:i/>
       <w:iCs/>
       <w:color w:val="404040" w:themeColor="text1" w:themeTint="BF"/>
@@ -1616,7 +1616,7 @@
     <w:semiHidden/>
     <w:rsid w:val="00FC693F"/>
     <w:rPr>
-      <w:rFonts w:asciiTheme="majorHAnsi" w:eastAsiaTheme="majorEastAsia" w:hAnsiTheme="majorHAnsi" w:cstheme="majorBidi"/>
+      <w:rFonts w:ascii="Arial" w:hAnsi="Arial" w:cs="Arial" w:eastAsia="Arial"/>
       <w:color w:val="4F81BD" w:themeColor="accent1"/>
       <w:sz w:val="20"/>
       <w:szCs w:val="20"/>
@@ -1630,7 +1630,7 @@
     <w:semiHidden/>
     <w:rsid w:val="00FC693F"/>
     <w:rPr>
-      <w:rFonts w:asciiTheme="majorHAnsi" w:eastAsiaTheme="majorEastAsia" w:hAnsiTheme="majorHAnsi" w:cstheme="majorBidi"/>
+      <w:rFonts w:ascii="Arial" w:hAnsi="Arial" w:cs="Arial" w:eastAsia="Arial"/>
       <w:i/>
       <w:iCs/>
       <w:color w:val="404040" w:themeColor="text1" w:themeTint="BF"/>
@@ -3216,7 +3216,7 @@
         <w:spacing w:before="0" w:after="0" w:line="240" w:lineRule="auto"/>
       </w:pPr>
       <w:rPr>
-        <w:rFonts w:asciiTheme="majorHAnsi" w:eastAsiaTheme="majorEastAsia" w:hAnsiTheme="majorHAnsi" w:cstheme="majorBidi"/>
+        <w:rFonts w:ascii="Arial" w:hAnsi="Arial" w:cs="Arial" w:eastAsia="Arial"/>
         <w:b/>
         <w:bCs/>
       </w:rPr>
@@ -3237,7 +3237,7 @@
         <w:spacing w:before="0" w:after="0" w:line="240" w:lineRule="auto"/>
       </w:pPr>
       <w:rPr>
-        <w:rFonts w:asciiTheme="majorHAnsi" w:eastAsiaTheme="majorEastAsia" w:hAnsiTheme="majorHAnsi" w:cstheme="majorBidi"/>
+        <w:rFonts w:ascii="Arial" w:hAnsi="Arial" w:cs="Arial" w:eastAsia="Arial"/>
         <w:b/>
         <w:bCs/>
       </w:rPr>
@@ -3255,14 +3255,14 @@
     </w:tblStylePr>
     <w:tblStylePr w:type="firstCol">
       <w:rPr>
-        <w:rFonts w:asciiTheme="majorHAnsi" w:eastAsiaTheme="majorEastAsia" w:hAnsiTheme="majorHAnsi" w:cstheme="majorBidi"/>
+        <w:rFonts w:ascii="Arial" w:hAnsi="Arial" w:cs="Arial" w:eastAsia="Arial"/>
         <w:b/>
         <w:bCs/>
       </w:rPr>
     </w:tblStylePr>
     <w:tblStylePr w:type="lastCol">
       <w:rPr>
-        <w:rFonts w:asciiTheme="majorHAnsi" w:eastAsiaTheme="majorEastAsia" w:hAnsiTheme="majorHAnsi" w:cstheme="majorBidi"/>
+        <w:rFonts w:ascii="Arial" w:hAnsi="Arial" w:cs="Arial" w:eastAsia="Arial"/>
         <w:b/>
         <w:bCs/>
       </w:rPr>
@@ -3346,7 +3346,7 @@
         <w:spacing w:before="0" w:after="0" w:line="240" w:lineRule="auto"/>
       </w:pPr>
       <w:rPr>
-        <w:rFonts w:asciiTheme="majorHAnsi" w:eastAsiaTheme="majorEastAsia" w:hAnsiTheme="majorHAnsi" w:cstheme="majorBidi"/>
+        <w:rFonts w:ascii="Arial" w:hAnsi="Arial" w:cs="Arial" w:eastAsia="Arial"/>
         <w:b/>
         <w:bCs/>
       </w:rPr>
@@ -3367,7 +3367,7 @@
         <w:spacing w:before="0" w:after="0" w:line="240" w:lineRule="auto"/>
       </w:pPr>
       <w:rPr>
-        <w:rFonts w:asciiTheme="majorHAnsi" w:eastAsiaTheme="majorEastAsia" w:hAnsiTheme="majorHAnsi" w:cstheme="majorBidi"/>
+        <w:rFonts w:ascii="Arial" w:hAnsi="Arial" w:cs="Arial" w:eastAsia="Arial"/>
         <w:b/>
         <w:bCs/>
       </w:rPr>
@@ -3385,14 +3385,14 @@
     </w:tblStylePr>
     <w:tblStylePr w:type="firstCol">
       <w:rPr>
-        <w:rFonts w:asciiTheme="majorHAnsi" w:eastAsiaTheme="majorEastAsia" w:hAnsiTheme="majorHAnsi" w:cstheme="majorBidi"/>
+        <w:rFonts w:ascii="Arial" w:hAnsi="Arial" w:cs="Arial" w:eastAsia="Arial"/>
         <w:b/>
         <w:bCs/>
       </w:rPr>
     </w:tblStylePr>
     <w:tblStylePr w:type="lastCol">
       <w:rPr>
-        <w:rFonts w:asciiTheme="majorHAnsi" w:eastAsiaTheme="majorEastAsia" w:hAnsiTheme="majorHAnsi" w:cstheme="majorBidi"/>
+        <w:rFonts w:ascii="Arial" w:hAnsi="Arial" w:cs="Arial" w:eastAsia="Arial"/>
         <w:b/>
         <w:bCs/>
       </w:rPr>
@@ -3476,7 +3476,7 @@
         <w:spacing w:before="0" w:after="0" w:line="240" w:lineRule="auto"/>
       </w:pPr>
       <w:rPr>
-        <w:rFonts w:asciiTheme="majorHAnsi" w:eastAsiaTheme="majorEastAsia" w:hAnsiTheme="majorHAnsi" w:cstheme="majorBidi"/>
+        <w:rFonts w:ascii="Arial" w:hAnsi="Arial" w:cs="Arial" w:eastAsia="Arial"/>
         <w:b/>
         <w:bCs/>
       </w:rPr>
@@ -3497,7 +3497,7 @@
         <w:spacing w:before="0" w:after="0" w:line="240" w:lineRule="auto"/>
       </w:pPr>
       <w:rPr>
-        <w:rFonts w:asciiTheme="majorHAnsi" w:eastAsiaTheme="majorEastAsia" w:hAnsiTheme="majorHAnsi" w:cstheme="majorBidi"/>
+        <w:rFonts w:ascii="Arial" w:hAnsi="Arial" w:cs="Arial" w:eastAsia="Arial"/>
         <w:b/>
         <w:bCs/>
       </w:rPr>
@@ -3515,14 +3515,14 @@
     </w:tblStylePr>
     <w:tblStylePr w:type="firstCol">
       <w:rPr>
-        <w:rFonts w:asciiTheme="majorHAnsi" w:eastAsiaTheme="majorEastAsia" w:hAnsiTheme="majorHAnsi" w:cstheme="majorBidi"/>
+        <w:rFonts w:ascii="Arial" w:hAnsi="Arial" w:cs="Arial" w:eastAsia="Arial"/>
         <w:b/>
         <w:bCs/>
       </w:rPr>
     </w:tblStylePr>
     <w:tblStylePr w:type="lastCol">
       <w:rPr>
-        <w:rFonts w:asciiTheme="majorHAnsi" w:eastAsiaTheme="majorEastAsia" w:hAnsiTheme="majorHAnsi" w:cstheme="majorBidi"/>
+        <w:rFonts w:ascii="Arial" w:hAnsi="Arial" w:cs="Arial" w:eastAsia="Arial"/>
         <w:b/>
         <w:bCs/>
       </w:rPr>
@@ -3606,7 +3606,7 @@
         <w:spacing w:before="0" w:after="0" w:line="240" w:lineRule="auto"/>
       </w:pPr>
       <w:rPr>
-        <w:rFonts w:asciiTheme="majorHAnsi" w:eastAsiaTheme="majorEastAsia" w:hAnsiTheme="majorHAnsi" w:cstheme="majorBidi"/>
+        <w:rFonts w:ascii="Arial" w:hAnsi="Arial" w:cs="Arial" w:eastAsia="Arial"/>
         <w:b/>
         <w:bCs/>
       </w:rPr>
@@ -3627,7 +3627,7 @@
         <w:spacing w:before="0" w:after="0" w:line="240" w:lineRule="auto"/>
       </w:pPr>
       <w:rPr>
-        <w:rFonts w:asciiTheme="majorHAnsi" w:eastAsiaTheme="majorEastAsia" w:hAnsiTheme="majorHAnsi" w:cstheme="majorBidi"/>
+        <w:rFonts w:ascii="Arial" w:hAnsi="Arial" w:cs="Arial" w:eastAsia="Arial"/>
         <w:b/>
         <w:bCs/>
       </w:rPr>
@@ -3645,14 +3645,14 @@
     </w:tblStylePr>
     <w:tblStylePr w:type="firstCol">
       <w:rPr>
-        <w:rFonts w:asciiTheme="majorHAnsi" w:eastAsiaTheme="majorEastAsia" w:hAnsiTheme="majorHAnsi" w:cstheme="majorBidi"/>
+        <w:rFonts w:ascii="Arial" w:hAnsi="Arial" w:cs="Arial" w:eastAsia="Arial"/>
         <w:b/>
         <w:bCs/>
       </w:rPr>
     </w:tblStylePr>
     <w:tblStylePr w:type="lastCol">
       <w:rPr>
-        <w:rFonts w:asciiTheme="majorHAnsi" w:eastAsiaTheme="majorEastAsia" w:hAnsiTheme="majorHAnsi" w:cstheme="majorBidi"/>
+        <w:rFonts w:ascii="Arial" w:hAnsi="Arial" w:cs="Arial" w:eastAsia="Arial"/>
         <w:b/>
         <w:bCs/>
       </w:rPr>
@@ -3736,7 +3736,7 @@
         <w:spacing w:before="0" w:after="0" w:line="240" w:lineRule="auto"/>
       </w:pPr>
       <w:rPr>
-        <w:rFonts w:asciiTheme="majorHAnsi" w:eastAsiaTheme="majorEastAsia" w:hAnsiTheme="majorHAnsi" w:cstheme="majorBidi"/>
+        <w:rFonts w:ascii="Arial" w:hAnsi="Arial" w:cs="Arial" w:eastAsia="Arial"/>
         <w:b/>
         <w:bCs/>
       </w:rPr>
@@ -3757,7 +3757,7 @@
         <w:spacing w:before="0" w:after="0" w:line="240" w:lineRule="auto"/>
       </w:pPr>
       <w:rPr>
-        <w:rFonts w:asciiTheme="majorHAnsi" w:eastAsiaTheme="majorEastAsia" w:hAnsiTheme="majorHAnsi" w:cstheme="majorBidi"/>
+        <w:rFonts w:ascii="Arial" w:hAnsi="Arial" w:cs="Arial" w:eastAsia="Arial"/>
         <w:b/>
         <w:bCs/>
       </w:rPr>
@@ -3775,14 +3775,14 @@
     </w:tblStylePr>
     <w:tblStylePr w:type="firstCol">
       <w:rPr>
-        <w:rFonts w:asciiTheme="majorHAnsi" w:eastAsiaTheme="majorEastAsia" w:hAnsiTheme="majorHAnsi" w:cstheme="majorBidi"/>
+        <w:rFonts w:ascii="Arial" w:hAnsi="Arial" w:cs="Arial" w:eastAsia="Arial"/>
         <w:b/>
         <w:bCs/>
       </w:rPr>
     </w:tblStylePr>
     <w:tblStylePr w:type="lastCol">
       <w:rPr>
-        <w:rFonts w:asciiTheme="majorHAnsi" w:eastAsiaTheme="majorEastAsia" w:hAnsiTheme="majorHAnsi" w:cstheme="majorBidi"/>
+        <w:rFonts w:ascii="Arial" w:hAnsi="Arial" w:cs="Arial" w:eastAsia="Arial"/>
         <w:b/>
         <w:bCs/>
       </w:rPr>
@@ -3866,7 +3866,7 @@
         <w:spacing w:before="0" w:after="0" w:line="240" w:lineRule="auto"/>
       </w:pPr>
       <w:rPr>
-        <w:rFonts w:asciiTheme="majorHAnsi" w:eastAsiaTheme="majorEastAsia" w:hAnsiTheme="majorHAnsi" w:cstheme="majorBidi"/>
+        <w:rFonts w:ascii="Arial" w:hAnsi="Arial" w:cs="Arial" w:eastAsia="Arial"/>
         <w:b/>
         <w:bCs/>
       </w:rPr>
@@ -3887,7 +3887,7 @@
         <w:spacing w:before="0" w:after="0" w:line="240" w:lineRule="auto"/>
       </w:pPr>
       <w:rPr>
-        <w:rFonts w:asciiTheme="majorHAnsi" w:eastAsiaTheme="majorEastAsia" w:hAnsiTheme="majorHAnsi" w:cstheme="majorBidi"/>
+        <w:rFonts w:ascii="Arial" w:hAnsi="Arial" w:cs="Arial" w:eastAsia="Arial"/>
         <w:b/>
         <w:bCs/>
       </w:rPr>
@@ -3905,14 +3905,14 @@
     </w:tblStylePr>
     <w:tblStylePr w:type="firstCol">
       <w:rPr>
-        <w:rFonts w:asciiTheme="majorHAnsi" w:eastAsiaTheme="majorEastAsia" w:hAnsiTheme="majorHAnsi" w:cstheme="majorBidi"/>
+        <w:rFonts w:ascii="Arial" w:hAnsi="Arial" w:cs="Arial" w:eastAsia="Arial"/>
         <w:b/>
         <w:bCs/>
       </w:rPr>
     </w:tblStylePr>
     <w:tblStylePr w:type="lastCol">
       <w:rPr>
-        <w:rFonts w:asciiTheme="majorHAnsi" w:eastAsiaTheme="majorEastAsia" w:hAnsiTheme="majorHAnsi" w:cstheme="majorBidi"/>
+        <w:rFonts w:ascii="Arial" w:hAnsi="Arial" w:cs="Arial" w:eastAsia="Arial"/>
         <w:b/>
         <w:bCs/>
       </w:rPr>
@@ -3996,7 +3996,7 @@
         <w:spacing w:before="0" w:after="0" w:line="240" w:lineRule="auto"/>
       </w:pPr>
       <w:rPr>
-        <w:rFonts w:asciiTheme="majorHAnsi" w:eastAsiaTheme="majorEastAsia" w:hAnsiTheme="majorHAnsi" w:cstheme="majorBidi"/>
+        <w:rFonts w:ascii="Arial" w:hAnsi="Arial" w:cs="Arial" w:eastAsia="Arial"/>
         <w:b/>
         <w:bCs/>
       </w:rPr>
@@ -4017,7 +4017,7 @@
         <w:spacing w:before="0" w:after="0" w:line="240" w:lineRule="auto"/>
       </w:pPr>
       <w:rPr>
-        <w:rFonts w:asciiTheme="majorHAnsi" w:eastAsiaTheme="majorEastAsia" w:hAnsiTheme="majorHAnsi" w:cstheme="majorBidi"/>
+        <w:rFonts w:ascii="Arial" w:hAnsi="Arial" w:cs="Arial" w:eastAsia="Arial"/>
         <w:b/>
         <w:bCs/>
       </w:rPr>
@@ -4035,14 +4035,14 @@
     </w:tblStylePr>
     <w:tblStylePr w:type="firstCol">
       <w:rPr>
-        <w:rFonts w:asciiTheme="majorHAnsi" w:eastAsiaTheme="majorEastAsia" w:hAnsiTheme="majorHAnsi" w:cstheme="majorBidi"/>
+        <w:rFonts w:ascii="Arial" w:hAnsi="Arial" w:cs="Arial" w:eastAsia="Arial"/>
         <w:b/>
         <w:bCs/>
       </w:rPr>
     </w:tblStylePr>
     <w:tblStylePr w:type="lastCol">
       <w:rPr>
-        <w:rFonts w:asciiTheme="majorHAnsi" w:eastAsiaTheme="majorEastAsia" w:hAnsiTheme="majorHAnsi" w:cstheme="majorBidi"/>
+        <w:rFonts w:ascii="Arial" w:hAnsi="Arial" w:cs="Arial" w:eastAsia="Arial"/>
         <w:b/>
         <w:bCs/>
       </w:rPr>
@@ -5907,7 +5907,7 @@
     </w:tblPr>
     <w:tblStylePr w:type="firstRow">
       <w:rPr>
-        <w:rFonts w:asciiTheme="majorHAnsi" w:eastAsiaTheme="majorEastAsia" w:hAnsiTheme="majorHAnsi" w:cstheme="majorBidi"/>
+        <w:rFonts w:ascii="Arial" w:hAnsi="Arial" w:cs="Arial" w:eastAsia="Arial"/>
       </w:rPr>
       <w:tblPr/>
       <w:tcPr>
@@ -5991,7 +5991,7 @@
     </w:tblPr>
     <w:tblStylePr w:type="firstRow">
       <w:rPr>
-        <w:rFonts w:asciiTheme="majorHAnsi" w:eastAsiaTheme="majorEastAsia" w:hAnsiTheme="majorHAnsi" w:cstheme="majorBidi"/>
+        <w:rFonts w:ascii="Arial" w:hAnsi="Arial" w:cs="Arial" w:eastAsia="Arial"/>
       </w:rPr>
       <w:tblPr/>
       <w:tcPr>
@@ -6075,7 +6075,7 @@
     </w:tblPr>
     <w:tblStylePr w:type="firstRow">
       <w:rPr>
-        <w:rFonts w:asciiTheme="majorHAnsi" w:eastAsiaTheme="majorEastAsia" w:hAnsiTheme="majorHAnsi" w:cstheme="majorBidi"/>
+        <w:rFonts w:ascii="Arial" w:hAnsi="Arial" w:cs="Arial" w:eastAsia="Arial"/>
       </w:rPr>
       <w:tblPr/>
       <w:tcPr>
@@ -6159,7 +6159,7 @@
     </w:tblPr>
     <w:tblStylePr w:type="firstRow">
       <w:rPr>
-        <w:rFonts w:asciiTheme="majorHAnsi" w:eastAsiaTheme="majorEastAsia" w:hAnsiTheme="majorHAnsi" w:cstheme="majorBidi"/>
+        <w:rFonts w:ascii="Arial" w:hAnsi="Arial" w:cs="Arial" w:eastAsia="Arial"/>
       </w:rPr>
       <w:tblPr/>
       <w:tcPr>
@@ -6243,7 +6243,7 @@
     </w:tblPr>
     <w:tblStylePr w:type="firstRow">
       <w:rPr>
-        <w:rFonts w:asciiTheme="majorHAnsi" w:eastAsiaTheme="majorEastAsia" w:hAnsiTheme="majorHAnsi" w:cstheme="majorBidi"/>
+        <w:rFonts w:ascii="Arial" w:hAnsi="Arial" w:cs="Arial" w:eastAsia="Arial"/>
       </w:rPr>
       <w:tblPr/>
       <w:tcPr>
@@ -6327,7 +6327,7 @@
     </w:tblPr>
     <w:tblStylePr w:type="firstRow">
       <w:rPr>
-        <w:rFonts w:asciiTheme="majorHAnsi" w:eastAsiaTheme="majorEastAsia" w:hAnsiTheme="majorHAnsi" w:cstheme="majorBidi"/>
+        <w:rFonts w:ascii="Arial" w:hAnsi="Arial" w:cs="Arial" w:eastAsia="Arial"/>
       </w:rPr>
       <w:tblPr/>
       <w:tcPr>
@@ -6411,7 +6411,7 @@
     </w:tblPr>
     <w:tblStylePr w:type="firstRow">
       <w:rPr>
-        <w:rFonts w:asciiTheme="majorHAnsi" w:eastAsiaTheme="majorEastAsia" w:hAnsiTheme="majorHAnsi" w:cstheme="majorBidi"/>
+        <w:rFonts w:ascii="Arial" w:hAnsi="Arial" w:cs="Arial" w:eastAsia="Arial"/>
       </w:rPr>
       <w:tblPr/>
       <w:tcPr>
@@ -6476,7 +6476,7 @@
       <w:spacing w:after="0" w:line="240" w:lineRule="auto"/>
     </w:pPr>
     <w:rPr>
-      <w:rFonts w:asciiTheme="majorHAnsi" w:eastAsiaTheme="majorEastAsia" w:hAnsiTheme="majorHAnsi" w:cstheme="majorBidi"/>
+      <w:rFonts w:ascii="Arial" w:hAnsi="Arial" w:cs="Arial" w:eastAsia="Arial"/>
       <w:color w:val="000000" w:themeColor="text1"/>
     </w:rPr>
     <w:tblPr>
@@ -6604,7 +6604,7 @@
       <w:spacing w:after="0" w:line="240" w:lineRule="auto"/>
     </w:pPr>
     <w:rPr>
-      <w:rFonts w:asciiTheme="majorHAnsi" w:eastAsiaTheme="majorEastAsia" w:hAnsiTheme="majorHAnsi" w:cstheme="majorBidi"/>
+      <w:rFonts w:ascii="Arial" w:hAnsi="Arial" w:cs="Arial" w:eastAsia="Arial"/>
       <w:color w:val="000000" w:themeColor="text1"/>
     </w:rPr>
     <w:tblPr>
@@ -6732,7 +6732,7 @@
       <w:spacing w:after="0" w:line="240" w:lineRule="auto"/>
     </w:pPr>
     <w:rPr>
-      <w:rFonts w:asciiTheme="majorHAnsi" w:eastAsiaTheme="majorEastAsia" w:hAnsiTheme="majorHAnsi" w:cstheme="majorBidi"/>
+      <w:rFonts w:ascii="Arial" w:hAnsi="Arial" w:cs="Arial" w:eastAsia="Arial"/>
       <w:color w:val="000000" w:themeColor="text1"/>
     </w:rPr>
     <w:tblPr>
@@ -6860,7 +6860,7 @@
       <w:spacing w:after="0" w:line="240" w:lineRule="auto"/>
     </w:pPr>
     <w:rPr>
-      <w:rFonts w:asciiTheme="majorHAnsi" w:eastAsiaTheme="majorEastAsia" w:hAnsiTheme="majorHAnsi" w:cstheme="majorBidi"/>
+      <w:rFonts w:ascii="Arial" w:hAnsi="Arial" w:cs="Arial" w:eastAsia="Arial"/>
       <w:color w:val="000000" w:themeColor="text1"/>
     </w:rPr>
     <w:tblPr>
@@ -6988,7 +6988,7 @@
       <w:spacing w:after="0" w:line="240" w:lineRule="auto"/>
     </w:pPr>
     <w:rPr>
-      <w:rFonts w:asciiTheme="majorHAnsi" w:eastAsiaTheme="majorEastAsia" w:hAnsiTheme="majorHAnsi" w:cstheme="majorBidi"/>
+      <w:rFonts w:ascii="Arial" w:hAnsi="Arial" w:cs="Arial" w:eastAsia="Arial"/>
       <w:color w:val="000000" w:themeColor="text1"/>
     </w:rPr>
     <w:tblPr>
@@ -7116,7 +7116,7 @@
       <w:spacing w:after="0" w:line="240" w:lineRule="auto"/>
     </w:pPr>
     <w:rPr>
-      <w:rFonts w:asciiTheme="majorHAnsi" w:eastAsiaTheme="majorEastAsia" w:hAnsiTheme="majorHAnsi" w:cstheme="majorBidi"/>
+      <w:rFonts w:ascii="Arial" w:hAnsi="Arial" w:cs="Arial" w:eastAsia="Arial"/>
       <w:color w:val="000000" w:themeColor="text1"/>
     </w:rPr>
     <w:tblPr>
@@ -7244,7 +7244,7 @@
       <w:spacing w:after="0" w:line="240" w:lineRule="auto"/>
     </w:pPr>
     <w:rPr>
-      <w:rFonts w:asciiTheme="majorHAnsi" w:eastAsiaTheme="majorEastAsia" w:hAnsiTheme="majorHAnsi" w:cstheme="majorBidi"/>
+      <w:rFonts w:ascii="Arial" w:hAnsi="Arial" w:cs="Arial" w:eastAsia="Arial"/>
       <w:color w:val="000000" w:themeColor="text1"/>
     </w:rPr>
     <w:tblPr>
@@ -7883,7 +7883,7 @@
       <w:spacing w:after="0" w:line="240" w:lineRule="auto"/>
     </w:pPr>
     <w:rPr>
-      <w:rFonts w:asciiTheme="majorHAnsi" w:eastAsiaTheme="majorEastAsia" w:hAnsiTheme="majorHAnsi" w:cstheme="majorBidi"/>
+      <w:rFonts w:ascii="Arial" w:hAnsi="Arial" w:cs="Arial" w:eastAsia="Arial"/>
       <w:color w:val="000000" w:themeColor="text1"/>
     </w:rPr>
     <w:tblPr>
@@ -8008,7 +8008,7 @@
       <w:spacing w:after="0" w:line="240" w:lineRule="auto"/>
     </w:pPr>
     <w:rPr>
-      <w:rFonts w:asciiTheme="majorHAnsi" w:eastAsiaTheme="majorEastAsia" w:hAnsiTheme="majorHAnsi" w:cstheme="majorBidi"/>
+      <w:rFonts w:ascii="Arial" w:hAnsi="Arial" w:cs="Arial" w:eastAsia="Arial"/>
       <w:color w:val="000000" w:themeColor="text1"/>
     </w:rPr>
     <w:tblPr>
@@ -8133,7 +8133,7 @@
       <w:spacing w:after="0" w:line="240" w:lineRule="auto"/>
     </w:pPr>
     <w:rPr>
-      <w:rFonts w:asciiTheme="majorHAnsi" w:eastAsiaTheme="majorEastAsia" w:hAnsiTheme="majorHAnsi" w:cstheme="majorBidi"/>
+      <w:rFonts w:ascii="Arial" w:hAnsi="Arial" w:cs="Arial" w:eastAsia="Arial"/>
       <w:color w:val="000000" w:themeColor="text1"/>
     </w:rPr>
     <w:tblPr>
@@ -8258,7 +8258,7 @@
       <w:spacing w:after="0" w:line="240" w:lineRule="auto"/>
     </w:pPr>
     <w:rPr>
-      <w:rFonts w:asciiTheme="majorHAnsi" w:eastAsiaTheme="majorEastAsia" w:hAnsiTheme="majorHAnsi" w:cstheme="majorBidi"/>
+      <w:rFonts w:ascii="Arial" w:hAnsi="Arial" w:cs="Arial" w:eastAsia="Arial"/>
       <w:color w:val="000000" w:themeColor="text1"/>
     </w:rPr>
     <w:tblPr>
@@ -8383,7 +8383,7 @@
       <w:spacing w:after="0" w:line="240" w:lineRule="auto"/>
     </w:pPr>
     <w:rPr>
-      <w:rFonts w:asciiTheme="majorHAnsi" w:eastAsiaTheme="majorEastAsia" w:hAnsiTheme="majorHAnsi" w:cstheme="majorBidi"/>
+      <w:rFonts w:ascii="Arial" w:hAnsi="Arial" w:cs="Arial" w:eastAsia="Arial"/>
       <w:color w:val="000000" w:themeColor="text1"/>
     </w:rPr>
     <w:tblPr>
@@ -8508,7 +8508,7 @@
       <w:spacing w:after="0" w:line="240" w:lineRule="auto"/>
     </w:pPr>
     <w:rPr>
-      <w:rFonts w:asciiTheme="majorHAnsi" w:eastAsiaTheme="majorEastAsia" w:hAnsiTheme="majorHAnsi" w:cstheme="majorBidi"/>
+      <w:rFonts w:ascii="Arial" w:hAnsi="Arial" w:cs="Arial" w:eastAsia="Arial"/>
       <w:color w:val="000000" w:themeColor="text1"/>
     </w:rPr>
     <w:tblPr>
@@ -8633,7 +8633,7 @@
       <w:spacing w:after="0" w:line="240" w:lineRule="auto"/>
     </w:pPr>
     <w:rPr>
-      <w:rFonts w:asciiTheme="majorHAnsi" w:eastAsiaTheme="majorEastAsia" w:hAnsiTheme="majorHAnsi" w:cstheme="majorBidi"/>
+      <w:rFonts w:ascii="Arial" w:hAnsi="Arial" w:cs="Arial" w:eastAsia="Arial"/>
       <w:color w:val="000000" w:themeColor="text1"/>
     </w:rPr>
     <w:tblPr>
@@ -12548,7 +12548,7 @@
   <w:docDefaults>
     <w:rPrDefault>
       <w:rPr>
-        <w:rFonts w:asciiTheme="minorHAnsi" w:eastAsiaTheme="minorEastAsia" w:hAnsiTheme="minorHAnsi" w:cstheme="minorBidi"/>
+        <w:rFonts w:ascii="Arial" w:hAnsi="Arial" w:cs="Arial" w:eastAsia="Arial"/>
         <w:sz w:val="22"/>
         <w:szCs w:val="22"/>
         <w:lang w:val="en-US" w:eastAsia="en-US" w:bidi="ar-SA"/>
@@ -12719,7 +12719,7 @@
       <w:outlineLvl w:val="0"/>
     </w:pPr>
     <w:rPr>
-      <w:rFonts w:asciiTheme="majorHAnsi" w:eastAsiaTheme="majorEastAsia" w:hAnsiTheme="majorHAnsi" w:cstheme="majorBidi"/>
+      <w:rFonts w:ascii="Arial" w:hAnsi="Arial" w:cs="Arial" w:eastAsia="Arial"/>
       <w:b/>
       <w:bCs/>
       <w:color w:val="365F91" w:themeColor="accent1" w:themeShade="BF"/>
@@ -12743,7 +12743,7 @@
       <w:outlineLvl w:val="1"/>
     </w:pPr>
     <w:rPr>
-      <w:rFonts w:asciiTheme="majorHAnsi" w:eastAsiaTheme="majorEastAsia" w:hAnsiTheme="majorHAnsi" w:cstheme="majorBidi"/>
+      <w:rFonts w:ascii="Arial" w:hAnsi="Arial" w:cs="Arial" w:eastAsia="Arial"/>
       <w:b/>
       <w:bCs/>
       <w:color w:val="4F81BD" w:themeColor="accent1"/>
@@ -12767,7 +12767,7 @@
       <w:outlineLvl w:val="2"/>
     </w:pPr>
     <w:rPr>
-      <w:rFonts w:asciiTheme="majorHAnsi" w:eastAsiaTheme="majorEastAsia" w:hAnsiTheme="majorHAnsi" w:cstheme="majorBidi"/>
+      <w:rFonts w:ascii="Arial" w:hAnsi="Arial" w:cs="Arial" w:eastAsia="Arial"/>
       <w:b/>
       <w:bCs/>
       <w:color w:val="4F81BD" w:themeColor="accent1"/>
@@ -12790,7 +12790,7 @@
       <w:outlineLvl w:val="3"/>
     </w:pPr>
     <w:rPr>
-      <w:rFonts w:asciiTheme="majorHAnsi" w:eastAsiaTheme="majorEastAsia" w:hAnsiTheme="majorHAnsi" w:cstheme="majorBidi"/>
+      <w:rFonts w:ascii="Arial" w:hAnsi="Arial" w:cs="Arial" w:eastAsia="Arial"/>
       <w:b/>
       <w:bCs/>
       <w:i/>
@@ -12815,7 +12815,7 @@
       <w:outlineLvl w:val="4"/>
     </w:pPr>
     <w:rPr>
-      <w:rFonts w:asciiTheme="majorHAnsi" w:eastAsiaTheme="majorEastAsia" w:hAnsiTheme="majorHAnsi" w:cstheme="majorBidi"/>
+      <w:rFonts w:ascii="Arial" w:hAnsi="Arial" w:cs="Arial" w:eastAsia="Arial"/>
       <w:color w:val="243F60" w:themeColor="accent1" w:themeShade="7F"/>
     </w:rPr>
   </w:style>
@@ -12836,7 +12836,7 @@
       <w:outlineLvl w:val="5"/>
     </w:pPr>
     <w:rPr>
-      <w:rFonts w:asciiTheme="majorHAnsi" w:eastAsiaTheme="majorEastAsia" w:hAnsiTheme="majorHAnsi" w:cstheme="majorBidi"/>
+      <w:rFonts w:ascii="Arial" w:hAnsi="Arial" w:cs="Arial" w:eastAsia="Arial"/>
       <w:i/>
       <w:iCs/>
       <w:color w:val="243F60" w:themeColor="accent1" w:themeShade="7F"/>
@@ -12859,7 +12859,7 @@
       <w:outlineLvl w:val="6"/>
     </w:pPr>
     <w:rPr>
-      <w:rFonts w:asciiTheme="majorHAnsi" w:eastAsiaTheme="majorEastAsia" w:hAnsiTheme="majorHAnsi" w:cstheme="majorBidi"/>
+      <w:rFonts w:ascii="Arial" w:hAnsi="Arial" w:cs="Arial" w:eastAsia="Arial"/>
       <w:i/>
       <w:iCs/>
       <w:color w:val="404040" w:themeColor="text1" w:themeTint="BF"/>
@@ -12882,7 +12882,7 @@
       <w:outlineLvl w:val="7"/>
     </w:pPr>
     <w:rPr>
-      <w:rFonts w:asciiTheme="majorHAnsi" w:eastAsiaTheme="majorEastAsia" w:hAnsiTheme="majorHAnsi" w:cstheme="majorBidi"/>
+      <w:rFonts w:ascii="Arial" w:hAnsi="Arial" w:cs="Arial" w:eastAsia="Arial"/>
       <w:color w:val="4F81BD" w:themeColor="accent1"/>
       <w:sz w:val="20"/>
       <w:szCs w:val="20"/>
@@ -12905,7 +12905,7 @@
       <w:outlineLvl w:val="8"/>
     </w:pPr>
     <w:rPr>
-      <w:rFonts w:asciiTheme="majorHAnsi" w:eastAsiaTheme="majorEastAsia" w:hAnsiTheme="majorHAnsi" w:cstheme="majorBidi"/>
+      <w:rFonts w:ascii="Arial" w:hAnsi="Arial" w:cs="Arial" w:eastAsia="Arial"/>
       <w:i/>
       <w:iCs/>
       <w:color w:val="404040" w:themeColor="text1" w:themeTint="BF"/>
@@ -12956,7 +12956,7 @@
     <w:uiPriority w:val="9"/>
     <w:rsid w:val="00FC693F"/>
     <w:rPr>
-      <w:rFonts w:asciiTheme="majorHAnsi" w:eastAsiaTheme="majorEastAsia" w:hAnsiTheme="majorHAnsi" w:cstheme="majorBidi"/>
+      <w:rFonts w:ascii="Arial" w:hAnsi="Arial" w:cs="Arial" w:eastAsia="Arial"/>
       <w:b/>
       <w:bCs/>
       <w:color w:val="365F91" w:themeColor="accent1" w:themeShade="BF"/>
@@ -12971,7 +12971,7 @@
     <w:uiPriority w:val="9"/>
     <w:rsid w:val="00FC693F"/>
     <w:rPr>
-      <w:rFonts w:asciiTheme="majorHAnsi" w:eastAsiaTheme="majorEastAsia" w:hAnsiTheme="majorHAnsi" w:cstheme="majorBidi"/>
+      <w:rFonts w:ascii="Arial" w:hAnsi="Arial" w:cs="Arial" w:eastAsia="Arial"/>
       <w:b/>
       <w:bCs/>
       <w:color w:val="4F81BD" w:themeColor="accent1"/>
@@ -12986,7 +12986,7 @@
     <w:uiPriority w:val="9"/>
     <w:rsid w:val="00FC693F"/>
     <w:rPr>
-      <w:rFonts w:asciiTheme="majorHAnsi" w:eastAsiaTheme="majorEastAsia" w:hAnsiTheme="majorHAnsi" w:cstheme="majorBidi"/>
+      <w:rFonts w:ascii="Arial" w:hAnsi="Arial" w:cs="Arial" w:eastAsia="Arial"/>
       <w:b/>
       <w:bCs/>
       <w:color w:val="4F81BD" w:themeColor="accent1"/>
@@ -13008,7 +13008,7 @@
       <w:contextualSpacing/>
     </w:pPr>
     <w:rPr>
-      <w:rFonts w:asciiTheme="majorHAnsi" w:eastAsiaTheme="majorEastAsia" w:hAnsiTheme="majorHAnsi" w:cstheme="majorBidi"/>
+      <w:rFonts w:ascii="Arial" w:hAnsi="Arial" w:cs="Arial" w:eastAsia="Arial"/>
       <w:color w:val="17365D" w:themeColor="text2" w:themeShade="BF"/>
       <w:spacing w:val="5"/>
       <w:kern w:val="28"/>
@@ -13023,7 +13023,7 @@
     <w:uiPriority w:val="10"/>
     <w:rsid w:val="00FC693F"/>
     <w:rPr>
-      <w:rFonts w:asciiTheme="majorHAnsi" w:eastAsiaTheme="majorEastAsia" w:hAnsiTheme="majorHAnsi" w:cstheme="majorBidi"/>
+      <w:rFonts w:ascii="Arial" w:hAnsi="Arial" w:cs="Arial" w:eastAsia="Arial"/>
       <w:color w:val="17365D" w:themeColor="text2" w:themeShade="BF"/>
       <w:spacing w:val="5"/>
       <w:kern w:val="28"/>
@@ -13045,7 +13045,7 @@
       </w:numPr>
     </w:pPr>
     <w:rPr>
-      <w:rFonts w:asciiTheme="majorHAnsi" w:eastAsiaTheme="majorEastAsia" w:hAnsiTheme="majorHAnsi" w:cstheme="majorBidi"/>
+      <w:rFonts w:ascii="Arial" w:hAnsi="Arial" w:cs="Arial" w:eastAsia="Arial"/>
       <w:i/>
       <w:iCs/>
       <w:color w:val="4F81BD" w:themeColor="accent1"/>
@@ -13061,7 +13061,7 @@
     <w:uiPriority w:val="11"/>
     <w:rsid w:val="00FC693F"/>
     <w:rPr>
-      <w:rFonts w:asciiTheme="majorHAnsi" w:eastAsiaTheme="majorEastAsia" w:hAnsiTheme="majorHAnsi" w:cstheme="majorBidi"/>
+      <w:rFonts w:ascii="Arial" w:hAnsi="Arial" w:cs="Arial" w:eastAsia="Arial"/>
       <w:i/>
       <w:iCs/>
       <w:color w:val="4F81BD" w:themeColor="accent1"/>
@@ -13308,7 +13308,7 @@
       </w:tabs>
     </w:pPr>
     <w:rPr>
-      <w:rFonts w:ascii="Courier" w:hAnsi="Courier"/>
+      <w:rFonts w:ascii="Arial" w:hAnsi="Arial" w:cs="Arial" w:eastAsia="Arial"/>
       <w:sz w:val="20"/>
       <w:szCs w:val="20"/>
     </w:rPr>
@@ -13320,7 +13320,7 @@
     <w:uiPriority w:val="99"/>
     <w:rsid w:val="0029639D"/>
     <w:rPr>
-      <w:rFonts w:ascii="Courier" w:hAnsi="Courier"/>
+      <w:rFonts w:ascii="Arial" w:hAnsi="Arial" w:cs="Arial" w:eastAsia="Arial"/>
       <w:sz w:val="20"/>
       <w:szCs w:val="20"/>
     </w:rPr>
@@ -13359,7 +13359,7 @@
     <w:semiHidden/>
     <w:rsid w:val="00FC693F"/>
     <w:rPr>
-      <w:rFonts w:asciiTheme="majorHAnsi" w:eastAsiaTheme="majorEastAsia" w:hAnsiTheme="majorHAnsi" w:cstheme="majorBidi"/>
+      <w:rFonts w:ascii="Arial" w:hAnsi="Arial" w:cs="Arial" w:eastAsia="Arial"/>
       <w:b/>
       <w:bCs/>
       <w:i/>
@@ -13375,7 +13375,7 @@
     <w:semiHidden/>
     <w:rsid w:val="00FC693F"/>
     <w:rPr>
-      <w:rFonts w:asciiTheme="majorHAnsi" w:eastAsiaTheme="majorEastAsia" w:hAnsiTheme="majorHAnsi" w:cstheme="majorBidi"/>
+      <w:rFonts w:ascii="Arial" w:hAnsi="Arial" w:cs="Arial" w:eastAsia="Arial"/>
       <w:color w:val="243F60" w:themeColor="accent1" w:themeShade="7F"/>
     </w:rPr>
   </w:style>
@@ -13387,7 +13387,7 @@
     <w:semiHidden/>
     <w:rsid w:val="00FC693F"/>
     <w:rPr>
-      <w:rFonts w:asciiTheme="majorHAnsi" w:eastAsiaTheme="majorEastAsia" w:hAnsiTheme="majorHAnsi" w:cstheme="majorBidi"/>
+      <w:rFonts w:ascii="Arial" w:hAnsi="Arial" w:cs="Arial" w:eastAsia="Arial"/>
       <w:i/>
       <w:iCs/>
       <w:color w:val="243F60" w:themeColor="accent1" w:themeShade="7F"/>
@@ -13401,7 +13401,7 @@
     <w:semiHidden/>
     <w:rsid w:val="00FC693F"/>
     <w:rPr>
-      <w:rFonts w:asciiTheme="majorHAnsi" w:eastAsiaTheme="majorEastAsia" w:hAnsiTheme="majorHAnsi" w:cstheme="majorBidi"/>
+      <w:rFonts w:ascii="Arial" w:hAnsi="Arial" w:cs="Arial" w:eastAsia="Arial"/>
       <w:i/>
       <w:iCs/>
       <w:color w:val="404040" w:themeColor="text1" w:themeTint="BF"/>
@@ -13415,7 +13415,7 @@
     <w:semiHidden/>
     <w:rsid w:val="00FC693F"/>
     <w:rPr>
-      <w:rFonts w:asciiTheme="majorHAnsi" w:eastAsiaTheme="majorEastAsia" w:hAnsiTheme="majorHAnsi" w:cstheme="majorBidi"/>
+      <w:rFonts w:ascii="Arial" w:hAnsi="Arial" w:cs="Arial" w:eastAsia="Arial"/>
       <w:color w:val="4F81BD" w:themeColor="accent1"/>
       <w:sz w:val="20"/>
       <w:szCs w:val="20"/>
@@ -13429,7 +13429,7 @@
     <w:semiHidden/>
     <w:rsid w:val="00FC693F"/>
     <w:rPr>
-      <w:rFonts w:asciiTheme="majorHAnsi" w:eastAsiaTheme="majorEastAsia" w:hAnsiTheme="majorHAnsi" w:cstheme="majorBidi"/>
+      <w:rFonts w:ascii="Arial" w:hAnsi="Arial" w:cs="Arial" w:eastAsia="Arial"/>
       <w:i/>
       <w:iCs/>
       <w:color w:val="404040" w:themeColor="text1" w:themeTint="BF"/>
@@ -15018,7 +15018,7 @@
         <w:spacing w:before="0" w:after="0" w:line="240" w:lineRule="auto"/>
       </w:pPr>
       <w:rPr>
-        <w:rFonts w:asciiTheme="majorHAnsi" w:eastAsiaTheme="majorEastAsia" w:hAnsiTheme="majorHAnsi" w:cstheme="majorBidi"/>
+        <w:rFonts w:ascii="Arial" w:hAnsi="Arial" w:cs="Arial" w:eastAsia="Arial"/>
         <w:b/>
         <w:bCs/>
       </w:rPr>
@@ -15039,7 +15039,7 @@
         <w:spacing w:before="0" w:after="0" w:line="240" w:lineRule="auto"/>
       </w:pPr>
       <w:rPr>
-        <w:rFonts w:asciiTheme="majorHAnsi" w:eastAsiaTheme="majorEastAsia" w:hAnsiTheme="majorHAnsi" w:cstheme="majorBidi"/>
+        <w:rFonts w:ascii="Arial" w:hAnsi="Arial" w:cs="Arial" w:eastAsia="Arial"/>
         <w:b/>
         <w:bCs/>
       </w:rPr>
@@ -15057,14 +15057,14 @@
     </w:tblStylePr>
     <w:tblStylePr w:type="firstCol">
       <w:rPr>
-        <w:rFonts w:asciiTheme="majorHAnsi" w:eastAsiaTheme="majorEastAsia" w:hAnsiTheme="majorHAnsi" w:cstheme="majorBidi"/>
+        <w:rFonts w:ascii="Arial" w:hAnsi="Arial" w:cs="Arial" w:eastAsia="Arial"/>
         <w:b/>
         <w:bCs/>
       </w:rPr>
     </w:tblStylePr>
     <w:tblStylePr w:type="lastCol">
       <w:rPr>
-        <w:rFonts w:asciiTheme="majorHAnsi" w:eastAsiaTheme="majorEastAsia" w:hAnsiTheme="majorHAnsi" w:cstheme="majorBidi"/>
+        <w:rFonts w:ascii="Arial" w:hAnsi="Arial" w:cs="Arial" w:eastAsia="Arial"/>
         <w:b/>
         <w:bCs/>
       </w:rPr>
@@ -15148,7 +15148,7 @@
         <w:spacing w:before="0" w:after="0" w:line="240" w:lineRule="auto"/>
       </w:pPr>
       <w:rPr>
-        <w:rFonts w:asciiTheme="majorHAnsi" w:eastAsiaTheme="majorEastAsia" w:hAnsiTheme="majorHAnsi" w:cstheme="majorBidi"/>
+        <w:rFonts w:ascii="Arial" w:hAnsi="Arial" w:cs="Arial" w:eastAsia="Arial"/>
         <w:b/>
         <w:bCs/>
       </w:rPr>
@@ -15169,7 +15169,7 @@
         <w:spacing w:before="0" w:after="0" w:line="240" w:lineRule="auto"/>
       </w:pPr>
       <w:rPr>
-        <w:rFonts w:asciiTheme="majorHAnsi" w:eastAsiaTheme="majorEastAsia" w:hAnsiTheme="majorHAnsi" w:cstheme="majorBidi"/>
+        <w:rFonts w:ascii="Arial" w:hAnsi="Arial" w:cs="Arial" w:eastAsia="Arial"/>
         <w:b/>
         <w:bCs/>
       </w:rPr>
@@ -15187,14 +15187,14 @@
     </w:tblStylePr>
     <w:tblStylePr w:type="firstCol">
       <w:rPr>
-        <w:rFonts w:asciiTheme="majorHAnsi" w:eastAsiaTheme="majorEastAsia" w:hAnsiTheme="majorHAnsi" w:cstheme="majorBidi"/>
+        <w:rFonts w:ascii="Arial" w:hAnsi="Arial" w:cs="Arial" w:eastAsia="Arial"/>
         <w:b/>
         <w:bCs/>
       </w:rPr>
     </w:tblStylePr>
     <w:tblStylePr w:type="lastCol">
       <w:rPr>
-        <w:rFonts w:asciiTheme="majorHAnsi" w:eastAsiaTheme="majorEastAsia" w:hAnsiTheme="majorHAnsi" w:cstheme="majorBidi"/>
+        <w:rFonts w:ascii="Arial" w:hAnsi="Arial" w:cs="Arial" w:eastAsia="Arial"/>
         <w:b/>
         <w:bCs/>
       </w:rPr>
@@ -15278,7 +15278,7 @@
         <w:spacing w:before="0" w:after="0" w:line="240" w:lineRule="auto"/>
       </w:pPr>
       <w:rPr>
-        <w:rFonts w:asciiTheme="majorHAnsi" w:eastAsiaTheme="majorEastAsia" w:hAnsiTheme="majorHAnsi" w:cstheme="majorBidi"/>
+        <w:rFonts w:ascii="Arial" w:hAnsi="Arial" w:cs="Arial" w:eastAsia="Arial"/>
         <w:b/>
         <w:bCs/>
       </w:rPr>
@@ -15299,7 +15299,7 @@
         <w:spacing w:before="0" w:after="0" w:line="240" w:lineRule="auto"/>
       </w:pPr>
       <w:rPr>
-        <w:rFonts w:asciiTheme="majorHAnsi" w:eastAsiaTheme="majorEastAsia" w:hAnsiTheme="majorHAnsi" w:cstheme="majorBidi"/>
+        <w:rFonts w:ascii="Arial" w:hAnsi="Arial" w:cs="Arial" w:eastAsia="Arial"/>
         <w:b/>
         <w:bCs/>
       </w:rPr>
@@ -15317,14 +15317,14 @@
     </w:tblStylePr>
     <w:tblStylePr w:type="firstCol">
       <w:rPr>
-        <w:rFonts w:asciiTheme="majorHAnsi" w:eastAsiaTheme="majorEastAsia" w:hAnsiTheme="majorHAnsi" w:cstheme="majorBidi"/>
+        <w:rFonts w:ascii="Arial" w:hAnsi="Arial" w:cs="Arial" w:eastAsia="Arial"/>
         <w:b/>
         <w:bCs/>
       </w:rPr>
     </w:tblStylePr>
     <w:tblStylePr w:type="lastCol">
       <w:rPr>
-        <w:rFonts w:asciiTheme="majorHAnsi" w:eastAsiaTheme="majorEastAsia" w:hAnsiTheme="majorHAnsi" w:cstheme="majorBidi"/>
+        <w:rFonts w:ascii="Arial" w:hAnsi="Arial" w:cs="Arial" w:eastAsia="Arial"/>
         <w:b/>
         <w:bCs/>
       </w:rPr>
@@ -15408,7 +15408,7 @@
         <w:spacing w:before="0" w:after="0" w:line="240" w:lineRule="auto"/>
       </w:pPr>
       <w:rPr>
-        <w:rFonts w:asciiTheme="majorHAnsi" w:eastAsiaTheme="majorEastAsia" w:hAnsiTheme="majorHAnsi" w:cstheme="majorBidi"/>
+        <w:rFonts w:ascii="Arial" w:hAnsi="Arial" w:cs="Arial" w:eastAsia="Arial"/>
         <w:b/>
         <w:bCs/>
       </w:rPr>
@@ -15429,7 +15429,7 @@
         <w:spacing w:before="0" w:after="0" w:line="240" w:lineRule="auto"/>
       </w:pPr>
       <w:rPr>
-        <w:rFonts w:asciiTheme="majorHAnsi" w:eastAsiaTheme="majorEastAsia" w:hAnsiTheme="majorHAnsi" w:cstheme="majorBidi"/>
+        <w:rFonts w:ascii="Arial" w:hAnsi="Arial" w:cs="Arial" w:eastAsia="Arial"/>
         <w:b/>
         <w:bCs/>
       </w:rPr>
@@ -15447,14 +15447,14 @@
     </w:tblStylePr>
     <w:tblStylePr w:type="firstCol">
       <w:rPr>
-        <w:rFonts w:asciiTheme="majorHAnsi" w:eastAsiaTheme="majorEastAsia" w:hAnsiTheme="majorHAnsi" w:cstheme="majorBidi"/>
+        <w:rFonts w:ascii="Arial" w:hAnsi="Arial" w:cs="Arial" w:eastAsia="Arial"/>
         <w:b/>
         <w:bCs/>
       </w:rPr>
     </w:tblStylePr>
     <w:tblStylePr w:type="lastCol">
       <w:rPr>
-        <w:rFonts w:asciiTheme="majorHAnsi" w:eastAsiaTheme="majorEastAsia" w:hAnsiTheme="majorHAnsi" w:cstheme="majorBidi"/>
+        <w:rFonts w:ascii="Arial" w:hAnsi="Arial" w:cs="Arial" w:eastAsia="Arial"/>
         <w:b/>
         <w:bCs/>
       </w:rPr>
@@ -15538,7 +15538,7 @@
         <w:spacing w:before="0" w:after="0" w:line="240" w:lineRule="auto"/>
       </w:pPr>
       <w:rPr>
-        <w:rFonts w:asciiTheme="majorHAnsi" w:eastAsiaTheme="majorEastAsia" w:hAnsiTheme="majorHAnsi" w:cstheme="majorBidi"/>
+        <w:rFonts w:ascii="Arial" w:hAnsi="Arial" w:cs="Arial" w:eastAsia="Arial"/>
         <w:b/>
         <w:bCs/>
       </w:rPr>
@@ -15559,7 +15559,7 @@
         <w:spacing w:before="0" w:after="0" w:line="240" w:lineRule="auto"/>
       </w:pPr>
       <w:rPr>
-        <w:rFonts w:asciiTheme="majorHAnsi" w:eastAsiaTheme="majorEastAsia" w:hAnsiTheme="majorHAnsi" w:cstheme="majorBidi"/>
+        <w:rFonts w:ascii="Arial" w:hAnsi="Arial" w:cs="Arial" w:eastAsia="Arial"/>
         <w:b/>
         <w:bCs/>
       </w:rPr>
@@ -15577,14 +15577,14 @@
     </w:tblStylePr>
     <w:tblStylePr w:type="firstCol">
       <w:rPr>
-        <w:rFonts w:asciiTheme="majorHAnsi" w:eastAsiaTheme="majorEastAsia" w:hAnsiTheme="majorHAnsi" w:cstheme="majorBidi"/>
+        <w:rFonts w:ascii="Arial" w:hAnsi="Arial" w:cs="Arial" w:eastAsia="Arial"/>
         <w:b/>
         <w:bCs/>
       </w:rPr>
     </w:tblStylePr>
     <w:tblStylePr w:type="lastCol">
       <w:rPr>
-        <w:rFonts w:asciiTheme="majorHAnsi" w:eastAsiaTheme="majorEastAsia" w:hAnsiTheme="majorHAnsi" w:cstheme="majorBidi"/>
+        <w:rFonts w:ascii="Arial" w:hAnsi="Arial" w:cs="Arial" w:eastAsia="Arial"/>
         <w:b/>
         <w:bCs/>
       </w:rPr>
@@ -15668,7 +15668,7 @@
         <w:spacing w:before="0" w:after="0" w:line="240" w:lineRule="auto"/>
       </w:pPr>
       <w:rPr>
-        <w:rFonts w:asciiTheme="majorHAnsi" w:eastAsiaTheme="majorEastAsia" w:hAnsiTheme="majorHAnsi" w:cstheme="majorBidi"/>
+        <w:rFonts w:ascii="Arial" w:hAnsi="Arial" w:cs="Arial" w:eastAsia="Arial"/>
         <w:b/>
         <w:bCs/>
       </w:rPr>
@@ -15689,7 +15689,7 @@
         <w:spacing w:before="0" w:after="0" w:line="240" w:lineRule="auto"/>
       </w:pPr>
       <w:rPr>
-        <w:rFonts w:asciiTheme="majorHAnsi" w:eastAsiaTheme="majorEastAsia" w:hAnsiTheme="majorHAnsi" w:cstheme="majorBidi"/>
+        <w:rFonts w:ascii="Arial" w:hAnsi="Arial" w:cs="Arial" w:eastAsia="Arial"/>
         <w:b/>
         <w:bCs/>
       </w:rPr>
@@ -15707,14 +15707,14 @@
     </w:tblStylePr>
     <w:tblStylePr w:type="firstCol">
       <w:rPr>
-        <w:rFonts w:asciiTheme="majorHAnsi" w:eastAsiaTheme="majorEastAsia" w:hAnsiTheme="majorHAnsi" w:cstheme="majorBidi"/>
+        <w:rFonts w:ascii="Arial" w:hAnsi="Arial" w:cs="Arial" w:eastAsia="Arial"/>
         <w:b/>
         <w:bCs/>
       </w:rPr>
     </w:tblStylePr>
     <w:tblStylePr w:type="lastCol">
       <w:rPr>
-        <w:rFonts w:asciiTheme="majorHAnsi" w:eastAsiaTheme="majorEastAsia" w:hAnsiTheme="majorHAnsi" w:cstheme="majorBidi"/>
+        <w:rFonts w:ascii="Arial" w:hAnsi="Arial" w:cs="Arial" w:eastAsia="Arial"/>
         <w:b/>
         <w:bCs/>
       </w:rPr>
@@ -15798,7 +15798,7 @@
         <w:spacing w:before="0" w:after="0" w:line="240" w:lineRule="auto"/>
       </w:pPr>
       <w:rPr>
-        <w:rFonts w:asciiTheme="majorHAnsi" w:eastAsiaTheme="majorEastAsia" w:hAnsiTheme="majorHAnsi" w:cstheme="majorBidi"/>
+        <w:rFonts w:ascii="Arial" w:hAnsi="Arial" w:cs="Arial" w:eastAsia="Arial"/>
         <w:b/>
         <w:bCs/>
       </w:rPr>
@@ -15819,7 +15819,7 @@
         <w:spacing w:before="0" w:after="0" w:line="240" w:lineRule="auto"/>
       </w:pPr>
       <w:rPr>
-        <w:rFonts w:asciiTheme="majorHAnsi" w:eastAsiaTheme="majorEastAsia" w:hAnsiTheme="majorHAnsi" w:cstheme="majorBidi"/>
+        <w:rFonts w:ascii="Arial" w:hAnsi="Arial" w:cs="Arial" w:eastAsia="Arial"/>
         <w:b/>
         <w:bCs/>
       </w:rPr>
@@ -15837,14 +15837,14 @@
     </w:tblStylePr>
     <w:tblStylePr w:type="firstCol">
       <w:rPr>
-        <w:rFonts w:asciiTheme="majorHAnsi" w:eastAsiaTheme="majorEastAsia" w:hAnsiTheme="majorHAnsi" w:cstheme="majorBidi"/>
+        <w:rFonts w:ascii="Arial" w:hAnsi="Arial" w:cs="Arial" w:eastAsia="Arial"/>
         <w:b/>
         <w:bCs/>
       </w:rPr>
     </w:tblStylePr>
     <w:tblStylePr w:type="lastCol">
       <w:rPr>
-        <w:rFonts w:asciiTheme="majorHAnsi" w:eastAsiaTheme="majorEastAsia" w:hAnsiTheme="majorHAnsi" w:cstheme="majorBidi"/>
+        <w:rFonts w:ascii="Arial" w:hAnsi="Arial" w:cs="Arial" w:eastAsia="Arial"/>
         <w:b/>
         <w:bCs/>
       </w:rPr>
@@ -17709,7 +17709,7 @@
     </w:tblPr>
     <w:tblStylePr w:type="firstRow">
       <w:rPr>
-        <w:rFonts w:asciiTheme="majorHAnsi" w:eastAsiaTheme="majorEastAsia" w:hAnsiTheme="majorHAnsi" w:cstheme="majorBidi"/>
+        <w:rFonts w:ascii="Arial" w:hAnsi="Arial" w:cs="Arial" w:eastAsia="Arial"/>
       </w:rPr>
       <w:tblPr/>
       <w:tcPr>
@@ -17793,7 +17793,7 @@
     </w:tblPr>
     <w:tblStylePr w:type="firstRow">
       <w:rPr>
-        <w:rFonts w:asciiTheme="majorHAnsi" w:eastAsiaTheme="majorEastAsia" w:hAnsiTheme="majorHAnsi" w:cstheme="majorBidi"/>
+        <w:rFonts w:ascii="Arial" w:hAnsi="Arial" w:cs="Arial" w:eastAsia="Arial"/>
       </w:rPr>
       <w:tblPr/>
       <w:tcPr>
@@ -17877,7 +17877,7 @@
     </w:tblPr>
     <w:tblStylePr w:type="firstRow">
       <w:rPr>
-        <w:rFonts w:asciiTheme="majorHAnsi" w:eastAsiaTheme="majorEastAsia" w:hAnsiTheme="majorHAnsi" w:cstheme="majorBidi"/>
+        <w:rFonts w:ascii="Arial" w:hAnsi="Arial" w:cs="Arial" w:eastAsia="Arial"/>
       </w:rPr>
       <w:tblPr/>
       <w:tcPr>
@@ -17961,7 +17961,7 @@
     </w:tblPr>
     <w:tblStylePr w:type="firstRow">
       <w:rPr>
-        <w:rFonts w:asciiTheme="majorHAnsi" w:eastAsiaTheme="majorEastAsia" w:hAnsiTheme="majorHAnsi" w:cstheme="majorBidi"/>
+        <w:rFonts w:ascii="Arial" w:hAnsi="Arial" w:cs="Arial" w:eastAsia="Arial"/>
       </w:rPr>
       <w:tblPr/>
       <w:tcPr>
@@ -18045,7 +18045,7 @@
     </w:tblPr>
     <w:tblStylePr w:type="firstRow">
       <w:rPr>
-        <w:rFonts w:asciiTheme="majorHAnsi" w:eastAsiaTheme="majorEastAsia" w:hAnsiTheme="majorHAnsi" w:cstheme="majorBidi"/>
+        <w:rFonts w:ascii="Arial" w:hAnsi="Arial" w:cs="Arial" w:eastAsia="Arial"/>
       </w:rPr>
       <w:tblPr/>
       <w:tcPr>
@@ -18129,7 +18129,7 @@
     </w:tblPr>
     <w:tblStylePr w:type="firstRow">
       <w:rPr>
-        <w:rFonts w:asciiTheme="majorHAnsi" w:eastAsiaTheme="majorEastAsia" w:hAnsiTheme="majorHAnsi" w:cstheme="majorBidi"/>
+        <w:rFonts w:ascii="Arial" w:hAnsi="Arial" w:cs="Arial" w:eastAsia="Arial"/>
       </w:rPr>
       <w:tblPr/>
       <w:tcPr>
@@ -18213,7 +18213,7 @@
     </w:tblPr>
     <w:tblStylePr w:type="firstRow">
       <w:rPr>
-        <w:rFonts w:asciiTheme="majorHAnsi" w:eastAsiaTheme="majorEastAsia" w:hAnsiTheme="majorHAnsi" w:cstheme="majorBidi"/>
+        <w:rFonts w:ascii="Arial" w:hAnsi="Arial" w:cs="Arial" w:eastAsia="Arial"/>
       </w:rPr>
       <w:tblPr/>
       <w:tcPr>
@@ -18278,7 +18278,7 @@
       <w:spacing w:after="0" w:line="240" w:lineRule="auto"/>
     </w:pPr>
     <w:rPr>
-      <w:rFonts w:asciiTheme="majorHAnsi" w:eastAsiaTheme="majorEastAsia" w:hAnsiTheme="majorHAnsi" w:cstheme="majorBidi"/>
+      <w:rFonts w:ascii="Arial" w:hAnsi="Arial" w:cs="Arial" w:eastAsia="Arial"/>
       <w:color w:val="000000" w:themeColor="text1"/>
     </w:rPr>
     <w:tblPr>
@@ -18406,7 +18406,7 @@
       <w:spacing w:after="0" w:line="240" w:lineRule="auto"/>
     </w:pPr>
     <w:rPr>
-      <w:rFonts w:asciiTheme="majorHAnsi" w:eastAsiaTheme="majorEastAsia" w:hAnsiTheme="majorHAnsi" w:cstheme="majorBidi"/>
+      <w:rFonts w:ascii="Arial" w:hAnsi="Arial" w:cs="Arial" w:eastAsia="Arial"/>
       <w:color w:val="000000" w:themeColor="text1"/>
     </w:rPr>
     <w:tblPr>
@@ -18534,7 +18534,7 @@
       <w:spacing w:after="0" w:line="240" w:lineRule="auto"/>
     </w:pPr>
     <w:rPr>
-      <w:rFonts w:asciiTheme="majorHAnsi" w:eastAsiaTheme="majorEastAsia" w:hAnsiTheme="majorHAnsi" w:cstheme="majorBidi"/>
+      <w:rFonts w:ascii="Arial" w:hAnsi="Arial" w:cs="Arial" w:eastAsia="Arial"/>
       <w:color w:val="000000" w:themeColor="text1"/>
     </w:rPr>
     <w:tblPr>
@@ -18662,7 +18662,7 @@
       <w:spacing w:after="0" w:line="240" w:lineRule="auto"/>
     </w:pPr>
     <w:rPr>
-      <w:rFonts w:asciiTheme="majorHAnsi" w:eastAsiaTheme="majorEastAsia" w:hAnsiTheme="majorHAnsi" w:cstheme="majorBidi"/>
+      <w:rFonts w:ascii="Arial" w:hAnsi="Arial" w:cs="Arial" w:eastAsia="Arial"/>
       <w:color w:val="000000" w:themeColor="text1"/>
     </w:rPr>
     <w:tblPr>
@@ -18790,7 +18790,7 @@
       <w:spacing w:after="0" w:line="240" w:lineRule="auto"/>
     </w:pPr>
     <w:rPr>
-      <w:rFonts w:asciiTheme="majorHAnsi" w:eastAsiaTheme="majorEastAsia" w:hAnsiTheme="majorHAnsi" w:cstheme="majorBidi"/>
+      <w:rFonts w:ascii="Arial" w:hAnsi="Arial" w:cs="Arial" w:eastAsia="Arial"/>
       <w:color w:val="000000" w:themeColor="text1"/>
     </w:rPr>
     <w:tblPr>
@@ -18918,7 +18918,7 @@
       <w:spacing w:after="0" w:line="240" w:lineRule="auto"/>
     </w:pPr>
     <w:rPr>
-      <w:rFonts w:asciiTheme="majorHAnsi" w:eastAsiaTheme="majorEastAsia" w:hAnsiTheme="majorHAnsi" w:cstheme="majorBidi"/>
+      <w:rFonts w:ascii="Arial" w:hAnsi="Arial" w:cs="Arial" w:eastAsia="Arial"/>
       <w:color w:val="000000" w:themeColor="text1"/>
     </w:rPr>
     <w:tblPr>
@@ -19046,7 +19046,7 @@
       <w:spacing w:after="0" w:line="240" w:lineRule="auto"/>
     </w:pPr>
     <w:rPr>
-      <w:rFonts w:asciiTheme="majorHAnsi" w:eastAsiaTheme="majorEastAsia" w:hAnsiTheme="majorHAnsi" w:cstheme="majorBidi"/>
+      <w:rFonts w:ascii="Arial" w:hAnsi="Arial" w:cs="Arial" w:eastAsia="Arial"/>
       <w:color w:val="000000" w:themeColor="text1"/>
     </w:rPr>
     <w:tblPr>
@@ -19685,7 +19685,7 @@
       <w:spacing w:after="0" w:line="240" w:lineRule="auto"/>
     </w:pPr>
     <w:rPr>
-      <w:rFonts w:asciiTheme="majorHAnsi" w:eastAsiaTheme="majorEastAsia" w:hAnsiTheme="majorHAnsi" w:cstheme="majorBidi"/>
+      <w:rFonts w:ascii="Arial" w:hAnsi="Arial" w:cs="Arial" w:eastAsia="Arial"/>
       <w:color w:val="000000" w:themeColor="text1"/>
     </w:rPr>
     <w:tblPr>
@@ -19810,7 +19810,7 @@
       <w:spacing w:after="0" w:line="240" w:lineRule="auto"/>
     </w:pPr>
     <w:rPr>
-      <w:rFonts w:asciiTheme="majorHAnsi" w:eastAsiaTheme="majorEastAsia" w:hAnsiTheme="majorHAnsi" w:cstheme="majorBidi"/>
+      <w:rFonts w:ascii="Arial" w:hAnsi="Arial" w:cs="Arial" w:eastAsia="Arial"/>
       <w:color w:val="000000" w:themeColor="text1"/>
     </w:rPr>
     <w:tblPr>
@@ -19935,7 +19935,7 @@
       <w:spacing w:after="0" w:line="240" w:lineRule="auto"/>
     </w:pPr>
     <w:rPr>
-      <w:rFonts w:asciiTheme="majorHAnsi" w:eastAsiaTheme="majorEastAsia" w:hAnsiTheme="majorHAnsi" w:cstheme="majorBidi"/>
+      <w:rFonts w:ascii="Arial" w:hAnsi="Arial" w:cs="Arial" w:eastAsia="Arial"/>
       <w:color w:val="000000" w:themeColor="text1"/>
     </w:rPr>
     <w:tblPr>
@@ -20060,7 +20060,7 @@
       <w:spacing w:after="0" w:line="240" w:lineRule="auto"/>
     </w:pPr>
     <w:rPr>
-      <w:rFonts w:asciiTheme="majorHAnsi" w:eastAsiaTheme="majorEastAsia" w:hAnsiTheme="majorHAnsi" w:cstheme="majorBidi"/>
+      <w:rFonts w:ascii="Arial" w:hAnsi="Arial" w:cs="Arial" w:eastAsia="Arial"/>
       <w:color w:val="000000" w:themeColor="text1"/>
     </w:rPr>
     <w:tblPr>
@@ -20185,7 +20185,7 @@
       <w:spacing w:after="0" w:line="240" w:lineRule="auto"/>
     </w:pPr>
     <w:rPr>
-      <w:rFonts w:asciiTheme="majorHAnsi" w:eastAsiaTheme="majorEastAsia" w:hAnsiTheme="majorHAnsi" w:cstheme="majorBidi"/>
+      <w:rFonts w:ascii="Arial" w:hAnsi="Arial" w:cs="Arial" w:eastAsia="Arial"/>
       <w:color w:val="000000" w:themeColor="text1"/>
     </w:rPr>
     <w:tblPr>
@@ -20310,7 +20310,7 @@
       <w:spacing w:after="0" w:line="240" w:lineRule="auto"/>
     </w:pPr>
     <w:rPr>
-      <w:rFonts w:asciiTheme="majorHAnsi" w:eastAsiaTheme="majorEastAsia" w:hAnsiTheme="majorHAnsi" w:cstheme="majorBidi"/>
+      <w:rFonts w:ascii="Arial" w:hAnsi="Arial" w:cs="Arial" w:eastAsia="Arial"/>
       <w:color w:val="000000" w:themeColor="text1"/>
     </w:rPr>
     <w:tblPr>
@@ -20435,7 +20435,7 @@
       <w:spacing w:after="0" w:line="240" w:lineRule="auto"/>
     </w:pPr>
     <w:rPr>
-      <w:rFonts w:asciiTheme="majorHAnsi" w:eastAsiaTheme="majorEastAsia" w:hAnsiTheme="majorHAnsi" w:cstheme="majorBidi"/>
+      <w:rFonts w:ascii="Arial" w:hAnsi="Arial" w:cs="Arial" w:eastAsia="Arial"/>
       <w:color w:val="000000" w:themeColor="text1"/>
     </w:rPr>
     <w:tblPr>
@@ -24388,7 +24388,7 @@
     </a:clrScheme>
     <a:fontScheme name="Office">
       <a:majorFont>
-        <a:latin typeface="Calibri"/>
+        <a:latin typeface="Arial"/>
         <a:ea typeface=""/>
         <a:cs typeface=""/>
         <a:font script="Jpan" typeface="ＭＳ ゴシック"/>
@@ -24423,7 +24423,7 @@
         <a:font script="Geor" typeface="Sylfaen"/>
       </a:majorFont>
       <a:minorFont>
-        <a:latin typeface="Cambria"/>
+        <a:latin typeface="Arial"/>
         <a:ea typeface=""/>
         <a:cs typeface=""/>
         <a:font script="Jpan" typeface="ＭＳ 明朝"/>

</xml_diff>

<commit_message>
Rewrite construction and teaching guides with native templates
</commit_message>
<xml_diff>
--- a/assets/lessons/electromagnetic-spectrum/introduction.docx
+++ b/assets/lessons/electromagnetic-spectrum/introduction.docx
@@ -5,7 +5,6 @@
     <w:p>
       <w:pPr>
         <w:pStyle w:val="Title"/>
-        <w:keepNext/>
       </w:pPr>
       <w:r>
         <w:t>Electromagnetic spectrum and space</w:t>
@@ -14,10 +13,14 @@
     <w:p>
       <w:pPr>
         <w:pStyle w:val="Subtitle"/>
-        <w:keepNext/>
       </w:pPr>
       <w:r>
-        <w:t>Teaching guide</w:t>
+        <w:t>Teacher guide</w:t>
+      </w:r>
+    </w:p>
+    <w:p>
+      <w:r>
+        <w:t>Use color and reflection to introduce the electromagnetic spectrum. Connect everyday observations to the signals that radio telescopes detect.</w:t>
       </w:r>
     </w:p>
     <w:p>
@@ -30,26 +33,26 @@
     </w:p>
     <w:p>
       <w:pPr>
-        <w:pStyle w:val="ListBullet2"/>
+        <w:pStyle w:val="ListBullet"/>
       </w:pPr>
       <w:r>
-        <w:t>The student will be able to describe the purpose of using radio telescopes</w:t>
+        <w:t>Explain how reflected and absorbed light affect an object’s appearance.</w:t>
       </w:r>
     </w:p>
     <w:p>
       <w:pPr>
-        <w:pStyle w:val="ListBullet2"/>
+        <w:pStyle w:val="ListBullet"/>
       </w:pPr>
       <w:r>
-        <w:t>the student will be able to define radiation</w:t>
+        <w:t>Describe electromagnetic radiation and the electromagnetic spectrum.</w:t>
       </w:r>
     </w:p>
     <w:p>
       <w:pPr>
-        <w:pStyle w:val="ListBullet2"/>
+        <w:pStyle w:val="ListBullet"/>
       </w:pPr>
       <w:r>
-        <w:t>The student will be able to define the electromagnetic spectrum?</w:t>
+        <w:t>Explain why astronomers use radio telescopes.</w:t>
       </w:r>
     </w:p>
     <w:p>
@@ -62,34 +65,26 @@
     </w:p>
     <w:p>
       <w:pPr>
-        <w:pStyle w:val="ListBullet2"/>
+        <w:pStyle w:val="ListBullet"/>
       </w:pPr>
       <w:r>
-        <w:t>Colors we See activity (spectrum, stickers?)</w:t>
+        <w:t>Visible-spectrum chart and colored stickers</w:t>
       </w:r>
     </w:p>
     <w:p>
       <w:pPr>
-        <w:pStyle w:val="ListBullet2"/>
+        <w:pStyle w:val="ListBullet"/>
       </w:pPr>
       <w:r>
-        <w:t>EM Spectrum Worksheet</w:t>
+        <w:t>Electromagnetic-spectrum worksheet and movable term cards</w:t>
       </w:r>
     </w:p>
     <w:p>
       <w:pPr>
-        <w:pStyle w:val="ListBullet2"/>
+        <w:pStyle w:val="ListBullet"/>
       </w:pPr>
       <w:r>
-        <w:t>Colored Pencils/crayons- Red, Blue, Yellow, Green, Purple</w:t>
-      </w:r>
-    </w:p>
-    <w:p>
-      <w:pPr>
-        <w:pStyle w:val="ListBullet2"/>
-      </w:pPr>
-      <w:r>
-        <w:t>Manipulative Terms</w:t>
+        <w:t>Colored pencils or crayons: red, blue, yellow, green, and purple</w:t>
       </w:r>
     </w:p>
     <w:p>
@@ -97,119 +92,43 @@
         <w:pStyle w:val="Heading1"/>
       </w:pPr>
       <w:r>
-        <w:t>1. "Colors" we see Activity</w:t>
+        <w:t>1 Explore the colors we see</w:t>
       </w:r>
     </w:p>
     <w:p>
       <w:pPr>
-        <w:pStyle w:val="ListBullet"/>
+        <w:pStyle w:val="ListNumber"/>
+        <w:numPr>
+          <w:ilvl w:val="0"/>
+          <w:numId w:val="10"/>
+        </w:numPr>
       </w:pPr>
       <w:r>
-        <w:t>Background</w:t>
+        <w:t>Ask students how light reaches their eyes from a colored object. Discuss reflection and absorption.</w:t>
       </w:r>
     </w:p>
     <w:p>
       <w:pPr>
-        <w:pStyle w:val="ListBullet"/>
+        <w:pStyle w:val="ListNumber"/>
+        <w:numPr>
+          <w:ilvl w:val="0"/>
+          <w:numId w:val="10"/>
+        </w:numPr>
       </w:pPr>
       <w:r>
-        <w:t>How do we "see" colors?</w:t>
+        <w:t>Have students mix red and yellow pigments, then yellow and blue pigments. Compare the resulting colors.</w:t>
       </w:r>
     </w:p>
     <w:p>
       <w:pPr>
-        <w:pStyle w:val="ListBullet2"/>
+        <w:pStyle w:val="ListNumber"/>
+        <w:numPr>
+          <w:ilvl w:val="0"/>
+          <w:numId w:val="10"/>
+        </w:numPr>
       </w:pPr>
       <w:r>
-        <w:t>1. Reflected vs. Absorbed</w:t>
-      </w:r>
-    </w:p>
-    <w:p>
-      <w:pPr>
-        <w:pStyle w:val="ListBullet"/>
-      </w:pPr>
-      <w:r>
-        <w:t>Different Colors have Different properties</w:t>
-      </w:r>
-    </w:p>
-    <w:p>
-      <w:pPr>
-        <w:pStyle w:val="ListBullet2"/>
-      </w:pPr>
-      <w:r>
-        <w:t>1. Mix Red and Yellow= Orange</w:t>
-      </w:r>
-    </w:p>
-    <w:p>
-      <w:pPr>
-        <w:pStyle w:val="ListBullet2"/>
-      </w:pPr>
-      <w:r>
-        <w:t>2. Mix Yellow and Blue = Green</w:t>
-      </w:r>
-    </w:p>
-    <w:p>
-      <w:pPr>
-        <w:pStyle w:val="ListBullet"/>
-      </w:pPr>
-      <w:r>
-        <w:t>Property=wavelength</w:t>
-      </w:r>
-    </w:p>
-    <w:p>
-      <w:pPr>
-        <w:pStyle w:val="ListBullet"/>
-      </w:pPr>
-      <w:r>
-        <w:t>Procedure:</w:t>
-      </w:r>
-    </w:p>
-    <w:p>
-      <w:pPr>
-        <w:pStyle w:val="ListBullet"/>
-      </w:pPr>
-      <w:r>
-        <w:t>Head to head competition</w:t>
-      </w:r>
-    </w:p>
-    <w:p>
-      <w:pPr>
-        <w:pStyle w:val="ListBullet"/>
-      </w:pPr>
-      <w:r>
-        <w:t>Students race to place sticker on portion of spectrum that we "see"</w:t>
-      </w:r>
-    </w:p>
-    <w:p>
-      <w:pPr>
-        <w:pStyle w:val="ListBullet2"/>
-      </w:pPr>
-      <w:r>
-        <w:t>1. Green Absorbed-students place stickers on green area of spectrum</w:t>
-      </w:r>
-    </w:p>
-    <w:p>
-      <w:pPr>
-        <w:pStyle w:val="ListBullet2"/>
-      </w:pPr>
-      <w:r>
-        <w:t>2. Yellow, Blue, Green-Reflected-students would place stickers on red, orange and purple.</w:t>
-      </w:r>
-    </w:p>
-    <w:p>
-      <w:pPr>
-        <w:pStyle w:val="ListBullet2"/>
-      </w:pPr>
-      <w:r>
-        <w:t>3. All colors reflected- white</w:t>
-      </w:r>
-    </w:p>
-    <w:p>
-      <w:pPr>
-        <w:pStyle w:val="ListBullet2"/>
-      </w:pPr>
-      <w:r>
-        <w:t>4. All colors absorbed-black</w:t>
+        <w:t>Explain that mixing pigments differs from mixing colored light. Pigments change which wavelengths a surface reflects or absorbs.</w:t>
       </w:r>
     </w:p>
     <w:p>
@@ -217,7 +136,63 @@
         <w:pStyle w:val="Heading1"/>
       </w:pPr>
       <w:r>
-        <w:t>Transition: small to large scale</w:t>
+        <w:t>2 Match reflection to the spectrum</w:t>
+      </w:r>
+    </w:p>
+    <w:p>
+      <w:r>
+        <w:t>Students work in pairs with a visible-spectrum chart. A timed challenge is optional; ask students to explain each placement.</w:t>
+      </w:r>
+    </w:p>
+    <w:p>
+      <w:pPr>
+        <w:pStyle w:val="ListNumber"/>
+        <w:numPr>
+          <w:ilvl w:val="0"/>
+          <w:numId w:val="11"/>
+        </w:numPr>
+      </w:pPr>
+      <w:r>
+        <w:t>Name the reflected colors in a sample. Students place stickers on those parts of the chart.</w:t>
+      </w:r>
+    </w:p>
+    <w:p>
+      <w:pPr>
+        <w:pStyle w:val="ListNumber"/>
+        <w:numPr>
+          <w:ilvl w:val="0"/>
+          <w:numId w:val="11"/>
+        </w:numPr>
+      </w:pPr>
+      <w:r>
+        <w:t>Name a color that the sample absorbs. Students identify that region and distinguish it from reflected light.</w:t>
+      </w:r>
+    </w:p>
+    <w:p>
+      <w:pPr>
+        <w:pStyle w:val="ListNumber"/>
+        <w:numPr>
+          <w:ilvl w:val="0"/>
+          <w:numId w:val="11"/>
+        </w:numPr>
+      </w:pPr>
+      <w:r>
+        <w:t>Discuss a surface that reflects most visible wavelengths, then one that absorbs most visible wavelengths.</w:t>
+      </w:r>
+    </w:p>
+    <w:p>
+      <w:r>
+        <w:t>Keep the light source the same when comparing samples. The light reaching our eyes depends on both illumination and the surface.</w:t>
+      </w:r>
+    </w:p>
+    <w:p>
+      <w:pPr>
+        <w:pStyle w:val="Heading1"/>
+        <w:pageBreakBefore/>
+      </w:pPr>
+      <w:r>
+        <w:lastRenderedPageBreak/>
+        <w:t>Connect light to astronomy</w:t>
       </w:r>
     </w:p>
     <w:p>
@@ -225,92 +200,34 @@
         <w:pStyle w:val="Heading1"/>
       </w:pPr>
       <w:r>
-        <w:t>2. Studying Space</w:t>
+        <w:t>3 Discuss how we study space</w:t>
+      </w:r>
+    </w:p>
+    <w:p>
+      <w:r>
+        <w:t>Ask what students already know about telescopes. Explain that visible-light telescopes collect light our eyes can detect.</w:t>
+      </w:r>
+    </w:p>
+    <w:p>
+      <w:r>
+        <w:t>Radio telescopes collect another part of the electromagnetic spectrum. Different wavelength ranges reveal different properties of astronomical objects.</w:t>
       </w:r>
     </w:p>
     <w:p>
       <w:pPr>
-        <w:pStyle w:val="ListBullet"/>
+        <w:keepNext/>
+        <w:spacing w:before="80" w:after="60"/>
+        <w:jc w:val="center"/>
       </w:pPr>
-      <w:r>
-        <w:t>Space Studied?</w:t>
-      </w:r>
-    </w:p>
-    <w:p>
-      <w:pPr>
-        <w:pStyle w:val="ListBullet"/>
-      </w:pPr>
-      <w:r>
-        <w:t>Telescopes</w:t>
-      </w:r>
-    </w:p>
-    <w:p>
-      <w:pPr>
-        <w:pStyle w:val="ListBullet"/>
-      </w:pPr>
-      <w:r>
-        <w:t>Special Telescope- Radio Telescope</w:t>
-      </w:r>
-    </w:p>
-    <w:p>
-      <w:pPr>
-        <w:pStyle w:val="Heading1"/>
-      </w:pPr>
-      <w:r>
-        <w:lastRenderedPageBreak/>
-        <w:t>3. What is being "viewed/studied" for space?</w:t>
-      </w:r>
-    </w:p>
-    <w:p>
-      <w:pPr>
-        <w:pStyle w:val="ListBullet"/>
-      </w:pPr>
-      <w:r>
-        <w:t>Sun</w:t>
-      </w:r>
-    </w:p>
-    <w:p>
-      <w:pPr>
-        <w:pStyle w:val="ListBullet"/>
-      </w:pPr>
-      <w:r>
-        <w:t>Heat</w:t>
-      </w:r>
-    </w:p>
-    <w:p>
-      <w:pPr>
-        <w:pStyle w:val="ListBullet2"/>
-      </w:pPr>
-      <w:r>
-        <w:t>1. Heat=tells us Energy is present</w:t>
-      </w:r>
-    </w:p>
-    <w:p>
-      <w:pPr>
-        <w:pStyle w:val="ListBullet"/>
-      </w:pPr>
-      <w:r>
-        <w:t>Energy-Radiation</w:t>
-      </w:r>
-    </w:p>
-    <w:p>
-      <w:pPr>
-        <w:pStyle w:val="ListBullet"/>
-      </w:pPr>
-      <w:r>
-        <w:t>Cartoon Drawing of Sun</w:t>
-      </w:r>
-    </w:p>
-    <w:p>
       <w:r>
         <w:rPr>
           <w:noProof/>
         </w:rPr>
         <w:drawing>
-          <wp:inline distT="0" distB="0" distL="0" distR="0" wp14:anchorId="71672E91" wp14:editId="1E725F92">
-            <wp:extent cx="1005840" cy="1005840"/>
+          <wp:inline distT="0" distB="0" distL="0" distR="0">
+            <wp:extent cx="960120" cy="960120"/>
             <wp:effectExtent l="0" t="0" r="0" b="0"/>
-            <wp:docPr id="1" name="Picture 1"/>
+            <wp:docPr id="1" name="Picture 1" descr="Figure 1. The Sun provides a familiar source of light and radiant energy."/>
             <wp:cNvGraphicFramePr>
               <a:graphicFrameLocks xmlns:a="http://schemas.openxmlformats.org/drawingml/2006/main" noChangeAspect="1"/>
             </wp:cNvGraphicFramePr>
@@ -318,7 +235,7 @@
               <a:graphicData uri="http://schemas.openxmlformats.org/drawingml/2006/picture">
                 <pic:pic xmlns:pic="http://schemas.openxmlformats.org/drawingml/2006/picture">
                   <pic:nvPicPr>
-                    <pic:cNvPr id="0" name="introduction-1-1.png"/>
+                    <pic:cNvPr id="0" name="image1.png"/>
                     <pic:cNvPicPr/>
                   </pic:nvPicPr>
                   <pic:blipFill>
@@ -330,7 +247,7 @@
                   <pic:spPr>
                     <a:xfrm>
                       <a:off x="0" y="0"/>
-                      <a:ext cx="1005840" cy="1005840"/>
+                      <a:ext cx="960120" cy="960120"/>
                     </a:xfrm>
                     <a:prstGeom prst="rect">
                       <a:avLst/>
@@ -345,10 +262,63 @@
     </w:p>
     <w:p>
       <w:pPr>
+        <w:pStyle w:val="Caption"/>
+        <w:jc w:val="center"/>
+      </w:pPr>
+      <w:r>
+        <w:t>Figure 1. The Sun provides a familiar source of light and radiant energy.</w:t>
+      </w:r>
+    </w:p>
+    <w:p>
+      <w:pPr>
         <w:pStyle w:val="Heading1"/>
       </w:pPr>
       <w:r>
-        <w:t>4. Organizing Space Information</w:t>
+        <w:t>4 Organize the electromagnetic spectrum</w:t>
+      </w:r>
+    </w:p>
+    <w:p>
+      <w:pPr>
+        <w:pStyle w:val="ListNumber"/>
+        <w:numPr>
+          <w:ilvl w:val="0"/>
+          <w:numId w:val="12"/>
+        </w:numPr>
+      </w:pPr>
+      <w:r>
+        <w:t>Introduce electromagnetic radiation as energy carried by electromagnetic waves. Connect the term to electric and magnetic fields.</w:t>
+      </w:r>
+    </w:p>
+    <w:p>
+      <w:pPr>
+        <w:pStyle w:val="ListNumber"/>
+        <w:numPr>
+          <w:ilvl w:val="0"/>
+          <w:numId w:val="12"/>
+        </w:numPr>
+      </w:pPr>
+      <w:r>
+        <w:t>Have students arrange the term cards on their spectrum worksheet. Locate the visible-light region and color it.</w:t>
+      </w:r>
+    </w:p>
+    <w:p>
+      <w:pPr>
+        <w:pStyle w:val="ListNumber"/>
+        <w:numPr>
+          <w:ilvl w:val="0"/>
+          <w:numId w:val="12"/>
+        </w:numPr>
+      </w:pPr>
+      <w:r>
+        <w:t>Locate radio waves. Discuss why our eyes cannot directly detect this radiation.</w:t>
+      </w:r>
+    </w:p>
+    <w:p>
+      <w:pPr>
+        <w:pStyle w:val="Heading1"/>
+      </w:pPr>
+      <w:r>
+        <w:t>Discussion and reflection</w:t>
       </w:r>
     </w:p>
     <w:p>
@@ -356,7 +326,7 @@
         <w:pStyle w:val="ListBullet"/>
       </w:pPr>
       <w:r>
-        <w:t>Electromagnetic Spectrum</w:t>
+        <w:t>Which light reaches your eyes when you look at a colored object?</w:t>
       </w:r>
     </w:p>
     <w:p>
@@ -364,7 +334,7 @@
         <w:pStyle w:val="ListBullet"/>
       </w:pPr>
       <w:r>
-        <w:t>Electro-Electricity</w:t>
+        <w:t>Where do visible light and radio waves fit in the electromagnetic spectrum?</w:t>
       </w:r>
     </w:p>
     <w:p>
@@ -372,23 +342,7 @@
         <w:pStyle w:val="ListBullet"/>
       </w:pPr>
       <w:r>
-        <w:t>Spectrum-arranges it</w:t>
-      </w:r>
-    </w:p>
-    <w:p>
-      <w:pPr>
-        <w:pStyle w:val="ListBullet"/>
-      </w:pPr>
-      <w:r>
-        <w:t>Magnetic-magnetism</w:t>
-      </w:r>
-    </w:p>
-    <w:p>
-      <w:pPr>
-        <w:pStyle w:val="ListBullet"/>
-      </w:pPr>
-      <w:r>
-        <w:t>Everything in space= gives off Radiation (ENERGY)</w:t>
+        <w:t>What could a radio telescope reveal that a visible-light telescope does not show?</w:t>
       </w:r>
     </w:p>
     <w:p>
@@ -396,34 +350,45 @@
         <w:pStyle w:val="Heading1"/>
       </w:pPr>
       <w:r>
-        <w:t>5. Electromagnetic Spectrum</w:t>
+        <w:t>Sources</w:t>
       </w:r>
     </w:p>
     <w:p>
-      <w:pPr>
-        <w:pStyle w:val="ListBullet"/>
-      </w:pPr>
       <w:r>
-        <w:t>Manipulative</w:t>
+        <w:t>Adapted from the DSPIRA electromagnetic spectrum and space teaching outline. Original Sun illustration retained.</w:t>
       </w:r>
     </w:p>
     <w:p>
-      <w:pPr>
-        <w:pStyle w:val="ListBullet"/>
-      </w:pPr>
-      <w:r>
-        <w:t>Students color visible light portion</w:t>
-      </w:r>
+      <w:hyperlink r:id="rId9">
+        <w:r>
+          <w:rPr>
+            <w:color w:val="002855"/>
+            <w:u w:val="single"/>
+          </w:rPr>
+          <w:t>NASA: Wave behaviors</w:t>
+        </w:r>
+      </w:hyperlink>
+    </w:p>
+    <w:p>
+      <w:hyperlink r:id="rId10">
+        <w:r>
+          <w:rPr>
+            <w:color w:val="002855"/>
+            <w:u w:val="single"/>
+          </w:rPr>
+          <w:t>NASA JPL: The science of color</w:t>
+        </w:r>
+      </w:hyperlink>
     </w:p>
     <w:sectPr>
-      <w:headerReference w:type="even" r:id="rId9"/>
-      <w:headerReference w:type="default" r:id="rId10"/>
-      <w:footerReference w:type="even" r:id="rId11"/>
-      <w:footerReference w:type="default" r:id="rId12"/>
-      <w:headerReference w:type="first" r:id="rId13"/>
-      <w:footerReference w:type="first" r:id="rId14"/>
+      <w:headerReference w:type="even" r:id="rId11"/>
+      <w:headerReference w:type="default" r:id="rId12"/>
+      <w:footerReference w:type="even" r:id="rId13"/>
+      <w:footerReference w:type="default" r:id="rId14"/>
+      <w:headerReference w:type="first" r:id="rId15"/>
+      <w:footerReference w:type="first" r:id="rId16"/>
       <w:pgSz w:w="12240" w:h="15840"/>
-      <w:pgMar w:top="1512" w:right="1080" w:bottom="1080" w:left="1080" w:header="432" w:footer="432" w:gutter="0"/>
+      <w:pgMar w:top="1512" w:right="1080" w:bottom="1008" w:left="1080" w:header="432" w:footer="432" w:gutter="0"/>
       <w:cols w:space="720"/>
       <w:docGrid w:linePitch="360"/>
     </w:sectPr>
@@ -781,32 +746,50 @@
       </w:rPr>
     </w:lvl>
   </w:abstractNum>
-  <w:num w:numId="1" w16cid:durableId="888608417">
+  <w:num w:numId="1" w16cid:durableId="2013213653">
     <w:abstractNumId w:val="8"/>
   </w:num>
-  <w:num w:numId="2" w16cid:durableId="1893231458">
+  <w:num w:numId="2" w16cid:durableId="1314718113">
     <w:abstractNumId w:val="6"/>
   </w:num>
-  <w:num w:numId="3" w16cid:durableId="1476602113">
+  <w:num w:numId="3" w16cid:durableId="561213874">
     <w:abstractNumId w:val="5"/>
   </w:num>
-  <w:num w:numId="4" w16cid:durableId="1198663948">
+  <w:num w:numId="4" w16cid:durableId="637957408">
     <w:abstractNumId w:val="4"/>
   </w:num>
-  <w:num w:numId="5" w16cid:durableId="788356317">
+  <w:num w:numId="5" w16cid:durableId="904952620">
     <w:abstractNumId w:val="7"/>
   </w:num>
-  <w:num w:numId="6" w16cid:durableId="1682583767">
+  <w:num w:numId="6" w16cid:durableId="1595548113">
     <w:abstractNumId w:val="3"/>
   </w:num>
-  <w:num w:numId="7" w16cid:durableId="1131944999">
+  <w:num w:numId="7" w16cid:durableId="1391727043">
     <w:abstractNumId w:val="2"/>
   </w:num>
-  <w:num w:numId="8" w16cid:durableId="1544053263">
+  <w:num w:numId="8" w16cid:durableId="926695197">
     <w:abstractNumId w:val="1"/>
   </w:num>
-  <w:num w:numId="9" w16cid:durableId="1357581040">
+  <w:num w:numId="9" w16cid:durableId="533272150">
     <w:abstractNumId w:val="0"/>
+  </w:num>
+  <w:num w:numId="10" w16cid:durableId="1209948837">
+    <w:abstractNumId w:val="7"/>
+    <w:lvlOverride w:ilvl="0">
+      <w:startOverride w:val="1"/>
+    </w:lvlOverride>
+  </w:num>
+  <w:num w:numId="11" w16cid:durableId="1050492571">
+    <w:abstractNumId w:val="7"/>
+    <w:lvlOverride w:ilvl="0">
+      <w:startOverride w:val="1"/>
+    </w:lvlOverride>
+  </w:num>
+  <w:num w:numId="12" w16cid:durableId="901522232">
+    <w:abstractNumId w:val="7"/>
+    <w:lvlOverride w:ilvl="0">
+      <w:startOverride w:val="1"/>
+    </w:lvlOverride>
   </w:num>
 </w:numbering>
 </file>
@@ -816,7 +799,7 @@
   <w:docDefaults>
     <w:rPrDefault>
       <w:rPr>
-        <w:rFonts w:ascii="Arial" w:eastAsia="Arial" w:hAnsi="Arial" w:cs="Arial"/>
+        <w:rFonts w:asciiTheme="minorHAnsi" w:eastAsiaTheme="minorEastAsia" w:hAnsiTheme="minorHAnsi" w:cstheme="minorBidi"/>
         <w:sz w:val="22"/>
         <w:szCs w:val="22"/>
         <w:lang w:val="en-US" w:eastAsia="en-US" w:bidi="ar-SA"/>
@@ -1205,6 +1188,7 @@
       <w:spacing w:after="140" w:line="264" w:lineRule="auto"/>
     </w:pPr>
     <w:rPr>
+      <w:rFonts w:ascii="Arial" w:hAnsi="Arial"/>
       <w:color w:val="000000"/>
     </w:rPr>
   </w:style>
@@ -1292,7 +1276,6 @@
       <w:bCs/>
       <w:i/>
       <w:iCs/>
-      <w:color w:val="4F81BD" w:themeColor="accent1"/>
     </w:rPr>
   </w:style>
   <w:style w:type="paragraph" w:styleId="Heading5">
@@ -1311,9 +1294,6 @@
       <w:spacing w:before="200" w:after="0"/>
       <w:outlineLvl w:val="4"/>
     </w:pPr>
-    <w:rPr>
-      <w:color w:val="243F60" w:themeColor="accent1" w:themeShade="7F"/>
-    </w:rPr>
   </w:style>
   <w:style w:type="paragraph" w:styleId="Heading6">
     <w:name w:val="heading 6"/>
@@ -1334,7 +1314,6 @@
     <w:rPr>
       <w:i/>
       <w:iCs/>
-      <w:color w:val="243F60" w:themeColor="accent1" w:themeShade="7F"/>
     </w:rPr>
   </w:style>
   <w:style w:type="paragraph" w:styleId="Heading7">
@@ -1356,7 +1335,6 @@
     <w:rPr>
       <w:i/>
       <w:iCs/>
-      <w:color w:val="404040" w:themeColor="text1" w:themeTint="BF"/>
     </w:rPr>
   </w:style>
   <w:style w:type="paragraph" w:styleId="Heading8">
@@ -1376,7 +1354,6 @@
       <w:outlineLvl w:val="7"/>
     </w:pPr>
     <w:rPr>
-      <w:color w:val="4F81BD" w:themeColor="accent1"/>
       <w:sz w:val="20"/>
       <w:szCs w:val="20"/>
     </w:rPr>
@@ -1400,7 +1377,6 @@
     <w:rPr>
       <w:i/>
       <w:iCs/>
-      <w:color w:val="404040" w:themeColor="text1" w:themeTint="BF"/>
       <w:sz w:val="20"/>
       <w:szCs w:val="20"/>
     </w:rPr>
@@ -1450,7 +1426,8 @@
     <w:uiPriority w:val="99"/>
     <w:rsid w:val="00E618BF"/>
     <w:rPr>
-      <w:rFonts w:ascii="Arial" w:eastAsia="Arial" w:hAnsi="Arial" w:cs="Arial"/>
+      <w:rFonts w:ascii="Arial" w:hAnsi="Arial"/>
+      <w:color w:val="000000"/>
     </w:rPr>
   </w:style>
   <w:style w:type="paragraph" w:styleId="Footer">
@@ -1474,7 +1451,8 @@
     <w:uiPriority w:val="99"/>
     <w:rsid w:val="00E618BF"/>
     <w:rPr>
-      <w:rFonts w:ascii="Arial" w:eastAsia="Arial" w:hAnsi="Arial" w:cs="Arial"/>
+      <w:rFonts w:ascii="Arial" w:hAnsi="Arial"/>
+      <w:color w:val="000000"/>
     </w:rPr>
   </w:style>
   <w:style w:type="paragraph" w:styleId="NoSpacing">
@@ -1485,6 +1463,10 @@
     <w:pPr>
       <w:spacing w:after="0" w:line="240" w:lineRule="auto"/>
     </w:pPr>
+    <w:rPr>
+      <w:rFonts w:ascii="Arial" w:hAnsi="Arial"/>
+      <w:color w:val="000000"/>
+    </w:rPr>
   </w:style>
   <w:style w:type="character" w:customStyle="1" w:styleId="Heading1Char">
     <w:name w:val="Heading 1 Char"/>
@@ -1493,10 +1475,11 @@
     <w:uiPriority w:val="9"/>
     <w:rsid w:val="00FC693F"/>
     <w:rPr>
+      <w:rFonts w:ascii="Arial" w:hAnsi="Arial"/>
       <w:b/>
       <w:bCs/>
       <w:color w:val="000000"/>
-      <w:sz w:val="30"/>
+      <w:sz w:val="28"/>
       <w:szCs w:val="28"/>
     </w:rPr>
   </w:style>
@@ -1507,10 +1490,11 @@
     <w:uiPriority w:val="9"/>
     <w:rsid w:val="00FC693F"/>
     <w:rPr>
+      <w:rFonts w:ascii="Arial" w:hAnsi="Arial"/>
       <w:b/>
       <w:bCs/>
       <w:color w:val="000000"/>
-      <w:sz w:val="24"/>
+      <w:sz w:val="26"/>
       <w:szCs w:val="26"/>
     </w:rPr>
   </w:style>
@@ -1521,6 +1505,7 @@
     <w:uiPriority w:val="9"/>
     <w:rsid w:val="00FC693F"/>
     <w:rPr>
+      <w:rFonts w:ascii="Arial" w:hAnsi="Arial"/>
       <w:b/>
       <w:bCs/>
       <w:color w:val="000000"/>
@@ -1535,7 +1520,7 @@
     <w:qFormat/>
     <w:rsid w:val="00FC693F"/>
     <w:pPr>
-      <w:spacing w:after="160" w:line="240" w:lineRule="auto"/>
+      <w:spacing w:line="240" w:lineRule="auto"/>
       <w:contextualSpacing/>
     </w:pPr>
     <w:rPr>
@@ -1551,9 +1536,10 @@
     <w:uiPriority w:val="10"/>
     <w:rsid w:val="00FC693F"/>
     <w:rPr>
+      <w:rFonts w:ascii="Arial" w:hAnsi="Arial"/>
       <w:color w:val="000000"/>
       <w:kern w:val="28"/>
-      <w:sz w:val="48"/>
+      <w:sz w:val="52"/>
       <w:szCs w:val="52"/>
     </w:rPr>
   </w:style>
@@ -1569,7 +1555,6 @@
       <w:numPr>
         <w:ilvl w:val="1"/>
       </w:numPr>
-      <w:spacing w:after="160"/>
     </w:pPr>
     <w:rPr>
       <w:iCs/>
@@ -1583,8 +1568,11 @@
     <w:uiPriority w:val="11"/>
     <w:rsid w:val="00FC693F"/>
     <w:rPr>
+      <w:rFonts w:ascii="Arial" w:hAnsi="Arial"/>
+      <w:i/>
       <w:iCs/>
       <w:color w:val="000000"/>
+      <w:sz w:val="24"/>
       <w:szCs w:val="24"/>
     </w:rPr>
   </w:style>
@@ -1617,7 +1605,8 @@
     <w:uiPriority w:val="99"/>
     <w:rsid w:val="00AA1D8D"/>
     <w:rPr>
-      <w:rFonts w:ascii="Arial" w:eastAsia="Arial" w:hAnsi="Arial" w:cs="Arial"/>
+      <w:rFonts w:ascii="Arial" w:hAnsi="Arial"/>
+      <w:color w:val="000000"/>
     </w:rPr>
   </w:style>
   <w:style w:type="paragraph" w:styleId="BodyText2">
@@ -1638,7 +1627,8 @@
     <w:uiPriority w:val="99"/>
     <w:rsid w:val="00AA1D8D"/>
     <w:rPr>
-      <w:rFonts w:ascii="Arial" w:eastAsia="Arial" w:hAnsi="Arial" w:cs="Arial"/>
+      <w:rFonts w:ascii="Arial" w:hAnsi="Arial"/>
+      <w:color w:val="000000"/>
     </w:rPr>
   </w:style>
   <w:style w:type="paragraph" w:styleId="BodyText3">
@@ -1663,7 +1653,8 @@
     <w:uiPriority w:val="99"/>
     <w:rsid w:val="00AA1D8D"/>
     <w:rPr>
-      <w:rFonts w:ascii="Arial" w:eastAsia="Arial" w:hAnsi="Arial" w:cs="Arial"/>
+      <w:rFonts w:ascii="Arial" w:hAnsi="Arial"/>
+      <w:color w:val="000000"/>
       <w:sz w:val="16"/>
       <w:szCs w:val="16"/>
     </w:rPr>
@@ -1833,6 +1824,8 @@
       </w:tabs>
     </w:pPr>
     <w:rPr>
+      <w:rFonts w:ascii="Arial" w:hAnsi="Arial"/>
+      <w:color w:val="000000"/>
       <w:sz w:val="20"/>
       <w:szCs w:val="20"/>
     </w:rPr>
@@ -1844,7 +1837,8 @@
     <w:uiPriority w:val="99"/>
     <w:rsid w:val="0029639D"/>
     <w:rPr>
-      <w:rFonts w:ascii="Arial" w:eastAsia="Arial" w:hAnsi="Arial" w:cs="Arial"/>
+      <w:rFonts w:ascii="Arial" w:hAnsi="Arial"/>
+      <w:color w:val="000000"/>
       <w:sz w:val="20"/>
       <w:szCs w:val="20"/>
     </w:rPr>
@@ -1860,7 +1854,6 @@
     <w:rPr>
       <w:i/>
       <w:iCs/>
-      <w:color w:val="000000" w:themeColor="text1"/>
     </w:rPr>
   </w:style>
   <w:style w:type="character" w:customStyle="1" w:styleId="QuoteChar">
@@ -1870,10 +1863,10 @@
     <w:uiPriority w:val="29"/>
     <w:rsid w:val="00FC693F"/>
     <w:rPr>
-      <w:rFonts w:ascii="Arial" w:eastAsia="Arial" w:hAnsi="Arial" w:cs="Arial"/>
+      <w:rFonts w:ascii="Arial" w:hAnsi="Arial"/>
       <w:i/>
       <w:iCs/>
-      <w:color w:val="000000" w:themeColor="text1"/>
+      <w:color w:val="000000"/>
     </w:rPr>
   </w:style>
   <w:style w:type="character" w:customStyle="1" w:styleId="Heading4Char">
@@ -1884,12 +1877,12 @@
     <w:semiHidden/>
     <w:rsid w:val="00FC693F"/>
     <w:rPr>
-      <w:rFonts w:ascii="Arial" w:eastAsia="Arial" w:hAnsi="Arial" w:cs="Arial"/>
+      <w:rFonts w:ascii="Arial" w:hAnsi="Arial"/>
       <w:b/>
       <w:bCs/>
       <w:i/>
       <w:iCs/>
-      <w:color w:val="4F81BD" w:themeColor="accent1"/>
+      <w:color w:val="000000"/>
     </w:rPr>
   </w:style>
   <w:style w:type="character" w:customStyle="1" w:styleId="Heading5Char">
@@ -1900,8 +1893,8 @@
     <w:semiHidden/>
     <w:rsid w:val="00FC693F"/>
     <w:rPr>
-      <w:rFonts w:ascii="Arial" w:eastAsia="Arial" w:hAnsi="Arial" w:cs="Arial"/>
-      <w:color w:val="243F60" w:themeColor="accent1" w:themeShade="7F"/>
+      <w:rFonts w:ascii="Arial" w:hAnsi="Arial"/>
+      <w:color w:val="000000"/>
     </w:rPr>
   </w:style>
   <w:style w:type="character" w:customStyle="1" w:styleId="Heading6Char">
@@ -1912,10 +1905,10 @@
     <w:semiHidden/>
     <w:rsid w:val="00FC693F"/>
     <w:rPr>
-      <w:rFonts w:ascii="Arial" w:eastAsia="Arial" w:hAnsi="Arial" w:cs="Arial"/>
+      <w:rFonts w:ascii="Arial" w:hAnsi="Arial"/>
       <w:i/>
       <w:iCs/>
-      <w:color w:val="243F60" w:themeColor="accent1" w:themeShade="7F"/>
+      <w:color w:val="000000"/>
     </w:rPr>
   </w:style>
   <w:style w:type="character" w:customStyle="1" w:styleId="Heading7Char">
@@ -1926,10 +1919,10 @@
     <w:semiHidden/>
     <w:rsid w:val="00FC693F"/>
     <w:rPr>
-      <w:rFonts w:ascii="Arial" w:eastAsia="Arial" w:hAnsi="Arial" w:cs="Arial"/>
+      <w:rFonts w:ascii="Arial" w:hAnsi="Arial"/>
       <w:i/>
       <w:iCs/>
-      <w:color w:val="404040" w:themeColor="text1" w:themeTint="BF"/>
+      <w:color w:val="000000"/>
     </w:rPr>
   </w:style>
   <w:style w:type="character" w:customStyle="1" w:styleId="Heading8Char">
@@ -1940,8 +1933,8 @@
     <w:semiHidden/>
     <w:rsid w:val="00FC693F"/>
     <w:rPr>
-      <w:rFonts w:ascii="Arial" w:eastAsia="Arial" w:hAnsi="Arial" w:cs="Arial"/>
-      <w:color w:val="4F81BD" w:themeColor="accent1"/>
+      <w:rFonts w:ascii="Arial" w:hAnsi="Arial"/>
+      <w:color w:val="000000"/>
       <w:sz w:val="20"/>
       <w:szCs w:val="20"/>
     </w:rPr>
@@ -1954,10 +1947,10 @@
     <w:semiHidden/>
     <w:rsid w:val="00FC693F"/>
     <w:rPr>
-      <w:rFonts w:ascii="Arial" w:eastAsia="Arial" w:hAnsi="Arial" w:cs="Arial"/>
+      <w:rFonts w:ascii="Arial" w:hAnsi="Arial"/>
       <w:i/>
       <w:iCs/>
-      <w:color w:val="404040" w:themeColor="text1" w:themeTint="BF"/>
+      <w:color w:val="000000"/>
       <w:sz w:val="20"/>
       <w:szCs w:val="20"/>
     </w:rPr>
@@ -1975,6 +1968,7 @@
       <w:spacing w:line="240" w:lineRule="auto"/>
     </w:pPr>
     <w:rPr>
+      <w:b/>
       <w:bCs/>
       <w:sz w:val="20"/>
       <w:szCs w:val="18"/>
@@ -1987,9 +1981,10 @@
     <w:qFormat/>
     <w:rsid w:val="00FC693F"/>
     <w:rPr>
-      <w:rFonts w:ascii="Arial" w:eastAsia="Arial" w:hAnsi="Arial" w:cs="Arial"/>
+      <w:rFonts w:ascii="Arial" w:hAnsi="Arial"/>
       <w:b/>
       <w:bCs/>
+      <w:color w:val="000000"/>
     </w:rPr>
   </w:style>
   <w:style w:type="character" w:styleId="Emphasis">
@@ -1999,9 +1994,10 @@
     <w:qFormat/>
     <w:rsid w:val="00FC693F"/>
     <w:rPr>
-      <w:rFonts w:ascii="Arial" w:eastAsia="Arial" w:hAnsi="Arial" w:cs="Arial"/>
+      <w:rFonts w:ascii="Arial" w:hAnsi="Arial"/>
       <w:i/>
       <w:iCs/>
+      <w:color w:val="000000"/>
     </w:rPr>
   </w:style>
   <w:style w:type="paragraph" w:styleId="IntenseQuote">
@@ -2013,6 +2009,9 @@
     <w:qFormat/>
     <w:rsid w:val="00FC693F"/>
     <w:pPr>
+      <w:pBdr>
+        <w:bottom w:val="single" w:sz="4" w:space="4" w:color="4F81BD" w:themeColor="accent1"/>
+      </w:pBdr>
       <w:spacing w:before="200" w:after="280"/>
       <w:ind w:left="936" w:right="936"/>
     </w:pPr>
@@ -2021,7 +2020,6 @@
       <w:bCs/>
       <w:i/>
       <w:iCs/>
-      <w:color w:val="4F81BD" w:themeColor="accent1"/>
     </w:rPr>
   </w:style>
   <w:style w:type="character" w:customStyle="1" w:styleId="IntenseQuoteChar">
@@ -2031,12 +2029,12 @@
     <w:uiPriority w:val="30"/>
     <w:rsid w:val="00FC693F"/>
     <w:rPr>
-      <w:rFonts w:ascii="Arial" w:eastAsia="Arial" w:hAnsi="Arial" w:cs="Arial"/>
+      <w:rFonts w:ascii="Arial" w:hAnsi="Arial"/>
       <w:b/>
       <w:bCs/>
       <w:i/>
       <w:iCs/>
-      <w:color w:val="4F81BD" w:themeColor="accent1"/>
+      <w:color w:val="000000"/>
     </w:rPr>
   </w:style>
   <w:style w:type="character" w:styleId="SubtleEmphasis">
@@ -2046,10 +2044,10 @@
     <w:qFormat/>
     <w:rsid w:val="00FC693F"/>
     <w:rPr>
-      <w:rFonts w:ascii="Arial" w:eastAsia="Arial" w:hAnsi="Arial" w:cs="Arial"/>
+      <w:rFonts w:ascii="Arial" w:hAnsi="Arial"/>
       <w:i/>
       <w:iCs/>
-      <w:color w:val="808080" w:themeColor="text1" w:themeTint="7F"/>
+      <w:color w:val="000000"/>
     </w:rPr>
   </w:style>
   <w:style w:type="character" w:styleId="IntenseEmphasis">
@@ -2059,12 +2057,12 @@
     <w:qFormat/>
     <w:rsid w:val="00FC693F"/>
     <w:rPr>
-      <w:rFonts w:ascii="Arial" w:eastAsia="Arial" w:hAnsi="Arial" w:cs="Arial"/>
+      <w:rFonts w:ascii="Arial" w:hAnsi="Arial"/>
       <w:b/>
       <w:bCs/>
       <w:i/>
       <w:iCs/>
-      <w:color w:val="4F81BD" w:themeColor="accent1"/>
+      <w:color w:val="000000"/>
     </w:rPr>
   </w:style>
   <w:style w:type="character" w:styleId="SubtleReference">
@@ -2074,9 +2072,9 @@
     <w:qFormat/>
     <w:rsid w:val="00FC693F"/>
     <w:rPr>
-      <w:rFonts w:ascii="Arial" w:eastAsia="Arial" w:hAnsi="Arial" w:cs="Arial"/>
+      <w:rFonts w:ascii="Arial" w:hAnsi="Arial"/>
       <w:smallCaps/>
-      <w:color w:val="C0504D" w:themeColor="accent2"/>
+      <w:color w:val="000000"/>
       <w:u w:val="single"/>
     </w:rPr>
   </w:style>
@@ -2087,11 +2085,11 @@
     <w:qFormat/>
     <w:rsid w:val="00FC693F"/>
     <w:rPr>
-      <w:rFonts w:ascii="Arial" w:eastAsia="Arial" w:hAnsi="Arial" w:cs="Arial"/>
+      <w:rFonts w:ascii="Arial" w:hAnsi="Arial"/>
       <w:b/>
       <w:bCs/>
       <w:smallCaps/>
-      <w:color w:val="C0504D" w:themeColor="accent2"/>
+      <w:color w:val="000000"/>
       <w:spacing w:val="5"/>
       <w:u w:val="single"/>
     </w:rPr>
@@ -2103,10 +2101,11 @@
     <w:qFormat/>
     <w:rsid w:val="00FC693F"/>
     <w:rPr>
-      <w:rFonts w:ascii="Arial" w:eastAsia="Arial" w:hAnsi="Arial" w:cs="Arial"/>
+      <w:rFonts w:ascii="Arial" w:hAnsi="Arial"/>
       <w:b/>
       <w:bCs/>
       <w:smallCaps/>
+      <w:color w:val="000000"/>
       <w:spacing w:val="5"/>
     </w:rPr>
   </w:style>
@@ -2166,7 +2165,6 @@
         <w:spacing w:before="0" w:after="0" w:line="240" w:lineRule="auto"/>
       </w:pPr>
       <w:rPr>
-        <w:rFonts w:ascii="Arial" w:eastAsia="Arial" w:hAnsi="Arial" w:cs="Arial"/>
         <w:b/>
         <w:bCs/>
       </w:rPr>
@@ -2187,7 +2185,6 @@
         <w:spacing w:before="0" w:after="0" w:line="240" w:lineRule="auto"/>
       </w:pPr>
       <w:rPr>
-        <w:rFonts w:ascii="Arial" w:eastAsia="Arial" w:hAnsi="Arial" w:cs="Arial"/>
         <w:b/>
         <w:bCs/>
       </w:rPr>
@@ -2205,14 +2202,12 @@
     </w:tblStylePr>
     <w:tblStylePr w:type="firstCol">
       <w:rPr>
-        <w:rFonts w:ascii="Arial" w:eastAsia="Arial" w:hAnsi="Arial" w:cs="Arial"/>
         <w:b/>
         <w:bCs/>
       </w:rPr>
     </w:tblStylePr>
     <w:tblStylePr w:type="lastCol">
       <w:rPr>
-        <w:rFonts w:ascii="Arial" w:eastAsia="Arial" w:hAnsi="Arial" w:cs="Arial"/>
         <w:b/>
         <w:bCs/>
       </w:rPr>
@@ -2266,7 +2261,6 @@
         <w:spacing w:before="0" w:after="0" w:line="240" w:lineRule="auto"/>
       </w:pPr>
       <w:rPr>
-        <w:rFonts w:ascii="Arial" w:eastAsia="Arial" w:hAnsi="Arial" w:cs="Arial"/>
         <w:b/>
         <w:bCs/>
       </w:rPr>
@@ -2287,7 +2281,6 @@
         <w:spacing w:before="0" w:after="0" w:line="240" w:lineRule="auto"/>
       </w:pPr>
       <w:rPr>
-        <w:rFonts w:ascii="Arial" w:eastAsia="Arial" w:hAnsi="Arial" w:cs="Arial"/>
         <w:b/>
         <w:bCs/>
       </w:rPr>
@@ -2305,14 +2298,12 @@
     </w:tblStylePr>
     <w:tblStylePr w:type="firstCol">
       <w:rPr>
-        <w:rFonts w:ascii="Arial" w:eastAsia="Arial" w:hAnsi="Arial" w:cs="Arial"/>
         <w:b/>
         <w:bCs/>
       </w:rPr>
     </w:tblStylePr>
     <w:tblStylePr w:type="lastCol">
       <w:rPr>
-        <w:rFonts w:ascii="Arial" w:eastAsia="Arial" w:hAnsi="Arial" w:cs="Arial"/>
         <w:b/>
         <w:bCs/>
       </w:rPr>
@@ -2366,7 +2357,6 @@
         <w:spacing w:before="0" w:after="0" w:line="240" w:lineRule="auto"/>
       </w:pPr>
       <w:rPr>
-        <w:rFonts w:ascii="Arial" w:eastAsia="Arial" w:hAnsi="Arial" w:cs="Arial"/>
         <w:b/>
         <w:bCs/>
       </w:rPr>
@@ -2387,7 +2377,6 @@
         <w:spacing w:before="0" w:after="0" w:line="240" w:lineRule="auto"/>
       </w:pPr>
       <w:rPr>
-        <w:rFonts w:ascii="Arial" w:eastAsia="Arial" w:hAnsi="Arial" w:cs="Arial"/>
         <w:b/>
         <w:bCs/>
       </w:rPr>
@@ -2405,14 +2394,12 @@
     </w:tblStylePr>
     <w:tblStylePr w:type="firstCol">
       <w:rPr>
-        <w:rFonts w:ascii="Arial" w:eastAsia="Arial" w:hAnsi="Arial" w:cs="Arial"/>
         <w:b/>
         <w:bCs/>
       </w:rPr>
     </w:tblStylePr>
     <w:tblStylePr w:type="lastCol">
       <w:rPr>
-        <w:rFonts w:ascii="Arial" w:eastAsia="Arial" w:hAnsi="Arial" w:cs="Arial"/>
         <w:b/>
         <w:bCs/>
       </w:rPr>
@@ -2466,7 +2453,6 @@
         <w:spacing w:before="0" w:after="0" w:line="240" w:lineRule="auto"/>
       </w:pPr>
       <w:rPr>
-        <w:rFonts w:ascii="Arial" w:eastAsia="Arial" w:hAnsi="Arial" w:cs="Arial"/>
         <w:b/>
         <w:bCs/>
       </w:rPr>
@@ -2487,7 +2473,6 @@
         <w:spacing w:before="0" w:after="0" w:line="240" w:lineRule="auto"/>
       </w:pPr>
       <w:rPr>
-        <w:rFonts w:ascii="Arial" w:eastAsia="Arial" w:hAnsi="Arial" w:cs="Arial"/>
         <w:b/>
         <w:bCs/>
       </w:rPr>
@@ -2505,14 +2490,12 @@
     </w:tblStylePr>
     <w:tblStylePr w:type="firstCol">
       <w:rPr>
-        <w:rFonts w:ascii="Arial" w:eastAsia="Arial" w:hAnsi="Arial" w:cs="Arial"/>
         <w:b/>
         <w:bCs/>
       </w:rPr>
     </w:tblStylePr>
     <w:tblStylePr w:type="lastCol">
       <w:rPr>
-        <w:rFonts w:ascii="Arial" w:eastAsia="Arial" w:hAnsi="Arial" w:cs="Arial"/>
         <w:b/>
         <w:bCs/>
       </w:rPr>
@@ -2566,7 +2549,6 @@
         <w:spacing w:before="0" w:after="0" w:line="240" w:lineRule="auto"/>
       </w:pPr>
       <w:rPr>
-        <w:rFonts w:ascii="Arial" w:eastAsia="Arial" w:hAnsi="Arial" w:cs="Arial"/>
         <w:b/>
         <w:bCs/>
       </w:rPr>
@@ -2587,7 +2569,6 @@
         <w:spacing w:before="0" w:after="0" w:line="240" w:lineRule="auto"/>
       </w:pPr>
       <w:rPr>
-        <w:rFonts w:ascii="Arial" w:eastAsia="Arial" w:hAnsi="Arial" w:cs="Arial"/>
         <w:b/>
         <w:bCs/>
       </w:rPr>
@@ -2605,14 +2586,12 @@
     </w:tblStylePr>
     <w:tblStylePr w:type="firstCol">
       <w:rPr>
-        <w:rFonts w:ascii="Arial" w:eastAsia="Arial" w:hAnsi="Arial" w:cs="Arial"/>
         <w:b/>
         <w:bCs/>
       </w:rPr>
     </w:tblStylePr>
     <w:tblStylePr w:type="lastCol">
       <w:rPr>
-        <w:rFonts w:ascii="Arial" w:eastAsia="Arial" w:hAnsi="Arial" w:cs="Arial"/>
         <w:b/>
         <w:bCs/>
       </w:rPr>
@@ -2666,7 +2645,6 @@
         <w:spacing w:before="0" w:after="0" w:line="240" w:lineRule="auto"/>
       </w:pPr>
       <w:rPr>
-        <w:rFonts w:ascii="Arial" w:eastAsia="Arial" w:hAnsi="Arial" w:cs="Arial"/>
         <w:b/>
         <w:bCs/>
       </w:rPr>
@@ -2687,7 +2665,6 @@
         <w:spacing w:before="0" w:after="0" w:line="240" w:lineRule="auto"/>
       </w:pPr>
       <w:rPr>
-        <w:rFonts w:ascii="Arial" w:eastAsia="Arial" w:hAnsi="Arial" w:cs="Arial"/>
         <w:b/>
         <w:bCs/>
       </w:rPr>
@@ -2705,14 +2682,12 @@
     </w:tblStylePr>
     <w:tblStylePr w:type="firstCol">
       <w:rPr>
-        <w:rFonts w:ascii="Arial" w:eastAsia="Arial" w:hAnsi="Arial" w:cs="Arial"/>
         <w:b/>
         <w:bCs/>
       </w:rPr>
     </w:tblStylePr>
     <w:tblStylePr w:type="lastCol">
       <w:rPr>
-        <w:rFonts w:ascii="Arial" w:eastAsia="Arial" w:hAnsi="Arial" w:cs="Arial"/>
         <w:b/>
         <w:bCs/>
       </w:rPr>
@@ -2766,7 +2741,6 @@
         <w:spacing w:before="0" w:after="0" w:line="240" w:lineRule="auto"/>
       </w:pPr>
       <w:rPr>
-        <w:rFonts w:ascii="Arial" w:eastAsia="Arial" w:hAnsi="Arial" w:cs="Arial"/>
         <w:b/>
         <w:bCs/>
       </w:rPr>
@@ -2787,7 +2761,6 @@
         <w:spacing w:before="0" w:after="0" w:line="240" w:lineRule="auto"/>
       </w:pPr>
       <w:rPr>
-        <w:rFonts w:ascii="Arial" w:eastAsia="Arial" w:hAnsi="Arial" w:cs="Arial"/>
         <w:b/>
         <w:bCs/>
       </w:rPr>
@@ -2805,14 +2778,12 @@
     </w:tblStylePr>
     <w:tblStylePr w:type="firstCol">
       <w:rPr>
-        <w:rFonts w:ascii="Arial" w:eastAsia="Arial" w:hAnsi="Arial" w:cs="Arial"/>
         <w:b/>
         <w:bCs/>
       </w:rPr>
     </w:tblStylePr>
     <w:tblStylePr w:type="lastCol">
       <w:rPr>
-        <w:rFonts w:ascii="Arial" w:eastAsia="Arial" w:hAnsi="Arial" w:cs="Arial"/>
         <w:b/>
         <w:bCs/>
       </w:rPr>
@@ -2865,7 +2836,6 @@
         <w:spacing w:before="0" w:after="0" w:line="240" w:lineRule="auto"/>
       </w:pPr>
       <w:rPr>
-        <w:rFonts w:ascii="Arial" w:eastAsia="Arial" w:hAnsi="Arial" w:cs="Arial"/>
         <w:b/>
         <w:bCs/>
         <w:color w:val="FFFFFF" w:themeColor="background1"/>
@@ -2880,7 +2850,6 @@
         <w:spacing w:before="0" w:after="0" w:line="240" w:lineRule="auto"/>
       </w:pPr>
       <w:rPr>
-        <w:rFonts w:ascii="Arial" w:eastAsia="Arial" w:hAnsi="Arial" w:cs="Arial"/>
         <w:b/>
         <w:bCs/>
       </w:rPr>
@@ -2896,14 +2865,12 @@
     </w:tblStylePr>
     <w:tblStylePr w:type="firstCol">
       <w:rPr>
-        <w:rFonts w:ascii="Arial" w:eastAsia="Arial" w:hAnsi="Arial" w:cs="Arial"/>
         <w:b/>
         <w:bCs/>
       </w:rPr>
     </w:tblStylePr>
     <w:tblStylePr w:type="lastCol">
       <w:rPr>
-        <w:rFonts w:ascii="Arial" w:eastAsia="Arial" w:hAnsi="Arial" w:cs="Arial"/>
         <w:b/>
         <w:bCs/>
       </w:rPr>
@@ -2954,7 +2921,6 @@
         <w:spacing w:before="0" w:after="0" w:line="240" w:lineRule="auto"/>
       </w:pPr>
       <w:rPr>
-        <w:rFonts w:ascii="Arial" w:eastAsia="Arial" w:hAnsi="Arial" w:cs="Arial"/>
         <w:b/>
         <w:bCs/>
         <w:color w:val="FFFFFF" w:themeColor="background1"/>
@@ -2969,7 +2935,6 @@
         <w:spacing w:before="0" w:after="0" w:line="240" w:lineRule="auto"/>
       </w:pPr>
       <w:rPr>
-        <w:rFonts w:ascii="Arial" w:eastAsia="Arial" w:hAnsi="Arial" w:cs="Arial"/>
         <w:b/>
         <w:bCs/>
       </w:rPr>
@@ -2985,14 +2950,12 @@
     </w:tblStylePr>
     <w:tblStylePr w:type="firstCol">
       <w:rPr>
-        <w:rFonts w:ascii="Arial" w:eastAsia="Arial" w:hAnsi="Arial" w:cs="Arial"/>
         <w:b/>
         <w:bCs/>
       </w:rPr>
     </w:tblStylePr>
     <w:tblStylePr w:type="lastCol">
       <w:rPr>
-        <w:rFonts w:ascii="Arial" w:eastAsia="Arial" w:hAnsi="Arial" w:cs="Arial"/>
         <w:b/>
         <w:bCs/>
       </w:rPr>
@@ -3043,7 +3006,6 @@
         <w:spacing w:before="0" w:after="0" w:line="240" w:lineRule="auto"/>
       </w:pPr>
       <w:rPr>
-        <w:rFonts w:ascii="Arial" w:eastAsia="Arial" w:hAnsi="Arial" w:cs="Arial"/>
         <w:b/>
         <w:bCs/>
         <w:color w:val="FFFFFF" w:themeColor="background1"/>
@@ -3058,7 +3020,6 @@
         <w:spacing w:before="0" w:after="0" w:line="240" w:lineRule="auto"/>
       </w:pPr>
       <w:rPr>
-        <w:rFonts w:ascii="Arial" w:eastAsia="Arial" w:hAnsi="Arial" w:cs="Arial"/>
         <w:b/>
         <w:bCs/>
       </w:rPr>
@@ -3074,14 +3035,12 @@
     </w:tblStylePr>
     <w:tblStylePr w:type="firstCol">
       <w:rPr>
-        <w:rFonts w:ascii="Arial" w:eastAsia="Arial" w:hAnsi="Arial" w:cs="Arial"/>
         <w:b/>
         <w:bCs/>
       </w:rPr>
     </w:tblStylePr>
     <w:tblStylePr w:type="lastCol">
       <w:rPr>
-        <w:rFonts w:ascii="Arial" w:eastAsia="Arial" w:hAnsi="Arial" w:cs="Arial"/>
         <w:b/>
         <w:bCs/>
       </w:rPr>
@@ -3132,7 +3091,6 @@
         <w:spacing w:before="0" w:after="0" w:line="240" w:lineRule="auto"/>
       </w:pPr>
       <w:rPr>
-        <w:rFonts w:ascii="Arial" w:eastAsia="Arial" w:hAnsi="Arial" w:cs="Arial"/>
         <w:b/>
         <w:bCs/>
         <w:color w:val="FFFFFF" w:themeColor="background1"/>
@@ -3147,7 +3105,6 @@
         <w:spacing w:before="0" w:after="0" w:line="240" w:lineRule="auto"/>
       </w:pPr>
       <w:rPr>
-        <w:rFonts w:ascii="Arial" w:eastAsia="Arial" w:hAnsi="Arial" w:cs="Arial"/>
         <w:b/>
         <w:bCs/>
       </w:rPr>
@@ -3163,14 +3120,12 @@
     </w:tblStylePr>
     <w:tblStylePr w:type="firstCol">
       <w:rPr>
-        <w:rFonts w:ascii="Arial" w:eastAsia="Arial" w:hAnsi="Arial" w:cs="Arial"/>
         <w:b/>
         <w:bCs/>
       </w:rPr>
     </w:tblStylePr>
     <w:tblStylePr w:type="lastCol">
       <w:rPr>
-        <w:rFonts w:ascii="Arial" w:eastAsia="Arial" w:hAnsi="Arial" w:cs="Arial"/>
         <w:b/>
         <w:bCs/>
       </w:rPr>
@@ -3221,7 +3176,6 @@
         <w:spacing w:before="0" w:after="0" w:line="240" w:lineRule="auto"/>
       </w:pPr>
       <w:rPr>
-        <w:rFonts w:ascii="Arial" w:eastAsia="Arial" w:hAnsi="Arial" w:cs="Arial"/>
         <w:b/>
         <w:bCs/>
         <w:color w:val="FFFFFF" w:themeColor="background1"/>
@@ -3236,7 +3190,6 @@
         <w:spacing w:before="0" w:after="0" w:line="240" w:lineRule="auto"/>
       </w:pPr>
       <w:rPr>
-        <w:rFonts w:ascii="Arial" w:eastAsia="Arial" w:hAnsi="Arial" w:cs="Arial"/>
         <w:b/>
         <w:bCs/>
       </w:rPr>
@@ -3252,14 +3205,12 @@
     </w:tblStylePr>
     <w:tblStylePr w:type="firstCol">
       <w:rPr>
-        <w:rFonts w:ascii="Arial" w:eastAsia="Arial" w:hAnsi="Arial" w:cs="Arial"/>
         <w:b/>
         <w:bCs/>
       </w:rPr>
     </w:tblStylePr>
     <w:tblStylePr w:type="lastCol">
       <w:rPr>
-        <w:rFonts w:ascii="Arial" w:eastAsia="Arial" w:hAnsi="Arial" w:cs="Arial"/>
         <w:b/>
         <w:bCs/>
       </w:rPr>
@@ -3310,7 +3261,6 @@
         <w:spacing w:before="0" w:after="0" w:line="240" w:lineRule="auto"/>
       </w:pPr>
       <w:rPr>
-        <w:rFonts w:ascii="Arial" w:eastAsia="Arial" w:hAnsi="Arial" w:cs="Arial"/>
         <w:b/>
         <w:bCs/>
         <w:color w:val="FFFFFF" w:themeColor="background1"/>
@@ -3325,7 +3275,6 @@
         <w:spacing w:before="0" w:after="0" w:line="240" w:lineRule="auto"/>
       </w:pPr>
       <w:rPr>
-        <w:rFonts w:ascii="Arial" w:eastAsia="Arial" w:hAnsi="Arial" w:cs="Arial"/>
         <w:b/>
         <w:bCs/>
       </w:rPr>
@@ -3341,14 +3290,12 @@
     </w:tblStylePr>
     <w:tblStylePr w:type="firstCol">
       <w:rPr>
-        <w:rFonts w:ascii="Arial" w:eastAsia="Arial" w:hAnsi="Arial" w:cs="Arial"/>
         <w:b/>
         <w:bCs/>
       </w:rPr>
     </w:tblStylePr>
     <w:tblStylePr w:type="lastCol">
       <w:rPr>
-        <w:rFonts w:ascii="Arial" w:eastAsia="Arial" w:hAnsi="Arial" w:cs="Arial"/>
         <w:b/>
         <w:bCs/>
       </w:rPr>
@@ -3399,7 +3346,6 @@
         <w:spacing w:before="0" w:after="0" w:line="240" w:lineRule="auto"/>
       </w:pPr>
       <w:rPr>
-        <w:rFonts w:ascii="Arial" w:eastAsia="Arial" w:hAnsi="Arial" w:cs="Arial"/>
         <w:b/>
         <w:bCs/>
         <w:color w:val="FFFFFF" w:themeColor="background1"/>
@@ -3414,7 +3360,6 @@
         <w:spacing w:before="0" w:after="0" w:line="240" w:lineRule="auto"/>
       </w:pPr>
       <w:rPr>
-        <w:rFonts w:ascii="Arial" w:eastAsia="Arial" w:hAnsi="Arial" w:cs="Arial"/>
         <w:b/>
         <w:bCs/>
       </w:rPr>
@@ -3430,14 +3375,12 @@
     </w:tblStylePr>
     <w:tblStylePr w:type="firstCol">
       <w:rPr>
-        <w:rFonts w:ascii="Arial" w:eastAsia="Arial" w:hAnsi="Arial" w:cs="Arial"/>
         <w:b/>
         <w:bCs/>
       </w:rPr>
     </w:tblStylePr>
     <w:tblStylePr w:type="lastCol">
       <w:rPr>
-        <w:rFonts w:ascii="Arial" w:eastAsia="Arial" w:hAnsi="Arial" w:cs="Arial"/>
         <w:b/>
         <w:bCs/>
       </w:rPr>
@@ -3490,7 +3433,7 @@
         <w:spacing w:before="0" w:after="0" w:line="240" w:lineRule="auto"/>
       </w:pPr>
       <w:rPr>
-        <w:rFonts w:ascii="Arial" w:eastAsia="Arial" w:hAnsi="Arial" w:cs="Arial"/>
+        <w:rFonts w:asciiTheme="majorHAnsi" w:eastAsiaTheme="majorEastAsia" w:hAnsiTheme="majorHAnsi" w:cstheme="majorBidi"/>
         <w:b/>
         <w:bCs/>
       </w:rPr>
@@ -3511,7 +3454,7 @@
         <w:spacing w:before="0" w:after="0" w:line="240" w:lineRule="auto"/>
       </w:pPr>
       <w:rPr>
-        <w:rFonts w:ascii="Arial" w:eastAsia="Arial" w:hAnsi="Arial" w:cs="Arial"/>
+        <w:rFonts w:asciiTheme="majorHAnsi" w:eastAsiaTheme="majorEastAsia" w:hAnsiTheme="majorHAnsi" w:cstheme="majorBidi"/>
         <w:b/>
         <w:bCs/>
       </w:rPr>
@@ -3529,14 +3472,14 @@
     </w:tblStylePr>
     <w:tblStylePr w:type="firstCol">
       <w:rPr>
-        <w:rFonts w:ascii="Arial" w:eastAsia="Arial" w:hAnsi="Arial" w:cs="Arial"/>
+        <w:rFonts w:asciiTheme="majorHAnsi" w:eastAsiaTheme="majorEastAsia" w:hAnsiTheme="majorHAnsi" w:cstheme="majorBidi"/>
         <w:b/>
         <w:bCs/>
       </w:rPr>
     </w:tblStylePr>
     <w:tblStylePr w:type="lastCol">
       <w:rPr>
-        <w:rFonts w:ascii="Arial" w:eastAsia="Arial" w:hAnsi="Arial" w:cs="Arial"/>
+        <w:rFonts w:asciiTheme="majorHAnsi" w:eastAsiaTheme="majorEastAsia" w:hAnsiTheme="majorHAnsi" w:cstheme="majorBidi"/>
         <w:b/>
         <w:bCs/>
       </w:rPr>
@@ -3613,7 +3556,7 @@
         <w:spacing w:before="0" w:after="0" w:line="240" w:lineRule="auto"/>
       </w:pPr>
       <w:rPr>
-        <w:rFonts w:ascii="Arial" w:eastAsia="Arial" w:hAnsi="Arial" w:cs="Arial"/>
+        <w:rFonts w:asciiTheme="majorHAnsi" w:eastAsiaTheme="majorEastAsia" w:hAnsiTheme="majorHAnsi" w:cstheme="majorBidi"/>
         <w:b/>
         <w:bCs/>
       </w:rPr>
@@ -3634,7 +3577,7 @@
         <w:spacing w:before="0" w:after="0" w:line="240" w:lineRule="auto"/>
       </w:pPr>
       <w:rPr>
-        <w:rFonts w:ascii="Arial" w:eastAsia="Arial" w:hAnsi="Arial" w:cs="Arial"/>
+        <w:rFonts w:asciiTheme="majorHAnsi" w:eastAsiaTheme="majorEastAsia" w:hAnsiTheme="majorHAnsi" w:cstheme="majorBidi"/>
         <w:b/>
         <w:bCs/>
       </w:rPr>
@@ -3652,14 +3595,14 @@
     </w:tblStylePr>
     <w:tblStylePr w:type="firstCol">
       <w:rPr>
-        <w:rFonts w:ascii="Arial" w:eastAsia="Arial" w:hAnsi="Arial" w:cs="Arial"/>
+        <w:rFonts w:asciiTheme="majorHAnsi" w:eastAsiaTheme="majorEastAsia" w:hAnsiTheme="majorHAnsi" w:cstheme="majorBidi"/>
         <w:b/>
         <w:bCs/>
       </w:rPr>
     </w:tblStylePr>
     <w:tblStylePr w:type="lastCol">
       <w:rPr>
-        <w:rFonts w:ascii="Arial" w:eastAsia="Arial" w:hAnsi="Arial" w:cs="Arial"/>
+        <w:rFonts w:asciiTheme="majorHAnsi" w:eastAsiaTheme="majorEastAsia" w:hAnsiTheme="majorHAnsi" w:cstheme="majorBidi"/>
         <w:b/>
         <w:bCs/>
       </w:rPr>
@@ -3736,7 +3679,7 @@
         <w:spacing w:before="0" w:after="0" w:line="240" w:lineRule="auto"/>
       </w:pPr>
       <w:rPr>
-        <w:rFonts w:ascii="Arial" w:eastAsia="Arial" w:hAnsi="Arial" w:cs="Arial"/>
+        <w:rFonts w:asciiTheme="majorHAnsi" w:eastAsiaTheme="majorEastAsia" w:hAnsiTheme="majorHAnsi" w:cstheme="majorBidi"/>
         <w:b/>
         <w:bCs/>
       </w:rPr>
@@ -3757,7 +3700,7 @@
         <w:spacing w:before="0" w:after="0" w:line="240" w:lineRule="auto"/>
       </w:pPr>
       <w:rPr>
-        <w:rFonts w:ascii="Arial" w:eastAsia="Arial" w:hAnsi="Arial" w:cs="Arial"/>
+        <w:rFonts w:asciiTheme="majorHAnsi" w:eastAsiaTheme="majorEastAsia" w:hAnsiTheme="majorHAnsi" w:cstheme="majorBidi"/>
         <w:b/>
         <w:bCs/>
       </w:rPr>
@@ -3775,14 +3718,14 @@
     </w:tblStylePr>
     <w:tblStylePr w:type="firstCol">
       <w:rPr>
-        <w:rFonts w:ascii="Arial" w:eastAsia="Arial" w:hAnsi="Arial" w:cs="Arial"/>
+        <w:rFonts w:asciiTheme="majorHAnsi" w:eastAsiaTheme="majorEastAsia" w:hAnsiTheme="majorHAnsi" w:cstheme="majorBidi"/>
         <w:b/>
         <w:bCs/>
       </w:rPr>
     </w:tblStylePr>
     <w:tblStylePr w:type="lastCol">
       <w:rPr>
-        <w:rFonts w:ascii="Arial" w:eastAsia="Arial" w:hAnsi="Arial" w:cs="Arial"/>
+        <w:rFonts w:asciiTheme="majorHAnsi" w:eastAsiaTheme="majorEastAsia" w:hAnsiTheme="majorHAnsi" w:cstheme="majorBidi"/>
         <w:b/>
         <w:bCs/>
       </w:rPr>
@@ -3859,7 +3802,7 @@
         <w:spacing w:before="0" w:after="0" w:line="240" w:lineRule="auto"/>
       </w:pPr>
       <w:rPr>
-        <w:rFonts w:ascii="Arial" w:eastAsia="Arial" w:hAnsi="Arial" w:cs="Arial"/>
+        <w:rFonts w:asciiTheme="majorHAnsi" w:eastAsiaTheme="majorEastAsia" w:hAnsiTheme="majorHAnsi" w:cstheme="majorBidi"/>
         <w:b/>
         <w:bCs/>
       </w:rPr>
@@ -3880,7 +3823,7 @@
         <w:spacing w:before="0" w:after="0" w:line="240" w:lineRule="auto"/>
       </w:pPr>
       <w:rPr>
-        <w:rFonts w:ascii="Arial" w:eastAsia="Arial" w:hAnsi="Arial" w:cs="Arial"/>
+        <w:rFonts w:asciiTheme="majorHAnsi" w:eastAsiaTheme="majorEastAsia" w:hAnsiTheme="majorHAnsi" w:cstheme="majorBidi"/>
         <w:b/>
         <w:bCs/>
       </w:rPr>
@@ -3898,14 +3841,14 @@
     </w:tblStylePr>
     <w:tblStylePr w:type="firstCol">
       <w:rPr>
-        <w:rFonts w:ascii="Arial" w:eastAsia="Arial" w:hAnsi="Arial" w:cs="Arial"/>
+        <w:rFonts w:asciiTheme="majorHAnsi" w:eastAsiaTheme="majorEastAsia" w:hAnsiTheme="majorHAnsi" w:cstheme="majorBidi"/>
         <w:b/>
         <w:bCs/>
       </w:rPr>
     </w:tblStylePr>
     <w:tblStylePr w:type="lastCol">
       <w:rPr>
-        <w:rFonts w:ascii="Arial" w:eastAsia="Arial" w:hAnsi="Arial" w:cs="Arial"/>
+        <w:rFonts w:asciiTheme="majorHAnsi" w:eastAsiaTheme="majorEastAsia" w:hAnsiTheme="majorHAnsi" w:cstheme="majorBidi"/>
         <w:b/>
         <w:bCs/>
       </w:rPr>
@@ -3982,7 +3925,7 @@
         <w:spacing w:before="0" w:after="0" w:line="240" w:lineRule="auto"/>
       </w:pPr>
       <w:rPr>
-        <w:rFonts w:ascii="Arial" w:eastAsia="Arial" w:hAnsi="Arial" w:cs="Arial"/>
+        <w:rFonts w:asciiTheme="majorHAnsi" w:eastAsiaTheme="majorEastAsia" w:hAnsiTheme="majorHAnsi" w:cstheme="majorBidi"/>
         <w:b/>
         <w:bCs/>
       </w:rPr>
@@ -4003,7 +3946,7 @@
         <w:spacing w:before="0" w:after="0" w:line="240" w:lineRule="auto"/>
       </w:pPr>
       <w:rPr>
-        <w:rFonts w:ascii="Arial" w:eastAsia="Arial" w:hAnsi="Arial" w:cs="Arial"/>
+        <w:rFonts w:asciiTheme="majorHAnsi" w:eastAsiaTheme="majorEastAsia" w:hAnsiTheme="majorHAnsi" w:cstheme="majorBidi"/>
         <w:b/>
         <w:bCs/>
       </w:rPr>
@@ -4021,14 +3964,14 @@
     </w:tblStylePr>
     <w:tblStylePr w:type="firstCol">
       <w:rPr>
-        <w:rFonts w:ascii="Arial" w:eastAsia="Arial" w:hAnsi="Arial" w:cs="Arial"/>
+        <w:rFonts w:asciiTheme="majorHAnsi" w:eastAsiaTheme="majorEastAsia" w:hAnsiTheme="majorHAnsi" w:cstheme="majorBidi"/>
         <w:b/>
         <w:bCs/>
       </w:rPr>
     </w:tblStylePr>
     <w:tblStylePr w:type="lastCol">
       <w:rPr>
-        <w:rFonts w:ascii="Arial" w:eastAsia="Arial" w:hAnsi="Arial" w:cs="Arial"/>
+        <w:rFonts w:asciiTheme="majorHAnsi" w:eastAsiaTheme="majorEastAsia" w:hAnsiTheme="majorHAnsi" w:cstheme="majorBidi"/>
         <w:b/>
         <w:bCs/>
       </w:rPr>
@@ -4105,7 +4048,7 @@
         <w:spacing w:before="0" w:after="0" w:line="240" w:lineRule="auto"/>
       </w:pPr>
       <w:rPr>
-        <w:rFonts w:ascii="Arial" w:eastAsia="Arial" w:hAnsi="Arial" w:cs="Arial"/>
+        <w:rFonts w:asciiTheme="majorHAnsi" w:eastAsiaTheme="majorEastAsia" w:hAnsiTheme="majorHAnsi" w:cstheme="majorBidi"/>
         <w:b/>
         <w:bCs/>
       </w:rPr>
@@ -4126,7 +4069,7 @@
         <w:spacing w:before="0" w:after="0" w:line="240" w:lineRule="auto"/>
       </w:pPr>
       <w:rPr>
-        <w:rFonts w:ascii="Arial" w:eastAsia="Arial" w:hAnsi="Arial" w:cs="Arial"/>
+        <w:rFonts w:asciiTheme="majorHAnsi" w:eastAsiaTheme="majorEastAsia" w:hAnsiTheme="majorHAnsi" w:cstheme="majorBidi"/>
         <w:b/>
         <w:bCs/>
       </w:rPr>
@@ -4144,14 +4087,14 @@
     </w:tblStylePr>
     <w:tblStylePr w:type="firstCol">
       <w:rPr>
-        <w:rFonts w:ascii="Arial" w:eastAsia="Arial" w:hAnsi="Arial" w:cs="Arial"/>
+        <w:rFonts w:asciiTheme="majorHAnsi" w:eastAsiaTheme="majorEastAsia" w:hAnsiTheme="majorHAnsi" w:cstheme="majorBidi"/>
         <w:b/>
         <w:bCs/>
       </w:rPr>
     </w:tblStylePr>
     <w:tblStylePr w:type="lastCol">
       <w:rPr>
-        <w:rFonts w:ascii="Arial" w:eastAsia="Arial" w:hAnsi="Arial" w:cs="Arial"/>
+        <w:rFonts w:asciiTheme="majorHAnsi" w:eastAsiaTheme="majorEastAsia" w:hAnsiTheme="majorHAnsi" w:cstheme="majorBidi"/>
         <w:b/>
         <w:bCs/>
       </w:rPr>
@@ -4228,7 +4171,7 @@
         <w:spacing w:before="0" w:after="0" w:line="240" w:lineRule="auto"/>
       </w:pPr>
       <w:rPr>
-        <w:rFonts w:ascii="Arial" w:eastAsia="Arial" w:hAnsi="Arial" w:cs="Arial"/>
+        <w:rFonts w:asciiTheme="majorHAnsi" w:eastAsiaTheme="majorEastAsia" w:hAnsiTheme="majorHAnsi" w:cstheme="majorBidi"/>
         <w:b/>
         <w:bCs/>
       </w:rPr>
@@ -4249,7 +4192,7 @@
         <w:spacing w:before="0" w:after="0" w:line="240" w:lineRule="auto"/>
       </w:pPr>
       <w:rPr>
-        <w:rFonts w:ascii="Arial" w:eastAsia="Arial" w:hAnsi="Arial" w:cs="Arial"/>
+        <w:rFonts w:asciiTheme="majorHAnsi" w:eastAsiaTheme="majorEastAsia" w:hAnsiTheme="majorHAnsi" w:cstheme="majorBidi"/>
         <w:b/>
         <w:bCs/>
       </w:rPr>
@@ -4267,14 +4210,14 @@
     </w:tblStylePr>
     <w:tblStylePr w:type="firstCol">
       <w:rPr>
-        <w:rFonts w:ascii="Arial" w:eastAsia="Arial" w:hAnsi="Arial" w:cs="Arial"/>
+        <w:rFonts w:asciiTheme="majorHAnsi" w:eastAsiaTheme="majorEastAsia" w:hAnsiTheme="majorHAnsi" w:cstheme="majorBidi"/>
         <w:b/>
         <w:bCs/>
       </w:rPr>
     </w:tblStylePr>
     <w:tblStylePr w:type="lastCol">
       <w:rPr>
-        <w:rFonts w:ascii="Arial" w:eastAsia="Arial" w:hAnsi="Arial" w:cs="Arial"/>
+        <w:rFonts w:asciiTheme="majorHAnsi" w:eastAsiaTheme="majorEastAsia" w:hAnsiTheme="majorHAnsi" w:cstheme="majorBidi"/>
         <w:b/>
         <w:bCs/>
       </w:rPr>
@@ -4350,7 +4293,6 @@
         <w:spacing w:before="0" w:after="0" w:line="240" w:lineRule="auto"/>
       </w:pPr>
       <w:rPr>
-        <w:rFonts w:ascii="Arial" w:eastAsia="Arial" w:hAnsi="Arial" w:cs="Arial"/>
         <w:b/>
         <w:bCs/>
         <w:color w:val="FFFFFF" w:themeColor="background1"/>
@@ -4373,7 +4315,6 @@
         <w:spacing w:before="0" w:after="0" w:line="240" w:lineRule="auto"/>
       </w:pPr>
       <w:rPr>
-        <w:rFonts w:ascii="Arial" w:eastAsia="Arial" w:hAnsi="Arial" w:cs="Arial"/>
         <w:b/>
         <w:bCs/>
       </w:rPr>
@@ -4391,14 +4332,12 @@
     </w:tblStylePr>
     <w:tblStylePr w:type="firstCol">
       <w:rPr>
-        <w:rFonts w:ascii="Arial" w:eastAsia="Arial" w:hAnsi="Arial" w:cs="Arial"/>
         <w:b/>
         <w:bCs/>
       </w:rPr>
     </w:tblStylePr>
     <w:tblStylePr w:type="lastCol">
       <w:rPr>
-        <w:rFonts w:ascii="Arial" w:eastAsia="Arial" w:hAnsi="Arial" w:cs="Arial"/>
         <w:b/>
         <w:bCs/>
       </w:rPr>
@@ -4453,7 +4392,6 @@
         <w:spacing w:before="0" w:after="0" w:line="240" w:lineRule="auto"/>
       </w:pPr>
       <w:rPr>
-        <w:rFonts w:ascii="Arial" w:eastAsia="Arial" w:hAnsi="Arial" w:cs="Arial"/>
         <w:b/>
         <w:bCs/>
         <w:color w:val="FFFFFF" w:themeColor="background1"/>
@@ -4476,7 +4414,6 @@
         <w:spacing w:before="0" w:after="0" w:line="240" w:lineRule="auto"/>
       </w:pPr>
       <w:rPr>
-        <w:rFonts w:ascii="Arial" w:eastAsia="Arial" w:hAnsi="Arial" w:cs="Arial"/>
         <w:b/>
         <w:bCs/>
       </w:rPr>
@@ -4494,14 +4431,12 @@
     </w:tblStylePr>
     <w:tblStylePr w:type="firstCol">
       <w:rPr>
-        <w:rFonts w:ascii="Arial" w:eastAsia="Arial" w:hAnsi="Arial" w:cs="Arial"/>
         <w:b/>
         <w:bCs/>
       </w:rPr>
     </w:tblStylePr>
     <w:tblStylePr w:type="lastCol">
       <w:rPr>
-        <w:rFonts w:ascii="Arial" w:eastAsia="Arial" w:hAnsi="Arial" w:cs="Arial"/>
         <w:b/>
         <w:bCs/>
       </w:rPr>
@@ -4556,7 +4491,6 @@
         <w:spacing w:before="0" w:after="0" w:line="240" w:lineRule="auto"/>
       </w:pPr>
       <w:rPr>
-        <w:rFonts w:ascii="Arial" w:eastAsia="Arial" w:hAnsi="Arial" w:cs="Arial"/>
         <w:b/>
         <w:bCs/>
         <w:color w:val="FFFFFF" w:themeColor="background1"/>
@@ -4579,7 +4513,6 @@
         <w:spacing w:before="0" w:after="0" w:line="240" w:lineRule="auto"/>
       </w:pPr>
       <w:rPr>
-        <w:rFonts w:ascii="Arial" w:eastAsia="Arial" w:hAnsi="Arial" w:cs="Arial"/>
         <w:b/>
         <w:bCs/>
       </w:rPr>
@@ -4597,14 +4530,12 @@
     </w:tblStylePr>
     <w:tblStylePr w:type="firstCol">
       <w:rPr>
-        <w:rFonts w:ascii="Arial" w:eastAsia="Arial" w:hAnsi="Arial" w:cs="Arial"/>
         <w:b/>
         <w:bCs/>
       </w:rPr>
     </w:tblStylePr>
     <w:tblStylePr w:type="lastCol">
       <w:rPr>
-        <w:rFonts w:ascii="Arial" w:eastAsia="Arial" w:hAnsi="Arial" w:cs="Arial"/>
         <w:b/>
         <w:bCs/>
       </w:rPr>
@@ -4659,7 +4590,6 @@
         <w:spacing w:before="0" w:after="0" w:line="240" w:lineRule="auto"/>
       </w:pPr>
       <w:rPr>
-        <w:rFonts w:ascii="Arial" w:eastAsia="Arial" w:hAnsi="Arial" w:cs="Arial"/>
         <w:b/>
         <w:bCs/>
         <w:color w:val="FFFFFF" w:themeColor="background1"/>
@@ -4682,7 +4612,6 @@
         <w:spacing w:before="0" w:after="0" w:line="240" w:lineRule="auto"/>
       </w:pPr>
       <w:rPr>
-        <w:rFonts w:ascii="Arial" w:eastAsia="Arial" w:hAnsi="Arial" w:cs="Arial"/>
         <w:b/>
         <w:bCs/>
       </w:rPr>
@@ -4700,14 +4629,12 @@
     </w:tblStylePr>
     <w:tblStylePr w:type="firstCol">
       <w:rPr>
-        <w:rFonts w:ascii="Arial" w:eastAsia="Arial" w:hAnsi="Arial" w:cs="Arial"/>
         <w:b/>
         <w:bCs/>
       </w:rPr>
     </w:tblStylePr>
     <w:tblStylePr w:type="lastCol">
       <w:rPr>
-        <w:rFonts w:ascii="Arial" w:eastAsia="Arial" w:hAnsi="Arial" w:cs="Arial"/>
         <w:b/>
         <w:bCs/>
       </w:rPr>
@@ -4762,7 +4689,6 @@
         <w:spacing w:before="0" w:after="0" w:line="240" w:lineRule="auto"/>
       </w:pPr>
       <w:rPr>
-        <w:rFonts w:ascii="Arial" w:eastAsia="Arial" w:hAnsi="Arial" w:cs="Arial"/>
         <w:b/>
         <w:bCs/>
         <w:color w:val="FFFFFF" w:themeColor="background1"/>
@@ -4785,7 +4711,6 @@
         <w:spacing w:before="0" w:after="0" w:line="240" w:lineRule="auto"/>
       </w:pPr>
       <w:rPr>
-        <w:rFonts w:ascii="Arial" w:eastAsia="Arial" w:hAnsi="Arial" w:cs="Arial"/>
         <w:b/>
         <w:bCs/>
       </w:rPr>
@@ -4803,14 +4728,12 @@
     </w:tblStylePr>
     <w:tblStylePr w:type="firstCol">
       <w:rPr>
-        <w:rFonts w:ascii="Arial" w:eastAsia="Arial" w:hAnsi="Arial" w:cs="Arial"/>
         <w:b/>
         <w:bCs/>
       </w:rPr>
     </w:tblStylePr>
     <w:tblStylePr w:type="lastCol">
       <w:rPr>
-        <w:rFonts w:ascii="Arial" w:eastAsia="Arial" w:hAnsi="Arial" w:cs="Arial"/>
         <w:b/>
         <w:bCs/>
       </w:rPr>
@@ -4865,7 +4788,6 @@
         <w:spacing w:before="0" w:after="0" w:line="240" w:lineRule="auto"/>
       </w:pPr>
       <w:rPr>
-        <w:rFonts w:ascii="Arial" w:eastAsia="Arial" w:hAnsi="Arial" w:cs="Arial"/>
         <w:b/>
         <w:bCs/>
         <w:color w:val="FFFFFF" w:themeColor="background1"/>
@@ -4888,7 +4810,6 @@
         <w:spacing w:before="0" w:after="0" w:line="240" w:lineRule="auto"/>
       </w:pPr>
       <w:rPr>
-        <w:rFonts w:ascii="Arial" w:eastAsia="Arial" w:hAnsi="Arial" w:cs="Arial"/>
         <w:b/>
         <w:bCs/>
       </w:rPr>
@@ -4906,14 +4827,12 @@
     </w:tblStylePr>
     <w:tblStylePr w:type="firstCol">
       <w:rPr>
-        <w:rFonts w:ascii="Arial" w:eastAsia="Arial" w:hAnsi="Arial" w:cs="Arial"/>
         <w:b/>
         <w:bCs/>
       </w:rPr>
     </w:tblStylePr>
     <w:tblStylePr w:type="lastCol">
       <w:rPr>
-        <w:rFonts w:ascii="Arial" w:eastAsia="Arial" w:hAnsi="Arial" w:cs="Arial"/>
         <w:b/>
         <w:bCs/>
       </w:rPr>
@@ -4968,7 +4887,6 @@
         <w:spacing w:before="0" w:after="0" w:line="240" w:lineRule="auto"/>
       </w:pPr>
       <w:rPr>
-        <w:rFonts w:ascii="Arial" w:eastAsia="Arial" w:hAnsi="Arial" w:cs="Arial"/>
         <w:b/>
         <w:bCs/>
         <w:color w:val="FFFFFF" w:themeColor="background1"/>
@@ -4991,7 +4909,6 @@
         <w:spacing w:before="0" w:after="0" w:line="240" w:lineRule="auto"/>
       </w:pPr>
       <w:rPr>
-        <w:rFonts w:ascii="Arial" w:eastAsia="Arial" w:hAnsi="Arial" w:cs="Arial"/>
         <w:b/>
         <w:bCs/>
       </w:rPr>
@@ -5009,14 +4926,12 @@
     </w:tblStylePr>
     <w:tblStylePr w:type="firstCol">
       <w:rPr>
-        <w:rFonts w:ascii="Arial" w:eastAsia="Arial" w:hAnsi="Arial" w:cs="Arial"/>
         <w:b/>
         <w:bCs/>
       </w:rPr>
     </w:tblStylePr>
     <w:tblStylePr w:type="lastCol">
       <w:rPr>
-        <w:rFonts w:ascii="Arial" w:eastAsia="Arial" w:hAnsi="Arial" w:cs="Arial"/>
         <w:b/>
         <w:bCs/>
       </w:rPr>
@@ -5068,7 +4983,6 @@
         <w:spacing w:before="0" w:after="0" w:line="240" w:lineRule="auto"/>
       </w:pPr>
       <w:rPr>
-        <w:rFonts w:ascii="Arial" w:eastAsia="Arial" w:hAnsi="Arial" w:cs="Arial"/>
         <w:b/>
         <w:bCs/>
         <w:color w:val="FFFFFF" w:themeColor="background1"/>
@@ -5091,7 +5005,6 @@
         <w:spacing w:before="0" w:after="0" w:line="240" w:lineRule="auto"/>
       </w:pPr>
       <w:rPr>
-        <w:rFonts w:ascii="Arial" w:eastAsia="Arial" w:hAnsi="Arial" w:cs="Arial"/>
         <w:color w:val="auto"/>
       </w:rPr>
       <w:tblPr/>
@@ -5109,7 +5022,6 @@
     </w:tblStylePr>
     <w:tblStylePr w:type="firstCol">
       <w:rPr>
-        <w:rFonts w:ascii="Arial" w:eastAsia="Arial" w:hAnsi="Arial" w:cs="Arial"/>
         <w:b/>
         <w:bCs/>
         <w:color w:val="FFFFFF" w:themeColor="background1"/>
@@ -5129,7 +5041,6 @@
     </w:tblStylePr>
     <w:tblStylePr w:type="lastCol">
       <w:rPr>
-        <w:rFonts w:ascii="Arial" w:eastAsia="Arial" w:hAnsi="Arial" w:cs="Arial"/>
         <w:b/>
         <w:bCs/>
         <w:color w:val="FFFFFF" w:themeColor="background1"/>
@@ -5178,7 +5089,6 @@
     </w:tblStylePr>
     <w:tblStylePr w:type="nwCell">
       <w:rPr>
-        <w:rFonts w:ascii="Arial" w:eastAsia="Arial" w:hAnsi="Arial" w:cs="Arial"/>
         <w:color w:val="FFFFFF" w:themeColor="background1"/>
       </w:rPr>
       <w:tblPr/>
@@ -5215,7 +5125,6 @@
         <w:spacing w:before="0" w:after="0" w:line="240" w:lineRule="auto"/>
       </w:pPr>
       <w:rPr>
-        <w:rFonts w:ascii="Arial" w:eastAsia="Arial" w:hAnsi="Arial" w:cs="Arial"/>
         <w:b/>
         <w:bCs/>
         <w:color w:val="FFFFFF" w:themeColor="background1"/>
@@ -5238,7 +5147,6 @@
         <w:spacing w:before="0" w:after="0" w:line="240" w:lineRule="auto"/>
       </w:pPr>
       <w:rPr>
-        <w:rFonts w:ascii="Arial" w:eastAsia="Arial" w:hAnsi="Arial" w:cs="Arial"/>
         <w:color w:val="auto"/>
       </w:rPr>
       <w:tblPr/>
@@ -5256,7 +5164,6 @@
     </w:tblStylePr>
     <w:tblStylePr w:type="firstCol">
       <w:rPr>
-        <w:rFonts w:ascii="Arial" w:eastAsia="Arial" w:hAnsi="Arial" w:cs="Arial"/>
         <w:b/>
         <w:bCs/>
         <w:color w:val="FFFFFF" w:themeColor="background1"/>
@@ -5276,7 +5183,6 @@
     </w:tblStylePr>
     <w:tblStylePr w:type="lastCol">
       <w:rPr>
-        <w:rFonts w:ascii="Arial" w:eastAsia="Arial" w:hAnsi="Arial" w:cs="Arial"/>
         <w:b/>
         <w:bCs/>
         <w:color w:val="FFFFFF" w:themeColor="background1"/>
@@ -5325,7 +5231,6 @@
     </w:tblStylePr>
     <w:tblStylePr w:type="nwCell">
       <w:rPr>
-        <w:rFonts w:ascii="Arial" w:eastAsia="Arial" w:hAnsi="Arial" w:cs="Arial"/>
         <w:color w:val="FFFFFF" w:themeColor="background1"/>
       </w:rPr>
       <w:tblPr/>
@@ -5362,7 +5267,6 @@
         <w:spacing w:before="0" w:after="0" w:line="240" w:lineRule="auto"/>
       </w:pPr>
       <w:rPr>
-        <w:rFonts w:ascii="Arial" w:eastAsia="Arial" w:hAnsi="Arial" w:cs="Arial"/>
         <w:b/>
         <w:bCs/>
         <w:color w:val="FFFFFF" w:themeColor="background1"/>
@@ -5385,7 +5289,6 @@
         <w:spacing w:before="0" w:after="0" w:line="240" w:lineRule="auto"/>
       </w:pPr>
       <w:rPr>
-        <w:rFonts w:ascii="Arial" w:eastAsia="Arial" w:hAnsi="Arial" w:cs="Arial"/>
         <w:color w:val="auto"/>
       </w:rPr>
       <w:tblPr/>
@@ -5403,7 +5306,6 @@
     </w:tblStylePr>
     <w:tblStylePr w:type="firstCol">
       <w:rPr>
-        <w:rFonts w:ascii="Arial" w:eastAsia="Arial" w:hAnsi="Arial" w:cs="Arial"/>
         <w:b/>
         <w:bCs/>
         <w:color w:val="FFFFFF" w:themeColor="background1"/>
@@ -5423,7 +5325,6 @@
     </w:tblStylePr>
     <w:tblStylePr w:type="lastCol">
       <w:rPr>
-        <w:rFonts w:ascii="Arial" w:eastAsia="Arial" w:hAnsi="Arial" w:cs="Arial"/>
         <w:b/>
         <w:bCs/>
         <w:color w:val="FFFFFF" w:themeColor="background1"/>
@@ -5472,7 +5373,6 @@
     </w:tblStylePr>
     <w:tblStylePr w:type="nwCell">
       <w:rPr>
-        <w:rFonts w:ascii="Arial" w:eastAsia="Arial" w:hAnsi="Arial" w:cs="Arial"/>
         <w:color w:val="FFFFFF" w:themeColor="background1"/>
       </w:rPr>
       <w:tblPr/>
@@ -5509,7 +5409,6 @@
         <w:spacing w:before="0" w:after="0" w:line="240" w:lineRule="auto"/>
       </w:pPr>
       <w:rPr>
-        <w:rFonts w:ascii="Arial" w:eastAsia="Arial" w:hAnsi="Arial" w:cs="Arial"/>
         <w:b/>
         <w:bCs/>
         <w:color w:val="FFFFFF" w:themeColor="background1"/>
@@ -5532,7 +5431,6 @@
         <w:spacing w:before="0" w:after="0" w:line="240" w:lineRule="auto"/>
       </w:pPr>
       <w:rPr>
-        <w:rFonts w:ascii="Arial" w:eastAsia="Arial" w:hAnsi="Arial" w:cs="Arial"/>
         <w:color w:val="auto"/>
       </w:rPr>
       <w:tblPr/>
@@ -5550,7 +5448,6 @@
     </w:tblStylePr>
     <w:tblStylePr w:type="firstCol">
       <w:rPr>
-        <w:rFonts w:ascii="Arial" w:eastAsia="Arial" w:hAnsi="Arial" w:cs="Arial"/>
         <w:b/>
         <w:bCs/>
         <w:color w:val="FFFFFF" w:themeColor="background1"/>
@@ -5570,7 +5467,6 @@
     </w:tblStylePr>
     <w:tblStylePr w:type="lastCol">
       <w:rPr>
-        <w:rFonts w:ascii="Arial" w:eastAsia="Arial" w:hAnsi="Arial" w:cs="Arial"/>
         <w:b/>
         <w:bCs/>
         <w:color w:val="FFFFFF" w:themeColor="background1"/>
@@ -5619,7 +5515,6 @@
     </w:tblStylePr>
     <w:tblStylePr w:type="nwCell">
       <w:rPr>
-        <w:rFonts w:ascii="Arial" w:eastAsia="Arial" w:hAnsi="Arial" w:cs="Arial"/>
         <w:color w:val="FFFFFF" w:themeColor="background1"/>
       </w:rPr>
       <w:tblPr/>
@@ -5656,7 +5551,6 @@
         <w:spacing w:before="0" w:after="0" w:line="240" w:lineRule="auto"/>
       </w:pPr>
       <w:rPr>
-        <w:rFonts w:ascii="Arial" w:eastAsia="Arial" w:hAnsi="Arial" w:cs="Arial"/>
         <w:b/>
         <w:bCs/>
         <w:color w:val="FFFFFF" w:themeColor="background1"/>
@@ -5679,7 +5573,6 @@
         <w:spacing w:before="0" w:after="0" w:line="240" w:lineRule="auto"/>
       </w:pPr>
       <w:rPr>
-        <w:rFonts w:ascii="Arial" w:eastAsia="Arial" w:hAnsi="Arial" w:cs="Arial"/>
         <w:color w:val="auto"/>
       </w:rPr>
       <w:tblPr/>
@@ -5697,7 +5590,6 @@
     </w:tblStylePr>
     <w:tblStylePr w:type="firstCol">
       <w:rPr>
-        <w:rFonts w:ascii="Arial" w:eastAsia="Arial" w:hAnsi="Arial" w:cs="Arial"/>
         <w:b/>
         <w:bCs/>
         <w:color w:val="FFFFFF" w:themeColor="background1"/>
@@ -5717,7 +5609,6 @@
     </w:tblStylePr>
     <w:tblStylePr w:type="lastCol">
       <w:rPr>
-        <w:rFonts w:ascii="Arial" w:eastAsia="Arial" w:hAnsi="Arial" w:cs="Arial"/>
         <w:b/>
         <w:bCs/>
         <w:color w:val="FFFFFF" w:themeColor="background1"/>
@@ -5766,7 +5657,6 @@
     </w:tblStylePr>
     <w:tblStylePr w:type="nwCell">
       <w:rPr>
-        <w:rFonts w:ascii="Arial" w:eastAsia="Arial" w:hAnsi="Arial" w:cs="Arial"/>
         <w:color w:val="FFFFFF" w:themeColor="background1"/>
       </w:rPr>
       <w:tblPr/>
@@ -5803,7 +5693,6 @@
         <w:spacing w:before="0" w:after="0" w:line="240" w:lineRule="auto"/>
       </w:pPr>
       <w:rPr>
-        <w:rFonts w:ascii="Arial" w:eastAsia="Arial" w:hAnsi="Arial" w:cs="Arial"/>
         <w:b/>
         <w:bCs/>
         <w:color w:val="FFFFFF" w:themeColor="background1"/>
@@ -5826,7 +5715,6 @@
         <w:spacing w:before="0" w:after="0" w:line="240" w:lineRule="auto"/>
       </w:pPr>
       <w:rPr>
-        <w:rFonts w:ascii="Arial" w:eastAsia="Arial" w:hAnsi="Arial" w:cs="Arial"/>
         <w:color w:val="auto"/>
       </w:rPr>
       <w:tblPr/>
@@ -5844,7 +5732,6 @@
     </w:tblStylePr>
     <w:tblStylePr w:type="firstCol">
       <w:rPr>
-        <w:rFonts w:ascii="Arial" w:eastAsia="Arial" w:hAnsi="Arial" w:cs="Arial"/>
         <w:b/>
         <w:bCs/>
         <w:color w:val="FFFFFF" w:themeColor="background1"/>
@@ -5864,7 +5751,6 @@
     </w:tblStylePr>
     <w:tblStylePr w:type="lastCol">
       <w:rPr>
-        <w:rFonts w:ascii="Arial" w:eastAsia="Arial" w:hAnsi="Arial" w:cs="Arial"/>
         <w:b/>
         <w:bCs/>
         <w:color w:val="FFFFFF" w:themeColor="background1"/>
@@ -5913,7 +5799,6 @@
     </w:tblStylePr>
     <w:tblStylePr w:type="nwCell">
       <w:rPr>
-        <w:rFonts w:ascii="Arial" w:eastAsia="Arial" w:hAnsi="Arial" w:cs="Arial"/>
         <w:color w:val="FFFFFF" w:themeColor="background1"/>
       </w:rPr>
       <w:tblPr/>
@@ -5950,7 +5835,6 @@
         <w:spacing w:before="0" w:after="0" w:line="240" w:lineRule="auto"/>
       </w:pPr>
       <w:rPr>
-        <w:rFonts w:ascii="Arial" w:eastAsia="Arial" w:hAnsi="Arial" w:cs="Arial"/>
         <w:b/>
         <w:bCs/>
         <w:color w:val="FFFFFF" w:themeColor="background1"/>
@@ -5973,7 +5857,6 @@
         <w:spacing w:before="0" w:after="0" w:line="240" w:lineRule="auto"/>
       </w:pPr>
       <w:rPr>
-        <w:rFonts w:ascii="Arial" w:eastAsia="Arial" w:hAnsi="Arial" w:cs="Arial"/>
         <w:color w:val="auto"/>
       </w:rPr>
       <w:tblPr/>
@@ -5991,7 +5874,6 @@
     </w:tblStylePr>
     <w:tblStylePr w:type="firstCol">
       <w:rPr>
-        <w:rFonts w:ascii="Arial" w:eastAsia="Arial" w:hAnsi="Arial" w:cs="Arial"/>
         <w:b/>
         <w:bCs/>
         <w:color w:val="FFFFFF" w:themeColor="background1"/>
@@ -6011,7 +5893,6 @@
     </w:tblStylePr>
     <w:tblStylePr w:type="lastCol">
       <w:rPr>
-        <w:rFonts w:ascii="Arial" w:eastAsia="Arial" w:hAnsi="Arial" w:cs="Arial"/>
         <w:b/>
         <w:bCs/>
         <w:color w:val="FFFFFF" w:themeColor="background1"/>
@@ -6060,7 +5941,6 @@
     </w:tblStylePr>
     <w:tblStylePr w:type="nwCell">
       <w:rPr>
-        <w:rFonts w:ascii="Arial" w:eastAsia="Arial" w:hAnsi="Arial" w:cs="Arial"/>
         <w:color w:val="FFFFFF" w:themeColor="background1"/>
       </w:rPr>
       <w:tblPr/>
@@ -6097,7 +5977,7 @@
     </w:tblPr>
     <w:tblStylePr w:type="firstRow">
       <w:rPr>
-        <w:rFonts w:ascii="Arial" w:eastAsia="Arial" w:hAnsi="Arial" w:cs="Arial"/>
+        <w:rFonts w:asciiTheme="majorHAnsi" w:eastAsiaTheme="majorEastAsia" w:hAnsiTheme="majorHAnsi" w:cstheme="majorBidi"/>
       </w:rPr>
       <w:tblPr/>
       <w:tcPr>
@@ -6109,7 +5989,6 @@
     </w:tblStylePr>
     <w:tblStylePr w:type="lastRow">
       <w:rPr>
-        <w:rFonts w:ascii="Arial" w:eastAsia="Arial" w:hAnsi="Arial" w:cs="Arial"/>
         <w:b/>
         <w:bCs/>
         <w:color w:val="1F497D" w:themeColor="text2"/>
@@ -6124,14 +6003,12 @@
     </w:tblStylePr>
     <w:tblStylePr w:type="firstCol">
       <w:rPr>
-        <w:rFonts w:ascii="Arial" w:eastAsia="Arial" w:hAnsi="Arial" w:cs="Arial"/>
         <w:b/>
         <w:bCs/>
       </w:rPr>
     </w:tblStylePr>
     <w:tblStylePr w:type="lastCol">
       <w:rPr>
-        <w:rFonts w:ascii="Arial" w:eastAsia="Arial" w:hAnsi="Arial" w:cs="Arial"/>
         <w:b/>
         <w:bCs/>
       </w:rPr>
@@ -6177,7 +6054,7 @@
     </w:tblPr>
     <w:tblStylePr w:type="firstRow">
       <w:rPr>
-        <w:rFonts w:ascii="Arial" w:eastAsia="Arial" w:hAnsi="Arial" w:cs="Arial"/>
+        <w:rFonts w:asciiTheme="majorHAnsi" w:eastAsiaTheme="majorEastAsia" w:hAnsiTheme="majorHAnsi" w:cstheme="majorBidi"/>
       </w:rPr>
       <w:tblPr/>
       <w:tcPr>
@@ -6189,7 +6066,6 @@
     </w:tblStylePr>
     <w:tblStylePr w:type="lastRow">
       <w:rPr>
-        <w:rFonts w:ascii="Arial" w:eastAsia="Arial" w:hAnsi="Arial" w:cs="Arial"/>
         <w:b/>
         <w:bCs/>
         <w:color w:val="1F497D" w:themeColor="text2"/>
@@ -6204,14 +6080,12 @@
     </w:tblStylePr>
     <w:tblStylePr w:type="firstCol">
       <w:rPr>
-        <w:rFonts w:ascii="Arial" w:eastAsia="Arial" w:hAnsi="Arial" w:cs="Arial"/>
         <w:b/>
         <w:bCs/>
       </w:rPr>
     </w:tblStylePr>
     <w:tblStylePr w:type="lastCol">
       <w:rPr>
-        <w:rFonts w:ascii="Arial" w:eastAsia="Arial" w:hAnsi="Arial" w:cs="Arial"/>
         <w:b/>
         <w:bCs/>
       </w:rPr>
@@ -6257,7 +6131,7 @@
     </w:tblPr>
     <w:tblStylePr w:type="firstRow">
       <w:rPr>
-        <w:rFonts w:ascii="Arial" w:eastAsia="Arial" w:hAnsi="Arial" w:cs="Arial"/>
+        <w:rFonts w:asciiTheme="majorHAnsi" w:eastAsiaTheme="majorEastAsia" w:hAnsiTheme="majorHAnsi" w:cstheme="majorBidi"/>
       </w:rPr>
       <w:tblPr/>
       <w:tcPr>
@@ -6269,7 +6143,6 @@
     </w:tblStylePr>
     <w:tblStylePr w:type="lastRow">
       <w:rPr>
-        <w:rFonts w:ascii="Arial" w:eastAsia="Arial" w:hAnsi="Arial" w:cs="Arial"/>
         <w:b/>
         <w:bCs/>
         <w:color w:val="1F497D" w:themeColor="text2"/>
@@ -6284,14 +6157,12 @@
     </w:tblStylePr>
     <w:tblStylePr w:type="firstCol">
       <w:rPr>
-        <w:rFonts w:ascii="Arial" w:eastAsia="Arial" w:hAnsi="Arial" w:cs="Arial"/>
         <w:b/>
         <w:bCs/>
       </w:rPr>
     </w:tblStylePr>
     <w:tblStylePr w:type="lastCol">
       <w:rPr>
-        <w:rFonts w:ascii="Arial" w:eastAsia="Arial" w:hAnsi="Arial" w:cs="Arial"/>
         <w:b/>
         <w:bCs/>
       </w:rPr>
@@ -6337,7 +6208,7 @@
     </w:tblPr>
     <w:tblStylePr w:type="firstRow">
       <w:rPr>
-        <w:rFonts w:ascii="Arial" w:eastAsia="Arial" w:hAnsi="Arial" w:cs="Arial"/>
+        <w:rFonts w:asciiTheme="majorHAnsi" w:eastAsiaTheme="majorEastAsia" w:hAnsiTheme="majorHAnsi" w:cstheme="majorBidi"/>
       </w:rPr>
       <w:tblPr/>
       <w:tcPr>
@@ -6349,7 +6220,6 @@
     </w:tblStylePr>
     <w:tblStylePr w:type="lastRow">
       <w:rPr>
-        <w:rFonts w:ascii="Arial" w:eastAsia="Arial" w:hAnsi="Arial" w:cs="Arial"/>
         <w:b/>
         <w:bCs/>
         <w:color w:val="1F497D" w:themeColor="text2"/>
@@ -6364,14 +6234,12 @@
     </w:tblStylePr>
     <w:tblStylePr w:type="firstCol">
       <w:rPr>
-        <w:rFonts w:ascii="Arial" w:eastAsia="Arial" w:hAnsi="Arial" w:cs="Arial"/>
         <w:b/>
         <w:bCs/>
       </w:rPr>
     </w:tblStylePr>
     <w:tblStylePr w:type="lastCol">
       <w:rPr>
-        <w:rFonts w:ascii="Arial" w:eastAsia="Arial" w:hAnsi="Arial" w:cs="Arial"/>
         <w:b/>
         <w:bCs/>
       </w:rPr>
@@ -6417,7 +6285,7 @@
     </w:tblPr>
     <w:tblStylePr w:type="firstRow">
       <w:rPr>
-        <w:rFonts w:ascii="Arial" w:eastAsia="Arial" w:hAnsi="Arial" w:cs="Arial"/>
+        <w:rFonts w:asciiTheme="majorHAnsi" w:eastAsiaTheme="majorEastAsia" w:hAnsiTheme="majorHAnsi" w:cstheme="majorBidi"/>
       </w:rPr>
       <w:tblPr/>
       <w:tcPr>
@@ -6429,7 +6297,6 @@
     </w:tblStylePr>
     <w:tblStylePr w:type="lastRow">
       <w:rPr>
-        <w:rFonts w:ascii="Arial" w:eastAsia="Arial" w:hAnsi="Arial" w:cs="Arial"/>
         <w:b/>
         <w:bCs/>
         <w:color w:val="1F497D" w:themeColor="text2"/>
@@ -6444,14 +6311,12 @@
     </w:tblStylePr>
     <w:tblStylePr w:type="firstCol">
       <w:rPr>
-        <w:rFonts w:ascii="Arial" w:eastAsia="Arial" w:hAnsi="Arial" w:cs="Arial"/>
         <w:b/>
         <w:bCs/>
       </w:rPr>
     </w:tblStylePr>
     <w:tblStylePr w:type="lastCol">
       <w:rPr>
-        <w:rFonts w:ascii="Arial" w:eastAsia="Arial" w:hAnsi="Arial" w:cs="Arial"/>
         <w:b/>
         <w:bCs/>
       </w:rPr>
@@ -6497,7 +6362,7 @@
     </w:tblPr>
     <w:tblStylePr w:type="firstRow">
       <w:rPr>
-        <w:rFonts w:ascii="Arial" w:eastAsia="Arial" w:hAnsi="Arial" w:cs="Arial"/>
+        <w:rFonts w:asciiTheme="majorHAnsi" w:eastAsiaTheme="majorEastAsia" w:hAnsiTheme="majorHAnsi" w:cstheme="majorBidi"/>
       </w:rPr>
       <w:tblPr/>
       <w:tcPr>
@@ -6509,7 +6374,6 @@
     </w:tblStylePr>
     <w:tblStylePr w:type="lastRow">
       <w:rPr>
-        <w:rFonts w:ascii="Arial" w:eastAsia="Arial" w:hAnsi="Arial" w:cs="Arial"/>
         <w:b/>
         <w:bCs/>
         <w:color w:val="1F497D" w:themeColor="text2"/>
@@ -6524,14 +6388,12 @@
     </w:tblStylePr>
     <w:tblStylePr w:type="firstCol">
       <w:rPr>
-        <w:rFonts w:ascii="Arial" w:eastAsia="Arial" w:hAnsi="Arial" w:cs="Arial"/>
         <w:b/>
         <w:bCs/>
       </w:rPr>
     </w:tblStylePr>
     <w:tblStylePr w:type="lastCol">
       <w:rPr>
-        <w:rFonts w:ascii="Arial" w:eastAsia="Arial" w:hAnsi="Arial" w:cs="Arial"/>
         <w:b/>
         <w:bCs/>
       </w:rPr>
@@ -6577,7 +6439,7 @@
     </w:tblPr>
     <w:tblStylePr w:type="firstRow">
       <w:rPr>
-        <w:rFonts w:ascii="Arial" w:eastAsia="Arial" w:hAnsi="Arial" w:cs="Arial"/>
+        <w:rFonts w:asciiTheme="majorHAnsi" w:eastAsiaTheme="majorEastAsia" w:hAnsiTheme="majorHAnsi" w:cstheme="majorBidi"/>
       </w:rPr>
       <w:tblPr/>
       <w:tcPr>
@@ -6589,7 +6451,6 @@
     </w:tblStylePr>
     <w:tblStylePr w:type="lastRow">
       <w:rPr>
-        <w:rFonts w:ascii="Arial" w:eastAsia="Arial" w:hAnsi="Arial" w:cs="Arial"/>
         <w:b/>
         <w:bCs/>
         <w:color w:val="1F497D" w:themeColor="text2"/>
@@ -6604,14 +6465,12 @@
     </w:tblStylePr>
     <w:tblStylePr w:type="firstCol">
       <w:rPr>
-        <w:rFonts w:ascii="Arial" w:eastAsia="Arial" w:hAnsi="Arial" w:cs="Arial"/>
         <w:b/>
         <w:bCs/>
       </w:rPr>
     </w:tblStylePr>
     <w:tblStylePr w:type="lastCol">
       <w:rPr>
-        <w:rFonts w:ascii="Arial" w:eastAsia="Arial" w:hAnsi="Arial" w:cs="Arial"/>
         <w:b/>
         <w:bCs/>
       </w:rPr>
@@ -6645,6 +6504,7 @@
       <w:spacing w:after="0" w:line="240" w:lineRule="auto"/>
     </w:pPr>
     <w:rPr>
+      <w:rFonts w:asciiTheme="majorHAnsi" w:eastAsiaTheme="majorEastAsia" w:hAnsiTheme="majorHAnsi" w:cstheme="majorBidi"/>
       <w:color w:val="000000" w:themeColor="text1"/>
     </w:rPr>
     <w:tblPr>
@@ -6659,7 +6519,6 @@
     </w:tblPr>
     <w:tblStylePr w:type="firstRow">
       <w:rPr>
-        <w:rFonts w:ascii="Arial" w:eastAsia="Arial" w:hAnsi="Arial" w:cs="Arial"/>
         <w:sz w:val="24"/>
         <w:szCs w:val="24"/>
       </w:rPr>
@@ -6766,6 +6625,7 @@
       <w:spacing w:after="0" w:line="240" w:lineRule="auto"/>
     </w:pPr>
     <w:rPr>
+      <w:rFonts w:asciiTheme="majorHAnsi" w:eastAsiaTheme="majorEastAsia" w:hAnsiTheme="majorHAnsi" w:cstheme="majorBidi"/>
       <w:color w:val="000000" w:themeColor="text1"/>
     </w:rPr>
     <w:tblPr>
@@ -6780,7 +6640,6 @@
     </w:tblPr>
     <w:tblStylePr w:type="firstRow">
       <w:rPr>
-        <w:rFonts w:ascii="Arial" w:eastAsia="Arial" w:hAnsi="Arial" w:cs="Arial"/>
         <w:sz w:val="24"/>
         <w:szCs w:val="24"/>
       </w:rPr>
@@ -6887,6 +6746,7 @@
       <w:spacing w:after="0" w:line="240" w:lineRule="auto"/>
     </w:pPr>
     <w:rPr>
+      <w:rFonts w:asciiTheme="majorHAnsi" w:eastAsiaTheme="majorEastAsia" w:hAnsiTheme="majorHAnsi" w:cstheme="majorBidi"/>
       <w:color w:val="000000" w:themeColor="text1"/>
     </w:rPr>
     <w:tblPr>
@@ -6901,7 +6761,6 @@
     </w:tblPr>
     <w:tblStylePr w:type="firstRow">
       <w:rPr>
-        <w:rFonts w:ascii="Arial" w:eastAsia="Arial" w:hAnsi="Arial" w:cs="Arial"/>
         <w:sz w:val="24"/>
         <w:szCs w:val="24"/>
       </w:rPr>
@@ -7008,6 +6867,7 @@
       <w:spacing w:after="0" w:line="240" w:lineRule="auto"/>
     </w:pPr>
     <w:rPr>
+      <w:rFonts w:asciiTheme="majorHAnsi" w:eastAsiaTheme="majorEastAsia" w:hAnsiTheme="majorHAnsi" w:cstheme="majorBidi"/>
       <w:color w:val="000000" w:themeColor="text1"/>
     </w:rPr>
     <w:tblPr>
@@ -7022,7 +6882,6 @@
     </w:tblPr>
     <w:tblStylePr w:type="firstRow">
       <w:rPr>
-        <w:rFonts w:ascii="Arial" w:eastAsia="Arial" w:hAnsi="Arial" w:cs="Arial"/>
         <w:sz w:val="24"/>
         <w:szCs w:val="24"/>
       </w:rPr>
@@ -7129,6 +6988,7 @@
       <w:spacing w:after="0" w:line="240" w:lineRule="auto"/>
     </w:pPr>
     <w:rPr>
+      <w:rFonts w:asciiTheme="majorHAnsi" w:eastAsiaTheme="majorEastAsia" w:hAnsiTheme="majorHAnsi" w:cstheme="majorBidi"/>
       <w:color w:val="000000" w:themeColor="text1"/>
     </w:rPr>
     <w:tblPr>
@@ -7143,7 +7003,6 @@
     </w:tblPr>
     <w:tblStylePr w:type="firstRow">
       <w:rPr>
-        <w:rFonts w:ascii="Arial" w:eastAsia="Arial" w:hAnsi="Arial" w:cs="Arial"/>
         <w:sz w:val="24"/>
         <w:szCs w:val="24"/>
       </w:rPr>
@@ -7250,6 +7109,7 @@
       <w:spacing w:after="0" w:line="240" w:lineRule="auto"/>
     </w:pPr>
     <w:rPr>
+      <w:rFonts w:asciiTheme="majorHAnsi" w:eastAsiaTheme="majorEastAsia" w:hAnsiTheme="majorHAnsi" w:cstheme="majorBidi"/>
       <w:color w:val="000000" w:themeColor="text1"/>
     </w:rPr>
     <w:tblPr>
@@ -7264,7 +7124,6 @@
     </w:tblPr>
     <w:tblStylePr w:type="firstRow">
       <w:rPr>
-        <w:rFonts w:ascii="Arial" w:eastAsia="Arial" w:hAnsi="Arial" w:cs="Arial"/>
         <w:sz w:val="24"/>
         <w:szCs w:val="24"/>
       </w:rPr>
@@ -7371,6 +7230,7 @@
       <w:spacing w:after="0" w:line="240" w:lineRule="auto"/>
     </w:pPr>
     <w:rPr>
+      <w:rFonts w:asciiTheme="majorHAnsi" w:eastAsiaTheme="majorEastAsia" w:hAnsiTheme="majorHAnsi" w:cstheme="majorBidi"/>
       <w:color w:val="000000" w:themeColor="text1"/>
     </w:rPr>
     <w:tblPr>
@@ -7385,7 +7245,6 @@
     </w:tblPr>
     <w:tblStylePr w:type="firstRow">
       <w:rPr>
-        <w:rFonts w:ascii="Arial" w:eastAsia="Arial" w:hAnsi="Arial" w:cs="Arial"/>
         <w:sz w:val="24"/>
         <w:szCs w:val="24"/>
       </w:rPr>
@@ -7508,14 +7367,12 @@
     </w:tcPr>
     <w:tblStylePr w:type="firstRow">
       <w:rPr>
-        <w:rFonts w:ascii="Arial" w:eastAsia="Arial" w:hAnsi="Arial" w:cs="Arial"/>
         <w:b/>
         <w:bCs/>
       </w:rPr>
     </w:tblStylePr>
     <w:tblStylePr w:type="lastRow">
       <w:rPr>
-        <w:rFonts w:ascii="Arial" w:eastAsia="Arial" w:hAnsi="Arial" w:cs="Arial"/>
         <w:b/>
         <w:bCs/>
       </w:rPr>
@@ -7528,14 +7385,12 @@
     </w:tblStylePr>
     <w:tblStylePr w:type="firstCol">
       <w:rPr>
-        <w:rFonts w:ascii="Arial" w:eastAsia="Arial" w:hAnsi="Arial" w:cs="Arial"/>
         <w:b/>
         <w:bCs/>
       </w:rPr>
     </w:tblStylePr>
     <w:tblStylePr w:type="lastCol">
       <w:rPr>
-        <w:rFonts w:ascii="Arial" w:eastAsia="Arial" w:hAnsi="Arial" w:cs="Arial"/>
         <w:b/>
         <w:bCs/>
       </w:rPr>
@@ -7578,14 +7433,12 @@
     </w:tcPr>
     <w:tblStylePr w:type="firstRow">
       <w:rPr>
-        <w:rFonts w:ascii="Arial" w:eastAsia="Arial" w:hAnsi="Arial" w:cs="Arial"/>
         <w:b/>
         <w:bCs/>
       </w:rPr>
     </w:tblStylePr>
     <w:tblStylePr w:type="lastRow">
       <w:rPr>
-        <w:rFonts w:ascii="Arial" w:eastAsia="Arial" w:hAnsi="Arial" w:cs="Arial"/>
         <w:b/>
         <w:bCs/>
       </w:rPr>
@@ -7598,14 +7451,12 @@
     </w:tblStylePr>
     <w:tblStylePr w:type="firstCol">
       <w:rPr>
-        <w:rFonts w:ascii="Arial" w:eastAsia="Arial" w:hAnsi="Arial" w:cs="Arial"/>
         <w:b/>
         <w:bCs/>
       </w:rPr>
     </w:tblStylePr>
     <w:tblStylePr w:type="lastCol">
       <w:rPr>
-        <w:rFonts w:ascii="Arial" w:eastAsia="Arial" w:hAnsi="Arial" w:cs="Arial"/>
         <w:b/>
         <w:bCs/>
       </w:rPr>
@@ -7648,14 +7499,12 @@
     </w:tcPr>
     <w:tblStylePr w:type="firstRow">
       <w:rPr>
-        <w:rFonts w:ascii="Arial" w:eastAsia="Arial" w:hAnsi="Arial" w:cs="Arial"/>
         <w:b/>
         <w:bCs/>
       </w:rPr>
     </w:tblStylePr>
     <w:tblStylePr w:type="lastRow">
       <w:rPr>
-        <w:rFonts w:ascii="Arial" w:eastAsia="Arial" w:hAnsi="Arial" w:cs="Arial"/>
         <w:b/>
         <w:bCs/>
       </w:rPr>
@@ -7668,14 +7517,12 @@
     </w:tblStylePr>
     <w:tblStylePr w:type="firstCol">
       <w:rPr>
-        <w:rFonts w:ascii="Arial" w:eastAsia="Arial" w:hAnsi="Arial" w:cs="Arial"/>
         <w:b/>
         <w:bCs/>
       </w:rPr>
     </w:tblStylePr>
     <w:tblStylePr w:type="lastCol">
       <w:rPr>
-        <w:rFonts w:ascii="Arial" w:eastAsia="Arial" w:hAnsi="Arial" w:cs="Arial"/>
         <w:b/>
         <w:bCs/>
       </w:rPr>
@@ -7718,14 +7565,12 @@
     </w:tcPr>
     <w:tblStylePr w:type="firstRow">
       <w:rPr>
-        <w:rFonts w:ascii="Arial" w:eastAsia="Arial" w:hAnsi="Arial" w:cs="Arial"/>
         <w:b/>
         <w:bCs/>
       </w:rPr>
     </w:tblStylePr>
     <w:tblStylePr w:type="lastRow">
       <w:rPr>
-        <w:rFonts w:ascii="Arial" w:eastAsia="Arial" w:hAnsi="Arial" w:cs="Arial"/>
         <w:b/>
         <w:bCs/>
       </w:rPr>
@@ -7738,14 +7583,12 @@
     </w:tblStylePr>
     <w:tblStylePr w:type="firstCol">
       <w:rPr>
-        <w:rFonts w:ascii="Arial" w:eastAsia="Arial" w:hAnsi="Arial" w:cs="Arial"/>
         <w:b/>
         <w:bCs/>
       </w:rPr>
     </w:tblStylePr>
     <w:tblStylePr w:type="lastCol">
       <w:rPr>
-        <w:rFonts w:ascii="Arial" w:eastAsia="Arial" w:hAnsi="Arial" w:cs="Arial"/>
         <w:b/>
         <w:bCs/>
       </w:rPr>
@@ -7788,14 +7631,12 @@
     </w:tcPr>
     <w:tblStylePr w:type="firstRow">
       <w:rPr>
-        <w:rFonts w:ascii="Arial" w:eastAsia="Arial" w:hAnsi="Arial" w:cs="Arial"/>
         <w:b/>
         <w:bCs/>
       </w:rPr>
     </w:tblStylePr>
     <w:tblStylePr w:type="lastRow">
       <w:rPr>
-        <w:rFonts w:ascii="Arial" w:eastAsia="Arial" w:hAnsi="Arial" w:cs="Arial"/>
         <w:b/>
         <w:bCs/>
       </w:rPr>
@@ -7808,14 +7649,12 @@
     </w:tblStylePr>
     <w:tblStylePr w:type="firstCol">
       <w:rPr>
-        <w:rFonts w:ascii="Arial" w:eastAsia="Arial" w:hAnsi="Arial" w:cs="Arial"/>
         <w:b/>
         <w:bCs/>
       </w:rPr>
     </w:tblStylePr>
     <w:tblStylePr w:type="lastCol">
       <w:rPr>
-        <w:rFonts w:ascii="Arial" w:eastAsia="Arial" w:hAnsi="Arial" w:cs="Arial"/>
         <w:b/>
         <w:bCs/>
       </w:rPr>
@@ -7858,14 +7697,12 @@
     </w:tcPr>
     <w:tblStylePr w:type="firstRow">
       <w:rPr>
-        <w:rFonts w:ascii="Arial" w:eastAsia="Arial" w:hAnsi="Arial" w:cs="Arial"/>
         <w:b/>
         <w:bCs/>
       </w:rPr>
     </w:tblStylePr>
     <w:tblStylePr w:type="lastRow">
       <w:rPr>
-        <w:rFonts w:ascii="Arial" w:eastAsia="Arial" w:hAnsi="Arial" w:cs="Arial"/>
         <w:b/>
         <w:bCs/>
       </w:rPr>
@@ -7878,14 +7715,12 @@
     </w:tblStylePr>
     <w:tblStylePr w:type="firstCol">
       <w:rPr>
-        <w:rFonts w:ascii="Arial" w:eastAsia="Arial" w:hAnsi="Arial" w:cs="Arial"/>
         <w:b/>
         <w:bCs/>
       </w:rPr>
     </w:tblStylePr>
     <w:tblStylePr w:type="lastCol">
       <w:rPr>
-        <w:rFonts w:ascii="Arial" w:eastAsia="Arial" w:hAnsi="Arial" w:cs="Arial"/>
         <w:b/>
         <w:bCs/>
       </w:rPr>
@@ -7928,14 +7763,12 @@
     </w:tcPr>
     <w:tblStylePr w:type="firstRow">
       <w:rPr>
-        <w:rFonts w:ascii="Arial" w:eastAsia="Arial" w:hAnsi="Arial" w:cs="Arial"/>
         <w:b/>
         <w:bCs/>
       </w:rPr>
     </w:tblStylePr>
     <w:tblStylePr w:type="lastRow">
       <w:rPr>
-        <w:rFonts w:ascii="Arial" w:eastAsia="Arial" w:hAnsi="Arial" w:cs="Arial"/>
         <w:b/>
         <w:bCs/>
       </w:rPr>
@@ -7948,14 +7781,12 @@
     </w:tblStylePr>
     <w:tblStylePr w:type="firstCol">
       <w:rPr>
-        <w:rFonts w:ascii="Arial" w:eastAsia="Arial" w:hAnsi="Arial" w:cs="Arial"/>
         <w:b/>
         <w:bCs/>
       </w:rPr>
     </w:tblStylePr>
     <w:tblStylePr w:type="lastCol">
       <w:rPr>
-        <w:rFonts w:ascii="Arial" w:eastAsia="Arial" w:hAnsi="Arial" w:cs="Arial"/>
         <w:b/>
         <w:bCs/>
       </w:rPr>
@@ -7982,6 +7813,7 @@
       <w:spacing w:after="0" w:line="240" w:lineRule="auto"/>
     </w:pPr>
     <w:rPr>
+      <w:rFonts w:asciiTheme="majorHAnsi" w:eastAsiaTheme="majorEastAsia" w:hAnsiTheme="majorHAnsi" w:cstheme="majorBidi"/>
       <w:color w:val="000000" w:themeColor="text1"/>
     </w:rPr>
     <w:tblPr>
@@ -8001,7 +7833,6 @@
     </w:tcPr>
     <w:tblStylePr w:type="firstRow">
       <w:rPr>
-        <w:rFonts w:ascii="Arial" w:eastAsia="Arial" w:hAnsi="Arial" w:cs="Arial"/>
         <w:b/>
         <w:bCs/>
         <w:color w:val="000000" w:themeColor="text1"/>
@@ -8013,7 +7844,6 @@
     </w:tblStylePr>
     <w:tblStylePr w:type="lastRow">
       <w:rPr>
-        <w:rFonts w:ascii="Arial" w:eastAsia="Arial" w:hAnsi="Arial" w:cs="Arial"/>
         <w:b/>
         <w:bCs/>
         <w:color w:val="000000" w:themeColor="text1"/>
@@ -8033,7 +7863,6 @@
     </w:tblStylePr>
     <w:tblStylePr w:type="firstCol">
       <w:rPr>
-        <w:rFonts w:ascii="Arial" w:eastAsia="Arial" w:hAnsi="Arial" w:cs="Arial"/>
         <w:b/>
         <w:bCs/>
         <w:color w:val="000000" w:themeColor="text1"/>
@@ -8053,7 +7882,6 @@
     </w:tblStylePr>
     <w:tblStylePr w:type="lastCol">
       <w:rPr>
-        <w:rFonts w:ascii="Arial" w:eastAsia="Arial" w:hAnsi="Arial" w:cs="Arial"/>
         <w:b w:val="0"/>
         <w:bCs w:val="0"/>
         <w:color w:val="000000" w:themeColor="text1"/>
@@ -8103,6 +7931,7 @@
       <w:spacing w:after="0" w:line="240" w:lineRule="auto"/>
     </w:pPr>
     <w:rPr>
+      <w:rFonts w:asciiTheme="majorHAnsi" w:eastAsiaTheme="majorEastAsia" w:hAnsiTheme="majorHAnsi" w:cstheme="majorBidi"/>
       <w:color w:val="000000" w:themeColor="text1"/>
     </w:rPr>
     <w:tblPr>
@@ -8122,7 +7951,6 @@
     </w:tcPr>
     <w:tblStylePr w:type="firstRow">
       <w:rPr>
-        <w:rFonts w:ascii="Arial" w:eastAsia="Arial" w:hAnsi="Arial" w:cs="Arial"/>
         <w:b/>
         <w:bCs/>
         <w:color w:val="000000" w:themeColor="text1"/>
@@ -8134,7 +7962,6 @@
     </w:tblStylePr>
     <w:tblStylePr w:type="lastRow">
       <w:rPr>
-        <w:rFonts w:ascii="Arial" w:eastAsia="Arial" w:hAnsi="Arial" w:cs="Arial"/>
         <w:b/>
         <w:bCs/>
         <w:color w:val="000000" w:themeColor="text1"/>
@@ -8154,7 +7981,6 @@
     </w:tblStylePr>
     <w:tblStylePr w:type="firstCol">
       <w:rPr>
-        <w:rFonts w:ascii="Arial" w:eastAsia="Arial" w:hAnsi="Arial" w:cs="Arial"/>
         <w:b/>
         <w:bCs/>
         <w:color w:val="000000" w:themeColor="text1"/>
@@ -8174,7 +8000,6 @@
     </w:tblStylePr>
     <w:tblStylePr w:type="lastCol">
       <w:rPr>
-        <w:rFonts w:ascii="Arial" w:eastAsia="Arial" w:hAnsi="Arial" w:cs="Arial"/>
         <w:b w:val="0"/>
         <w:bCs w:val="0"/>
         <w:color w:val="000000" w:themeColor="text1"/>
@@ -8224,6 +8049,7 @@
       <w:spacing w:after="0" w:line="240" w:lineRule="auto"/>
     </w:pPr>
     <w:rPr>
+      <w:rFonts w:asciiTheme="majorHAnsi" w:eastAsiaTheme="majorEastAsia" w:hAnsiTheme="majorHAnsi" w:cstheme="majorBidi"/>
       <w:color w:val="000000" w:themeColor="text1"/>
     </w:rPr>
     <w:tblPr>
@@ -8243,7 +8069,6 @@
     </w:tcPr>
     <w:tblStylePr w:type="firstRow">
       <w:rPr>
-        <w:rFonts w:ascii="Arial" w:eastAsia="Arial" w:hAnsi="Arial" w:cs="Arial"/>
         <w:b/>
         <w:bCs/>
         <w:color w:val="000000" w:themeColor="text1"/>
@@ -8255,7 +8080,6 @@
     </w:tblStylePr>
     <w:tblStylePr w:type="lastRow">
       <w:rPr>
-        <w:rFonts w:ascii="Arial" w:eastAsia="Arial" w:hAnsi="Arial" w:cs="Arial"/>
         <w:b/>
         <w:bCs/>
         <w:color w:val="000000" w:themeColor="text1"/>
@@ -8275,7 +8099,6 @@
     </w:tblStylePr>
     <w:tblStylePr w:type="firstCol">
       <w:rPr>
-        <w:rFonts w:ascii="Arial" w:eastAsia="Arial" w:hAnsi="Arial" w:cs="Arial"/>
         <w:b/>
         <w:bCs/>
         <w:color w:val="000000" w:themeColor="text1"/>
@@ -8295,7 +8118,6 @@
     </w:tblStylePr>
     <w:tblStylePr w:type="lastCol">
       <w:rPr>
-        <w:rFonts w:ascii="Arial" w:eastAsia="Arial" w:hAnsi="Arial" w:cs="Arial"/>
         <w:b w:val="0"/>
         <w:bCs w:val="0"/>
         <w:color w:val="000000" w:themeColor="text1"/>
@@ -8345,6 +8167,7 @@
       <w:spacing w:after="0" w:line="240" w:lineRule="auto"/>
     </w:pPr>
     <w:rPr>
+      <w:rFonts w:asciiTheme="majorHAnsi" w:eastAsiaTheme="majorEastAsia" w:hAnsiTheme="majorHAnsi" w:cstheme="majorBidi"/>
       <w:color w:val="000000" w:themeColor="text1"/>
     </w:rPr>
     <w:tblPr>
@@ -8364,7 +8187,6 @@
     </w:tcPr>
     <w:tblStylePr w:type="firstRow">
       <w:rPr>
-        <w:rFonts w:ascii="Arial" w:eastAsia="Arial" w:hAnsi="Arial" w:cs="Arial"/>
         <w:b/>
         <w:bCs/>
         <w:color w:val="000000" w:themeColor="text1"/>
@@ -8376,7 +8198,6 @@
     </w:tblStylePr>
     <w:tblStylePr w:type="lastRow">
       <w:rPr>
-        <w:rFonts w:ascii="Arial" w:eastAsia="Arial" w:hAnsi="Arial" w:cs="Arial"/>
         <w:b/>
         <w:bCs/>
         <w:color w:val="000000" w:themeColor="text1"/>
@@ -8396,7 +8217,6 @@
     </w:tblStylePr>
     <w:tblStylePr w:type="firstCol">
       <w:rPr>
-        <w:rFonts w:ascii="Arial" w:eastAsia="Arial" w:hAnsi="Arial" w:cs="Arial"/>
         <w:b/>
         <w:bCs/>
         <w:color w:val="000000" w:themeColor="text1"/>
@@ -8416,7 +8236,6 @@
     </w:tblStylePr>
     <w:tblStylePr w:type="lastCol">
       <w:rPr>
-        <w:rFonts w:ascii="Arial" w:eastAsia="Arial" w:hAnsi="Arial" w:cs="Arial"/>
         <w:b w:val="0"/>
         <w:bCs w:val="0"/>
         <w:color w:val="000000" w:themeColor="text1"/>
@@ -8466,6 +8285,7 @@
       <w:spacing w:after="0" w:line="240" w:lineRule="auto"/>
     </w:pPr>
     <w:rPr>
+      <w:rFonts w:asciiTheme="majorHAnsi" w:eastAsiaTheme="majorEastAsia" w:hAnsiTheme="majorHAnsi" w:cstheme="majorBidi"/>
       <w:color w:val="000000" w:themeColor="text1"/>
     </w:rPr>
     <w:tblPr>
@@ -8485,7 +8305,6 @@
     </w:tcPr>
     <w:tblStylePr w:type="firstRow">
       <w:rPr>
-        <w:rFonts w:ascii="Arial" w:eastAsia="Arial" w:hAnsi="Arial" w:cs="Arial"/>
         <w:b/>
         <w:bCs/>
         <w:color w:val="000000" w:themeColor="text1"/>
@@ -8497,7 +8316,6 @@
     </w:tblStylePr>
     <w:tblStylePr w:type="lastRow">
       <w:rPr>
-        <w:rFonts w:ascii="Arial" w:eastAsia="Arial" w:hAnsi="Arial" w:cs="Arial"/>
         <w:b/>
         <w:bCs/>
         <w:color w:val="000000" w:themeColor="text1"/>
@@ -8517,7 +8335,6 @@
     </w:tblStylePr>
     <w:tblStylePr w:type="firstCol">
       <w:rPr>
-        <w:rFonts w:ascii="Arial" w:eastAsia="Arial" w:hAnsi="Arial" w:cs="Arial"/>
         <w:b/>
         <w:bCs/>
         <w:color w:val="000000" w:themeColor="text1"/>
@@ -8537,7 +8354,6 @@
     </w:tblStylePr>
     <w:tblStylePr w:type="lastCol">
       <w:rPr>
-        <w:rFonts w:ascii="Arial" w:eastAsia="Arial" w:hAnsi="Arial" w:cs="Arial"/>
         <w:b w:val="0"/>
         <w:bCs w:val="0"/>
         <w:color w:val="000000" w:themeColor="text1"/>
@@ -8587,6 +8403,7 @@
       <w:spacing w:after="0" w:line="240" w:lineRule="auto"/>
     </w:pPr>
     <w:rPr>
+      <w:rFonts w:asciiTheme="majorHAnsi" w:eastAsiaTheme="majorEastAsia" w:hAnsiTheme="majorHAnsi" w:cstheme="majorBidi"/>
       <w:color w:val="000000" w:themeColor="text1"/>
     </w:rPr>
     <w:tblPr>
@@ -8606,7 +8423,6 @@
     </w:tcPr>
     <w:tblStylePr w:type="firstRow">
       <w:rPr>
-        <w:rFonts w:ascii="Arial" w:eastAsia="Arial" w:hAnsi="Arial" w:cs="Arial"/>
         <w:b/>
         <w:bCs/>
         <w:color w:val="000000" w:themeColor="text1"/>
@@ -8618,7 +8434,6 @@
     </w:tblStylePr>
     <w:tblStylePr w:type="lastRow">
       <w:rPr>
-        <w:rFonts w:ascii="Arial" w:eastAsia="Arial" w:hAnsi="Arial" w:cs="Arial"/>
         <w:b/>
         <w:bCs/>
         <w:color w:val="000000" w:themeColor="text1"/>
@@ -8638,7 +8453,6 @@
     </w:tblStylePr>
     <w:tblStylePr w:type="firstCol">
       <w:rPr>
-        <w:rFonts w:ascii="Arial" w:eastAsia="Arial" w:hAnsi="Arial" w:cs="Arial"/>
         <w:b/>
         <w:bCs/>
         <w:color w:val="000000" w:themeColor="text1"/>
@@ -8658,7 +8472,6 @@
     </w:tblStylePr>
     <w:tblStylePr w:type="lastCol">
       <w:rPr>
-        <w:rFonts w:ascii="Arial" w:eastAsia="Arial" w:hAnsi="Arial" w:cs="Arial"/>
         <w:b w:val="0"/>
         <w:bCs w:val="0"/>
         <w:color w:val="000000" w:themeColor="text1"/>
@@ -8708,6 +8521,7 @@
       <w:spacing w:after="0" w:line="240" w:lineRule="auto"/>
     </w:pPr>
     <w:rPr>
+      <w:rFonts w:asciiTheme="majorHAnsi" w:eastAsiaTheme="majorEastAsia" w:hAnsiTheme="majorHAnsi" w:cstheme="majorBidi"/>
       <w:color w:val="000000" w:themeColor="text1"/>
     </w:rPr>
     <w:tblPr>
@@ -8727,7 +8541,6 @@
     </w:tcPr>
     <w:tblStylePr w:type="firstRow">
       <w:rPr>
-        <w:rFonts w:ascii="Arial" w:eastAsia="Arial" w:hAnsi="Arial" w:cs="Arial"/>
         <w:b/>
         <w:bCs/>
         <w:color w:val="000000" w:themeColor="text1"/>
@@ -8739,7 +8552,6 @@
     </w:tblStylePr>
     <w:tblStylePr w:type="lastRow">
       <w:rPr>
-        <w:rFonts w:ascii="Arial" w:eastAsia="Arial" w:hAnsi="Arial" w:cs="Arial"/>
         <w:b/>
         <w:bCs/>
         <w:color w:val="000000" w:themeColor="text1"/>
@@ -8759,7 +8571,6 @@
     </w:tblStylePr>
     <w:tblStylePr w:type="firstCol">
       <w:rPr>
-        <w:rFonts w:ascii="Arial" w:eastAsia="Arial" w:hAnsi="Arial" w:cs="Arial"/>
         <w:b/>
         <w:bCs/>
         <w:color w:val="000000" w:themeColor="text1"/>
@@ -8779,7 +8590,6 @@
     </w:tblStylePr>
     <w:tblStylePr w:type="lastCol">
       <w:rPr>
-        <w:rFonts w:ascii="Arial" w:eastAsia="Arial" w:hAnsi="Arial" w:cs="Arial"/>
         <w:b w:val="0"/>
         <w:bCs w:val="0"/>
         <w:color w:val="000000" w:themeColor="text1"/>
@@ -8845,7 +8655,6 @@
     </w:tcPr>
     <w:tblStylePr w:type="firstRow">
       <w:rPr>
-        <w:rFonts w:ascii="Arial" w:eastAsia="Arial" w:hAnsi="Arial" w:cs="Arial"/>
         <w:b/>
         <w:bCs/>
         <w:i w:val="0"/>
@@ -8867,7 +8676,6 @@
     </w:tblStylePr>
     <w:tblStylePr w:type="lastRow">
       <w:rPr>
-        <w:rFonts w:ascii="Arial" w:eastAsia="Arial" w:hAnsi="Arial" w:cs="Arial"/>
         <w:b/>
         <w:bCs/>
         <w:i w:val="0"/>
@@ -8889,7 +8697,6 @@
     </w:tblStylePr>
     <w:tblStylePr w:type="firstCol">
       <w:rPr>
-        <w:rFonts w:ascii="Arial" w:eastAsia="Arial" w:hAnsi="Arial" w:cs="Arial"/>
         <w:b/>
         <w:bCs/>
         <w:i w:val="0"/>
@@ -8909,7 +8716,6 @@
     </w:tblStylePr>
     <w:tblStylePr w:type="lastCol">
       <w:rPr>
-        <w:rFonts w:ascii="Arial" w:eastAsia="Arial" w:hAnsi="Arial" w:cs="Arial"/>
         <w:b/>
         <w:bCs/>
         <w:i w:val="0"/>
@@ -8983,7 +8789,6 @@
     </w:tcPr>
     <w:tblStylePr w:type="firstRow">
       <w:rPr>
-        <w:rFonts w:ascii="Arial" w:eastAsia="Arial" w:hAnsi="Arial" w:cs="Arial"/>
         <w:b/>
         <w:bCs/>
         <w:i w:val="0"/>
@@ -9005,7 +8810,6 @@
     </w:tblStylePr>
     <w:tblStylePr w:type="lastRow">
       <w:rPr>
-        <w:rFonts w:ascii="Arial" w:eastAsia="Arial" w:hAnsi="Arial" w:cs="Arial"/>
         <w:b/>
         <w:bCs/>
         <w:i w:val="0"/>
@@ -9027,7 +8831,6 @@
     </w:tblStylePr>
     <w:tblStylePr w:type="firstCol">
       <w:rPr>
-        <w:rFonts w:ascii="Arial" w:eastAsia="Arial" w:hAnsi="Arial" w:cs="Arial"/>
         <w:b/>
         <w:bCs/>
         <w:i w:val="0"/>
@@ -9047,7 +8850,6 @@
     </w:tblStylePr>
     <w:tblStylePr w:type="lastCol">
       <w:rPr>
-        <w:rFonts w:ascii="Arial" w:eastAsia="Arial" w:hAnsi="Arial" w:cs="Arial"/>
         <w:b/>
         <w:bCs/>
         <w:i w:val="0"/>
@@ -9121,7 +8923,6 @@
     </w:tcPr>
     <w:tblStylePr w:type="firstRow">
       <w:rPr>
-        <w:rFonts w:ascii="Arial" w:eastAsia="Arial" w:hAnsi="Arial" w:cs="Arial"/>
         <w:b/>
         <w:bCs/>
         <w:i w:val="0"/>
@@ -9143,7 +8944,6 @@
     </w:tblStylePr>
     <w:tblStylePr w:type="lastRow">
       <w:rPr>
-        <w:rFonts w:ascii="Arial" w:eastAsia="Arial" w:hAnsi="Arial" w:cs="Arial"/>
         <w:b/>
         <w:bCs/>
         <w:i w:val="0"/>
@@ -9165,7 +8965,6 @@
     </w:tblStylePr>
     <w:tblStylePr w:type="firstCol">
       <w:rPr>
-        <w:rFonts w:ascii="Arial" w:eastAsia="Arial" w:hAnsi="Arial" w:cs="Arial"/>
         <w:b/>
         <w:bCs/>
         <w:i w:val="0"/>
@@ -9185,7 +8984,6 @@
     </w:tblStylePr>
     <w:tblStylePr w:type="lastCol">
       <w:rPr>
-        <w:rFonts w:ascii="Arial" w:eastAsia="Arial" w:hAnsi="Arial" w:cs="Arial"/>
         <w:b/>
         <w:bCs/>
         <w:i w:val="0"/>
@@ -9259,7 +9057,6 @@
     </w:tcPr>
     <w:tblStylePr w:type="firstRow">
       <w:rPr>
-        <w:rFonts w:ascii="Arial" w:eastAsia="Arial" w:hAnsi="Arial" w:cs="Arial"/>
         <w:b/>
         <w:bCs/>
         <w:i w:val="0"/>
@@ -9281,7 +9078,6 @@
     </w:tblStylePr>
     <w:tblStylePr w:type="lastRow">
       <w:rPr>
-        <w:rFonts w:ascii="Arial" w:eastAsia="Arial" w:hAnsi="Arial" w:cs="Arial"/>
         <w:b/>
         <w:bCs/>
         <w:i w:val="0"/>
@@ -9303,7 +9099,6 @@
     </w:tblStylePr>
     <w:tblStylePr w:type="firstCol">
       <w:rPr>
-        <w:rFonts w:ascii="Arial" w:eastAsia="Arial" w:hAnsi="Arial" w:cs="Arial"/>
         <w:b/>
         <w:bCs/>
         <w:i w:val="0"/>
@@ -9323,7 +9118,6 @@
     </w:tblStylePr>
     <w:tblStylePr w:type="lastCol">
       <w:rPr>
-        <w:rFonts w:ascii="Arial" w:eastAsia="Arial" w:hAnsi="Arial" w:cs="Arial"/>
         <w:b/>
         <w:bCs/>
         <w:i w:val="0"/>
@@ -9397,7 +9191,6 @@
     </w:tcPr>
     <w:tblStylePr w:type="firstRow">
       <w:rPr>
-        <w:rFonts w:ascii="Arial" w:eastAsia="Arial" w:hAnsi="Arial" w:cs="Arial"/>
         <w:b/>
         <w:bCs/>
         <w:i w:val="0"/>
@@ -9419,7 +9212,6 @@
     </w:tblStylePr>
     <w:tblStylePr w:type="lastRow">
       <w:rPr>
-        <w:rFonts w:ascii="Arial" w:eastAsia="Arial" w:hAnsi="Arial" w:cs="Arial"/>
         <w:b/>
         <w:bCs/>
         <w:i w:val="0"/>
@@ -9441,7 +9233,6 @@
     </w:tblStylePr>
     <w:tblStylePr w:type="firstCol">
       <w:rPr>
-        <w:rFonts w:ascii="Arial" w:eastAsia="Arial" w:hAnsi="Arial" w:cs="Arial"/>
         <w:b/>
         <w:bCs/>
         <w:i w:val="0"/>
@@ -9461,7 +9252,6 @@
     </w:tblStylePr>
     <w:tblStylePr w:type="lastCol">
       <w:rPr>
-        <w:rFonts w:ascii="Arial" w:eastAsia="Arial" w:hAnsi="Arial" w:cs="Arial"/>
         <w:b/>
         <w:bCs/>
         <w:i w:val="0"/>
@@ -9535,7 +9325,6 @@
     </w:tcPr>
     <w:tblStylePr w:type="firstRow">
       <w:rPr>
-        <w:rFonts w:ascii="Arial" w:eastAsia="Arial" w:hAnsi="Arial" w:cs="Arial"/>
         <w:b/>
         <w:bCs/>
         <w:i w:val="0"/>
@@ -9557,7 +9346,6 @@
     </w:tblStylePr>
     <w:tblStylePr w:type="lastRow">
       <w:rPr>
-        <w:rFonts w:ascii="Arial" w:eastAsia="Arial" w:hAnsi="Arial" w:cs="Arial"/>
         <w:b/>
         <w:bCs/>
         <w:i w:val="0"/>
@@ -9579,7 +9367,6 @@
     </w:tblStylePr>
     <w:tblStylePr w:type="firstCol">
       <w:rPr>
-        <w:rFonts w:ascii="Arial" w:eastAsia="Arial" w:hAnsi="Arial" w:cs="Arial"/>
         <w:b/>
         <w:bCs/>
         <w:i w:val="0"/>
@@ -9599,7 +9386,6 @@
     </w:tblStylePr>
     <w:tblStylePr w:type="lastCol">
       <w:rPr>
-        <w:rFonts w:ascii="Arial" w:eastAsia="Arial" w:hAnsi="Arial" w:cs="Arial"/>
         <w:b/>
         <w:bCs/>
         <w:i w:val="0"/>
@@ -9673,7 +9459,6 @@
     </w:tcPr>
     <w:tblStylePr w:type="firstRow">
       <w:rPr>
-        <w:rFonts w:ascii="Arial" w:eastAsia="Arial" w:hAnsi="Arial" w:cs="Arial"/>
         <w:b/>
         <w:bCs/>
         <w:i w:val="0"/>
@@ -9695,7 +9480,6 @@
     </w:tblStylePr>
     <w:tblStylePr w:type="lastRow">
       <w:rPr>
-        <w:rFonts w:ascii="Arial" w:eastAsia="Arial" w:hAnsi="Arial" w:cs="Arial"/>
         <w:b/>
         <w:bCs/>
         <w:i w:val="0"/>
@@ -9717,7 +9501,6 @@
     </w:tblStylePr>
     <w:tblStylePr w:type="firstCol">
       <w:rPr>
-        <w:rFonts w:ascii="Arial" w:eastAsia="Arial" w:hAnsi="Arial" w:cs="Arial"/>
         <w:b/>
         <w:bCs/>
         <w:i w:val="0"/>
@@ -9737,7 +9520,6 @@
     </w:tblStylePr>
     <w:tblStylePr w:type="lastCol">
       <w:rPr>
-        <w:rFonts w:ascii="Arial" w:eastAsia="Arial" w:hAnsi="Arial" w:cs="Arial"/>
         <w:b/>
         <w:bCs/>
         <w:i w:val="0"/>
@@ -9806,7 +9588,6 @@
     </w:tcPr>
     <w:tblStylePr w:type="firstRow">
       <w:rPr>
-        <w:rFonts w:ascii="Arial" w:eastAsia="Arial" w:hAnsi="Arial" w:cs="Arial"/>
         <w:b/>
         <w:bCs/>
       </w:rPr>
@@ -9914,7 +9695,6 @@
     </w:tcPr>
     <w:tblStylePr w:type="firstRow">
       <w:rPr>
-        <w:rFonts w:ascii="Arial" w:eastAsia="Arial" w:hAnsi="Arial" w:cs="Arial"/>
         <w:b/>
         <w:bCs/>
       </w:rPr>
@@ -10022,7 +9802,6 @@
     </w:tcPr>
     <w:tblStylePr w:type="firstRow">
       <w:rPr>
-        <w:rFonts w:ascii="Arial" w:eastAsia="Arial" w:hAnsi="Arial" w:cs="Arial"/>
         <w:b/>
         <w:bCs/>
       </w:rPr>
@@ -10130,7 +9909,6 @@
     </w:tcPr>
     <w:tblStylePr w:type="firstRow">
       <w:rPr>
-        <w:rFonts w:ascii="Arial" w:eastAsia="Arial" w:hAnsi="Arial" w:cs="Arial"/>
         <w:b/>
         <w:bCs/>
       </w:rPr>
@@ -10238,7 +10016,6 @@
     </w:tcPr>
     <w:tblStylePr w:type="firstRow">
       <w:rPr>
-        <w:rFonts w:ascii="Arial" w:eastAsia="Arial" w:hAnsi="Arial" w:cs="Arial"/>
         <w:b/>
         <w:bCs/>
       </w:rPr>
@@ -10346,7 +10123,6 @@
     </w:tcPr>
     <w:tblStylePr w:type="firstRow">
       <w:rPr>
-        <w:rFonts w:ascii="Arial" w:eastAsia="Arial" w:hAnsi="Arial" w:cs="Arial"/>
         <w:b/>
         <w:bCs/>
       </w:rPr>
@@ -10454,7 +10230,6 @@
     </w:tcPr>
     <w:tblStylePr w:type="firstRow">
       <w:rPr>
-        <w:rFonts w:ascii="Arial" w:eastAsia="Arial" w:hAnsi="Arial" w:cs="Arial"/>
         <w:b/>
         <w:bCs/>
       </w:rPr>
@@ -10570,7 +10345,6 @@
     </w:tcPr>
     <w:tblStylePr w:type="firstRow">
       <w:rPr>
-        <w:rFonts w:ascii="Arial" w:eastAsia="Arial" w:hAnsi="Arial" w:cs="Arial"/>
         <w:b/>
         <w:bCs/>
       </w:rPr>
@@ -10589,7 +10363,6 @@
     </w:tblStylePr>
     <w:tblStylePr w:type="lastRow">
       <w:rPr>
-        <w:rFonts w:ascii="Arial" w:eastAsia="Arial" w:hAnsi="Arial" w:cs="Arial"/>
         <w:b/>
         <w:bCs/>
         <w:color w:val="FFFFFF" w:themeColor="background1"/>
@@ -10604,7 +10377,6 @@
     </w:tblStylePr>
     <w:tblStylePr w:type="firstCol">
       <w:rPr>
-        <w:rFonts w:ascii="Arial" w:eastAsia="Arial" w:hAnsi="Arial" w:cs="Arial"/>
         <w:color w:val="FFFFFF" w:themeColor="background1"/>
       </w:rPr>
       <w:tblPr/>
@@ -10622,7 +10394,6 @@
     </w:tblStylePr>
     <w:tblStylePr w:type="lastCol">
       <w:rPr>
-        <w:rFonts w:ascii="Arial" w:eastAsia="Arial" w:hAnsi="Arial" w:cs="Arial"/>
         <w:color w:val="FFFFFF" w:themeColor="background1"/>
       </w:rPr>
       <w:tblPr/>
@@ -10652,13 +10423,11 @@
     </w:tblStylePr>
     <w:tblStylePr w:type="neCell">
       <w:rPr>
-        <w:rFonts w:ascii="Arial" w:eastAsia="Arial" w:hAnsi="Arial" w:cs="Arial"/>
         <w:color w:val="000000" w:themeColor="text1"/>
       </w:rPr>
     </w:tblStylePr>
     <w:tblStylePr w:type="nwCell">
       <w:rPr>
-        <w:rFonts w:ascii="Arial" w:eastAsia="Arial" w:hAnsi="Arial" w:cs="Arial"/>
         <w:color w:val="000000" w:themeColor="text1"/>
       </w:rPr>
     </w:tblStylePr>
@@ -10691,7 +10460,6 @@
     </w:tcPr>
     <w:tblStylePr w:type="firstRow">
       <w:rPr>
-        <w:rFonts w:ascii="Arial" w:eastAsia="Arial" w:hAnsi="Arial" w:cs="Arial"/>
         <w:b/>
         <w:bCs/>
       </w:rPr>
@@ -10710,7 +10478,6 @@
     </w:tblStylePr>
     <w:tblStylePr w:type="lastRow">
       <w:rPr>
-        <w:rFonts w:ascii="Arial" w:eastAsia="Arial" w:hAnsi="Arial" w:cs="Arial"/>
         <w:b/>
         <w:bCs/>
         <w:color w:val="FFFFFF" w:themeColor="background1"/>
@@ -10725,7 +10492,6 @@
     </w:tblStylePr>
     <w:tblStylePr w:type="firstCol">
       <w:rPr>
-        <w:rFonts w:ascii="Arial" w:eastAsia="Arial" w:hAnsi="Arial" w:cs="Arial"/>
         <w:color w:val="FFFFFF" w:themeColor="background1"/>
       </w:rPr>
       <w:tblPr/>
@@ -10743,7 +10509,6 @@
     </w:tblStylePr>
     <w:tblStylePr w:type="lastCol">
       <w:rPr>
-        <w:rFonts w:ascii="Arial" w:eastAsia="Arial" w:hAnsi="Arial" w:cs="Arial"/>
         <w:color w:val="FFFFFF" w:themeColor="background1"/>
       </w:rPr>
       <w:tblPr/>
@@ -10773,13 +10538,11 @@
     </w:tblStylePr>
     <w:tblStylePr w:type="neCell">
       <w:rPr>
-        <w:rFonts w:ascii="Arial" w:eastAsia="Arial" w:hAnsi="Arial" w:cs="Arial"/>
         <w:color w:val="000000" w:themeColor="text1"/>
       </w:rPr>
     </w:tblStylePr>
     <w:tblStylePr w:type="nwCell">
       <w:rPr>
-        <w:rFonts w:ascii="Arial" w:eastAsia="Arial" w:hAnsi="Arial" w:cs="Arial"/>
         <w:color w:val="000000" w:themeColor="text1"/>
       </w:rPr>
     </w:tblStylePr>
@@ -10812,7 +10575,6 @@
     </w:tcPr>
     <w:tblStylePr w:type="firstRow">
       <w:rPr>
-        <w:rFonts w:ascii="Arial" w:eastAsia="Arial" w:hAnsi="Arial" w:cs="Arial"/>
         <w:b/>
         <w:bCs/>
       </w:rPr>
@@ -10831,7 +10593,6 @@
     </w:tblStylePr>
     <w:tblStylePr w:type="lastRow">
       <w:rPr>
-        <w:rFonts w:ascii="Arial" w:eastAsia="Arial" w:hAnsi="Arial" w:cs="Arial"/>
         <w:b/>
         <w:bCs/>
         <w:color w:val="FFFFFF" w:themeColor="background1"/>
@@ -10846,7 +10607,6 @@
     </w:tblStylePr>
     <w:tblStylePr w:type="firstCol">
       <w:rPr>
-        <w:rFonts w:ascii="Arial" w:eastAsia="Arial" w:hAnsi="Arial" w:cs="Arial"/>
         <w:color w:val="FFFFFF" w:themeColor="background1"/>
       </w:rPr>
       <w:tblPr/>
@@ -10864,7 +10624,6 @@
     </w:tblStylePr>
     <w:tblStylePr w:type="lastCol">
       <w:rPr>
-        <w:rFonts w:ascii="Arial" w:eastAsia="Arial" w:hAnsi="Arial" w:cs="Arial"/>
         <w:color w:val="FFFFFF" w:themeColor="background1"/>
       </w:rPr>
       <w:tblPr/>
@@ -10894,13 +10653,11 @@
     </w:tblStylePr>
     <w:tblStylePr w:type="neCell">
       <w:rPr>
-        <w:rFonts w:ascii="Arial" w:eastAsia="Arial" w:hAnsi="Arial" w:cs="Arial"/>
         <w:color w:val="000000" w:themeColor="text1"/>
       </w:rPr>
     </w:tblStylePr>
     <w:tblStylePr w:type="nwCell">
       <w:rPr>
-        <w:rFonts w:ascii="Arial" w:eastAsia="Arial" w:hAnsi="Arial" w:cs="Arial"/>
         <w:color w:val="000000" w:themeColor="text1"/>
       </w:rPr>
     </w:tblStylePr>
@@ -10933,7 +10690,6 @@
     </w:tcPr>
     <w:tblStylePr w:type="firstRow">
       <w:rPr>
-        <w:rFonts w:ascii="Arial" w:eastAsia="Arial" w:hAnsi="Arial" w:cs="Arial"/>
         <w:b/>
         <w:bCs/>
       </w:rPr>
@@ -10952,7 +10708,6 @@
     </w:tblStylePr>
     <w:tblStylePr w:type="lastRow">
       <w:rPr>
-        <w:rFonts w:ascii="Arial" w:eastAsia="Arial" w:hAnsi="Arial" w:cs="Arial"/>
         <w:b/>
         <w:bCs/>
         <w:color w:val="FFFFFF" w:themeColor="background1"/>
@@ -10967,7 +10722,6 @@
     </w:tblStylePr>
     <w:tblStylePr w:type="firstCol">
       <w:rPr>
-        <w:rFonts w:ascii="Arial" w:eastAsia="Arial" w:hAnsi="Arial" w:cs="Arial"/>
         <w:color w:val="FFFFFF" w:themeColor="background1"/>
       </w:rPr>
       <w:tblPr/>
@@ -10985,7 +10739,6 @@
     </w:tblStylePr>
     <w:tblStylePr w:type="lastCol">
       <w:rPr>
-        <w:rFonts w:ascii="Arial" w:eastAsia="Arial" w:hAnsi="Arial" w:cs="Arial"/>
         <w:color w:val="FFFFFF" w:themeColor="background1"/>
       </w:rPr>
       <w:tblPr/>
@@ -11042,7 +10795,6 @@
     </w:tcPr>
     <w:tblStylePr w:type="firstRow">
       <w:rPr>
-        <w:rFonts w:ascii="Arial" w:eastAsia="Arial" w:hAnsi="Arial" w:cs="Arial"/>
         <w:b/>
         <w:bCs/>
       </w:rPr>
@@ -11061,7 +10813,6 @@
     </w:tblStylePr>
     <w:tblStylePr w:type="lastRow">
       <w:rPr>
-        <w:rFonts w:ascii="Arial" w:eastAsia="Arial" w:hAnsi="Arial" w:cs="Arial"/>
         <w:b/>
         <w:bCs/>
         <w:color w:val="FFFFFF" w:themeColor="background1"/>
@@ -11076,7 +10827,6 @@
     </w:tblStylePr>
     <w:tblStylePr w:type="firstCol">
       <w:rPr>
-        <w:rFonts w:ascii="Arial" w:eastAsia="Arial" w:hAnsi="Arial" w:cs="Arial"/>
         <w:color w:val="FFFFFF" w:themeColor="background1"/>
       </w:rPr>
       <w:tblPr/>
@@ -11094,7 +10844,6 @@
     </w:tblStylePr>
     <w:tblStylePr w:type="lastCol">
       <w:rPr>
-        <w:rFonts w:ascii="Arial" w:eastAsia="Arial" w:hAnsi="Arial" w:cs="Arial"/>
         <w:color w:val="FFFFFF" w:themeColor="background1"/>
       </w:rPr>
       <w:tblPr/>
@@ -11124,13 +10873,11 @@
     </w:tblStylePr>
     <w:tblStylePr w:type="neCell">
       <w:rPr>
-        <w:rFonts w:ascii="Arial" w:eastAsia="Arial" w:hAnsi="Arial" w:cs="Arial"/>
         <w:color w:val="000000" w:themeColor="text1"/>
       </w:rPr>
     </w:tblStylePr>
     <w:tblStylePr w:type="nwCell">
       <w:rPr>
-        <w:rFonts w:ascii="Arial" w:eastAsia="Arial" w:hAnsi="Arial" w:cs="Arial"/>
         <w:color w:val="000000" w:themeColor="text1"/>
       </w:rPr>
     </w:tblStylePr>
@@ -11163,7 +10910,6 @@
     </w:tcPr>
     <w:tblStylePr w:type="firstRow">
       <w:rPr>
-        <w:rFonts w:ascii="Arial" w:eastAsia="Arial" w:hAnsi="Arial" w:cs="Arial"/>
         <w:b/>
         <w:bCs/>
       </w:rPr>
@@ -11182,7 +10928,6 @@
     </w:tblStylePr>
     <w:tblStylePr w:type="lastRow">
       <w:rPr>
-        <w:rFonts w:ascii="Arial" w:eastAsia="Arial" w:hAnsi="Arial" w:cs="Arial"/>
         <w:b/>
         <w:bCs/>
         <w:color w:val="FFFFFF" w:themeColor="background1"/>
@@ -11197,7 +10942,6 @@
     </w:tblStylePr>
     <w:tblStylePr w:type="firstCol">
       <w:rPr>
-        <w:rFonts w:ascii="Arial" w:eastAsia="Arial" w:hAnsi="Arial" w:cs="Arial"/>
         <w:color w:val="FFFFFF" w:themeColor="background1"/>
       </w:rPr>
       <w:tblPr/>
@@ -11215,7 +10959,6 @@
     </w:tblStylePr>
     <w:tblStylePr w:type="lastCol">
       <w:rPr>
-        <w:rFonts w:ascii="Arial" w:eastAsia="Arial" w:hAnsi="Arial" w:cs="Arial"/>
         <w:color w:val="FFFFFF" w:themeColor="background1"/>
       </w:rPr>
       <w:tblPr/>
@@ -11245,13 +10988,11 @@
     </w:tblStylePr>
     <w:tblStylePr w:type="neCell">
       <w:rPr>
-        <w:rFonts w:ascii="Arial" w:eastAsia="Arial" w:hAnsi="Arial" w:cs="Arial"/>
         <w:color w:val="000000" w:themeColor="text1"/>
       </w:rPr>
     </w:tblStylePr>
     <w:tblStylePr w:type="nwCell">
       <w:rPr>
-        <w:rFonts w:ascii="Arial" w:eastAsia="Arial" w:hAnsi="Arial" w:cs="Arial"/>
         <w:color w:val="000000" w:themeColor="text1"/>
       </w:rPr>
     </w:tblStylePr>
@@ -11284,7 +11025,6 @@
     </w:tcPr>
     <w:tblStylePr w:type="firstRow">
       <w:rPr>
-        <w:rFonts w:ascii="Arial" w:eastAsia="Arial" w:hAnsi="Arial" w:cs="Arial"/>
         <w:b/>
         <w:bCs/>
       </w:rPr>
@@ -11303,7 +11043,6 @@
     </w:tblStylePr>
     <w:tblStylePr w:type="lastRow">
       <w:rPr>
-        <w:rFonts w:ascii="Arial" w:eastAsia="Arial" w:hAnsi="Arial" w:cs="Arial"/>
         <w:b/>
         <w:bCs/>
         <w:color w:val="FFFFFF" w:themeColor="background1"/>
@@ -11318,7 +11057,6 @@
     </w:tblStylePr>
     <w:tblStylePr w:type="firstCol">
       <w:rPr>
-        <w:rFonts w:ascii="Arial" w:eastAsia="Arial" w:hAnsi="Arial" w:cs="Arial"/>
         <w:color w:val="FFFFFF" w:themeColor="background1"/>
       </w:rPr>
       <w:tblPr/>
@@ -11336,7 +11074,6 @@
     </w:tblStylePr>
     <w:tblStylePr w:type="lastCol">
       <w:rPr>
-        <w:rFonts w:ascii="Arial" w:eastAsia="Arial" w:hAnsi="Arial" w:cs="Arial"/>
         <w:color w:val="FFFFFF" w:themeColor="background1"/>
       </w:rPr>
       <w:tblPr/>
@@ -11366,13 +11103,11 @@
     </w:tblStylePr>
     <w:tblStylePr w:type="neCell">
       <w:rPr>
-        <w:rFonts w:ascii="Arial" w:eastAsia="Arial" w:hAnsi="Arial" w:cs="Arial"/>
         <w:color w:val="000000" w:themeColor="text1"/>
       </w:rPr>
     </w:tblStylePr>
     <w:tblStylePr w:type="nwCell">
       <w:rPr>
-        <w:rFonts w:ascii="Arial" w:eastAsia="Arial" w:hAnsi="Arial" w:cs="Arial"/>
         <w:color w:val="000000" w:themeColor="text1"/>
       </w:rPr>
     </w:tblStylePr>
@@ -11397,7 +11132,6 @@
     </w:tcPr>
     <w:tblStylePr w:type="firstRow">
       <w:rPr>
-        <w:rFonts w:ascii="Arial" w:eastAsia="Arial" w:hAnsi="Arial" w:cs="Arial"/>
         <w:b/>
         <w:bCs/>
         <w:color w:val="FFFFFF" w:themeColor="background1"/>
@@ -11412,7 +11146,6 @@
     </w:tblStylePr>
     <w:tblStylePr w:type="lastRow">
       <w:rPr>
-        <w:rFonts w:ascii="Arial" w:eastAsia="Arial" w:hAnsi="Arial" w:cs="Arial"/>
         <w:b/>
         <w:bCs/>
         <w:color w:val="9E3A38" w:themeColor="accent2" w:themeShade="CC"/>
@@ -11427,14 +11160,12 @@
     </w:tblStylePr>
     <w:tblStylePr w:type="firstCol">
       <w:rPr>
-        <w:rFonts w:ascii="Arial" w:eastAsia="Arial" w:hAnsi="Arial" w:cs="Arial"/>
         <w:b/>
         <w:bCs/>
       </w:rPr>
     </w:tblStylePr>
     <w:tblStylePr w:type="lastCol">
       <w:rPr>
-        <w:rFonts w:ascii="Arial" w:eastAsia="Arial" w:hAnsi="Arial" w:cs="Arial"/>
         <w:b/>
         <w:bCs/>
       </w:rPr>
@@ -11480,7 +11211,6 @@
     </w:tcPr>
     <w:tblStylePr w:type="firstRow">
       <w:rPr>
-        <w:rFonts w:ascii="Arial" w:eastAsia="Arial" w:hAnsi="Arial" w:cs="Arial"/>
         <w:b/>
         <w:bCs/>
         <w:color w:val="FFFFFF" w:themeColor="background1"/>
@@ -11495,7 +11225,6 @@
     </w:tblStylePr>
     <w:tblStylePr w:type="lastRow">
       <w:rPr>
-        <w:rFonts w:ascii="Arial" w:eastAsia="Arial" w:hAnsi="Arial" w:cs="Arial"/>
         <w:b/>
         <w:bCs/>
         <w:color w:val="9E3A38" w:themeColor="accent2" w:themeShade="CC"/>
@@ -11510,14 +11239,12 @@
     </w:tblStylePr>
     <w:tblStylePr w:type="firstCol">
       <w:rPr>
-        <w:rFonts w:ascii="Arial" w:eastAsia="Arial" w:hAnsi="Arial" w:cs="Arial"/>
         <w:b/>
         <w:bCs/>
       </w:rPr>
     </w:tblStylePr>
     <w:tblStylePr w:type="lastCol">
       <w:rPr>
-        <w:rFonts w:ascii="Arial" w:eastAsia="Arial" w:hAnsi="Arial" w:cs="Arial"/>
         <w:b/>
         <w:bCs/>
       </w:rPr>
@@ -11563,7 +11290,6 @@
     </w:tcPr>
     <w:tblStylePr w:type="firstRow">
       <w:rPr>
-        <w:rFonts w:ascii="Arial" w:eastAsia="Arial" w:hAnsi="Arial" w:cs="Arial"/>
         <w:b/>
         <w:bCs/>
         <w:color w:val="FFFFFF" w:themeColor="background1"/>
@@ -11578,7 +11304,6 @@
     </w:tblStylePr>
     <w:tblStylePr w:type="lastRow">
       <w:rPr>
-        <w:rFonts w:ascii="Arial" w:eastAsia="Arial" w:hAnsi="Arial" w:cs="Arial"/>
         <w:b/>
         <w:bCs/>
         <w:color w:val="9E3A38" w:themeColor="accent2" w:themeShade="CC"/>
@@ -11593,14 +11318,12 @@
     </w:tblStylePr>
     <w:tblStylePr w:type="firstCol">
       <w:rPr>
-        <w:rFonts w:ascii="Arial" w:eastAsia="Arial" w:hAnsi="Arial" w:cs="Arial"/>
         <w:b/>
         <w:bCs/>
       </w:rPr>
     </w:tblStylePr>
     <w:tblStylePr w:type="lastCol">
       <w:rPr>
-        <w:rFonts w:ascii="Arial" w:eastAsia="Arial" w:hAnsi="Arial" w:cs="Arial"/>
         <w:b/>
         <w:bCs/>
       </w:rPr>
@@ -11646,7 +11369,6 @@
     </w:tcPr>
     <w:tblStylePr w:type="firstRow">
       <w:rPr>
-        <w:rFonts w:ascii="Arial" w:eastAsia="Arial" w:hAnsi="Arial" w:cs="Arial"/>
         <w:b/>
         <w:bCs/>
         <w:color w:val="FFFFFF" w:themeColor="background1"/>
@@ -11661,7 +11383,6 @@
     </w:tblStylePr>
     <w:tblStylePr w:type="lastRow">
       <w:rPr>
-        <w:rFonts w:ascii="Arial" w:eastAsia="Arial" w:hAnsi="Arial" w:cs="Arial"/>
         <w:b/>
         <w:bCs/>
         <w:color w:val="664E82" w:themeColor="accent4" w:themeShade="CC"/>
@@ -11676,14 +11397,12 @@
     </w:tblStylePr>
     <w:tblStylePr w:type="firstCol">
       <w:rPr>
-        <w:rFonts w:ascii="Arial" w:eastAsia="Arial" w:hAnsi="Arial" w:cs="Arial"/>
         <w:b/>
         <w:bCs/>
       </w:rPr>
     </w:tblStylePr>
     <w:tblStylePr w:type="lastCol">
       <w:rPr>
-        <w:rFonts w:ascii="Arial" w:eastAsia="Arial" w:hAnsi="Arial" w:cs="Arial"/>
         <w:b/>
         <w:bCs/>
       </w:rPr>
@@ -11729,7 +11448,6 @@
     </w:tcPr>
     <w:tblStylePr w:type="firstRow">
       <w:rPr>
-        <w:rFonts w:ascii="Arial" w:eastAsia="Arial" w:hAnsi="Arial" w:cs="Arial"/>
         <w:b/>
         <w:bCs/>
         <w:color w:val="FFFFFF" w:themeColor="background1"/>
@@ -11744,7 +11462,6 @@
     </w:tblStylePr>
     <w:tblStylePr w:type="lastRow">
       <w:rPr>
-        <w:rFonts w:ascii="Arial" w:eastAsia="Arial" w:hAnsi="Arial" w:cs="Arial"/>
         <w:b/>
         <w:bCs/>
         <w:color w:val="7E9C40" w:themeColor="accent3" w:themeShade="CC"/>
@@ -11759,14 +11476,12 @@
     </w:tblStylePr>
     <w:tblStylePr w:type="firstCol">
       <w:rPr>
-        <w:rFonts w:ascii="Arial" w:eastAsia="Arial" w:hAnsi="Arial" w:cs="Arial"/>
         <w:b/>
         <w:bCs/>
       </w:rPr>
     </w:tblStylePr>
     <w:tblStylePr w:type="lastCol">
       <w:rPr>
-        <w:rFonts w:ascii="Arial" w:eastAsia="Arial" w:hAnsi="Arial" w:cs="Arial"/>
         <w:b/>
         <w:bCs/>
       </w:rPr>
@@ -11812,7 +11527,6 @@
     </w:tcPr>
     <w:tblStylePr w:type="firstRow">
       <w:rPr>
-        <w:rFonts w:ascii="Arial" w:eastAsia="Arial" w:hAnsi="Arial" w:cs="Arial"/>
         <w:b/>
         <w:bCs/>
         <w:color w:val="FFFFFF" w:themeColor="background1"/>
@@ -11827,7 +11541,6 @@
     </w:tblStylePr>
     <w:tblStylePr w:type="lastRow">
       <w:rPr>
-        <w:rFonts w:ascii="Arial" w:eastAsia="Arial" w:hAnsi="Arial" w:cs="Arial"/>
         <w:b/>
         <w:bCs/>
         <w:color w:val="F2730A" w:themeColor="accent6" w:themeShade="CC"/>
@@ -11842,14 +11555,12 @@
     </w:tblStylePr>
     <w:tblStylePr w:type="firstCol">
       <w:rPr>
-        <w:rFonts w:ascii="Arial" w:eastAsia="Arial" w:hAnsi="Arial" w:cs="Arial"/>
         <w:b/>
         <w:bCs/>
       </w:rPr>
     </w:tblStylePr>
     <w:tblStylePr w:type="lastCol">
       <w:rPr>
-        <w:rFonts w:ascii="Arial" w:eastAsia="Arial" w:hAnsi="Arial" w:cs="Arial"/>
         <w:b/>
         <w:bCs/>
       </w:rPr>
@@ -11895,7 +11606,6 @@
     </w:tcPr>
     <w:tblStylePr w:type="firstRow">
       <w:rPr>
-        <w:rFonts w:ascii="Arial" w:eastAsia="Arial" w:hAnsi="Arial" w:cs="Arial"/>
         <w:b/>
         <w:bCs/>
         <w:color w:val="FFFFFF" w:themeColor="background1"/>
@@ -11910,7 +11620,6 @@
     </w:tblStylePr>
     <w:tblStylePr w:type="lastRow">
       <w:rPr>
-        <w:rFonts w:ascii="Arial" w:eastAsia="Arial" w:hAnsi="Arial" w:cs="Arial"/>
         <w:b/>
         <w:bCs/>
         <w:color w:val="348DA5" w:themeColor="accent5" w:themeShade="CC"/>
@@ -11925,14 +11634,12 @@
     </w:tblStylePr>
     <w:tblStylePr w:type="firstCol">
       <w:rPr>
-        <w:rFonts w:ascii="Arial" w:eastAsia="Arial" w:hAnsi="Arial" w:cs="Arial"/>
         <w:b/>
         <w:bCs/>
       </w:rPr>
     </w:tblStylePr>
     <w:tblStylePr w:type="lastCol">
       <w:rPr>
-        <w:rFonts w:ascii="Arial" w:eastAsia="Arial" w:hAnsi="Arial" w:cs="Arial"/>
         <w:b/>
         <w:bCs/>
       </w:rPr>
@@ -11981,7 +11688,6 @@
     </w:tcPr>
     <w:tblStylePr w:type="firstRow">
       <w:rPr>
-        <w:rFonts w:ascii="Arial" w:eastAsia="Arial" w:hAnsi="Arial" w:cs="Arial"/>
         <w:b/>
         <w:bCs/>
       </w:rPr>
@@ -11992,7 +11698,6 @@
     </w:tblStylePr>
     <w:tblStylePr w:type="lastRow">
       <w:rPr>
-        <w:rFonts w:ascii="Arial" w:eastAsia="Arial" w:hAnsi="Arial" w:cs="Arial"/>
         <w:b/>
         <w:bCs/>
         <w:color w:val="000000" w:themeColor="text1"/>
@@ -12004,7 +11709,6 @@
     </w:tblStylePr>
     <w:tblStylePr w:type="firstCol">
       <w:rPr>
-        <w:rFonts w:ascii="Arial" w:eastAsia="Arial" w:hAnsi="Arial" w:cs="Arial"/>
         <w:color w:val="FFFFFF" w:themeColor="background1"/>
       </w:rPr>
       <w:tblPr/>
@@ -12014,7 +11718,6 @@
     </w:tblStylePr>
     <w:tblStylePr w:type="lastCol">
       <w:rPr>
-        <w:rFonts w:ascii="Arial" w:eastAsia="Arial" w:hAnsi="Arial" w:cs="Arial"/>
         <w:color w:val="FFFFFF" w:themeColor="background1"/>
       </w:rPr>
       <w:tblPr/>
@@ -12058,7 +11761,6 @@
     </w:tcPr>
     <w:tblStylePr w:type="firstRow">
       <w:rPr>
-        <w:rFonts w:ascii="Arial" w:eastAsia="Arial" w:hAnsi="Arial" w:cs="Arial"/>
         <w:b/>
         <w:bCs/>
       </w:rPr>
@@ -12069,7 +11771,6 @@
     </w:tblStylePr>
     <w:tblStylePr w:type="lastRow">
       <w:rPr>
-        <w:rFonts w:ascii="Arial" w:eastAsia="Arial" w:hAnsi="Arial" w:cs="Arial"/>
         <w:b/>
         <w:bCs/>
         <w:color w:val="000000" w:themeColor="text1"/>
@@ -12081,7 +11782,6 @@
     </w:tblStylePr>
     <w:tblStylePr w:type="firstCol">
       <w:rPr>
-        <w:rFonts w:ascii="Arial" w:eastAsia="Arial" w:hAnsi="Arial" w:cs="Arial"/>
         <w:color w:val="FFFFFF" w:themeColor="background1"/>
       </w:rPr>
       <w:tblPr/>
@@ -12091,7 +11791,6 @@
     </w:tblStylePr>
     <w:tblStylePr w:type="lastCol">
       <w:rPr>
-        <w:rFonts w:ascii="Arial" w:eastAsia="Arial" w:hAnsi="Arial" w:cs="Arial"/>
         <w:color w:val="FFFFFF" w:themeColor="background1"/>
       </w:rPr>
       <w:tblPr/>
@@ -12135,7 +11834,6 @@
     </w:tcPr>
     <w:tblStylePr w:type="firstRow">
       <w:rPr>
-        <w:rFonts w:ascii="Arial" w:eastAsia="Arial" w:hAnsi="Arial" w:cs="Arial"/>
         <w:b/>
         <w:bCs/>
       </w:rPr>
@@ -12146,7 +11844,6 @@
     </w:tblStylePr>
     <w:tblStylePr w:type="lastRow">
       <w:rPr>
-        <w:rFonts w:ascii="Arial" w:eastAsia="Arial" w:hAnsi="Arial" w:cs="Arial"/>
         <w:b/>
         <w:bCs/>
         <w:color w:val="000000" w:themeColor="text1"/>
@@ -12158,7 +11855,6 @@
     </w:tblStylePr>
     <w:tblStylePr w:type="firstCol">
       <w:rPr>
-        <w:rFonts w:ascii="Arial" w:eastAsia="Arial" w:hAnsi="Arial" w:cs="Arial"/>
         <w:color w:val="FFFFFF" w:themeColor="background1"/>
       </w:rPr>
       <w:tblPr/>
@@ -12168,7 +11864,6 @@
     </w:tblStylePr>
     <w:tblStylePr w:type="lastCol">
       <w:rPr>
-        <w:rFonts w:ascii="Arial" w:eastAsia="Arial" w:hAnsi="Arial" w:cs="Arial"/>
         <w:color w:val="FFFFFF" w:themeColor="background1"/>
       </w:rPr>
       <w:tblPr/>
@@ -12212,7 +11907,6 @@
     </w:tcPr>
     <w:tblStylePr w:type="firstRow">
       <w:rPr>
-        <w:rFonts w:ascii="Arial" w:eastAsia="Arial" w:hAnsi="Arial" w:cs="Arial"/>
         <w:b/>
         <w:bCs/>
       </w:rPr>
@@ -12223,7 +11917,6 @@
     </w:tblStylePr>
     <w:tblStylePr w:type="lastRow">
       <w:rPr>
-        <w:rFonts w:ascii="Arial" w:eastAsia="Arial" w:hAnsi="Arial" w:cs="Arial"/>
         <w:b/>
         <w:bCs/>
         <w:color w:val="000000" w:themeColor="text1"/>
@@ -12235,7 +11928,6 @@
     </w:tblStylePr>
     <w:tblStylePr w:type="firstCol">
       <w:rPr>
-        <w:rFonts w:ascii="Arial" w:eastAsia="Arial" w:hAnsi="Arial" w:cs="Arial"/>
         <w:color w:val="FFFFFF" w:themeColor="background1"/>
       </w:rPr>
       <w:tblPr/>
@@ -12245,7 +11937,6 @@
     </w:tblStylePr>
     <w:tblStylePr w:type="lastCol">
       <w:rPr>
-        <w:rFonts w:ascii="Arial" w:eastAsia="Arial" w:hAnsi="Arial" w:cs="Arial"/>
         <w:color w:val="FFFFFF" w:themeColor="background1"/>
       </w:rPr>
       <w:tblPr/>
@@ -12289,7 +11980,6 @@
     </w:tcPr>
     <w:tblStylePr w:type="firstRow">
       <w:rPr>
-        <w:rFonts w:ascii="Arial" w:eastAsia="Arial" w:hAnsi="Arial" w:cs="Arial"/>
         <w:b/>
         <w:bCs/>
       </w:rPr>
@@ -12300,7 +11990,6 @@
     </w:tblStylePr>
     <w:tblStylePr w:type="lastRow">
       <w:rPr>
-        <w:rFonts w:ascii="Arial" w:eastAsia="Arial" w:hAnsi="Arial" w:cs="Arial"/>
         <w:b/>
         <w:bCs/>
         <w:color w:val="000000" w:themeColor="text1"/>
@@ -12312,7 +12001,6 @@
     </w:tblStylePr>
     <w:tblStylePr w:type="firstCol">
       <w:rPr>
-        <w:rFonts w:ascii="Arial" w:eastAsia="Arial" w:hAnsi="Arial" w:cs="Arial"/>
         <w:color w:val="FFFFFF" w:themeColor="background1"/>
       </w:rPr>
       <w:tblPr/>
@@ -12322,7 +12010,6 @@
     </w:tblStylePr>
     <w:tblStylePr w:type="lastCol">
       <w:rPr>
-        <w:rFonts w:ascii="Arial" w:eastAsia="Arial" w:hAnsi="Arial" w:cs="Arial"/>
         <w:color w:val="FFFFFF" w:themeColor="background1"/>
       </w:rPr>
       <w:tblPr/>
@@ -12366,7 +12053,6 @@
     </w:tcPr>
     <w:tblStylePr w:type="firstRow">
       <w:rPr>
-        <w:rFonts w:ascii="Arial" w:eastAsia="Arial" w:hAnsi="Arial" w:cs="Arial"/>
         <w:b/>
         <w:bCs/>
       </w:rPr>
@@ -12377,7 +12063,6 @@
     </w:tblStylePr>
     <w:tblStylePr w:type="lastRow">
       <w:rPr>
-        <w:rFonts w:ascii="Arial" w:eastAsia="Arial" w:hAnsi="Arial" w:cs="Arial"/>
         <w:b/>
         <w:bCs/>
         <w:color w:val="000000" w:themeColor="text1"/>
@@ -12389,7 +12074,6 @@
     </w:tblStylePr>
     <w:tblStylePr w:type="firstCol">
       <w:rPr>
-        <w:rFonts w:ascii="Arial" w:eastAsia="Arial" w:hAnsi="Arial" w:cs="Arial"/>
         <w:color w:val="FFFFFF" w:themeColor="background1"/>
       </w:rPr>
       <w:tblPr/>
@@ -12399,7 +12083,6 @@
     </w:tblStylePr>
     <w:tblStylePr w:type="lastCol">
       <w:rPr>
-        <w:rFonts w:ascii="Arial" w:eastAsia="Arial" w:hAnsi="Arial" w:cs="Arial"/>
         <w:color w:val="FFFFFF" w:themeColor="background1"/>
       </w:rPr>
       <w:tblPr/>
@@ -12443,7 +12126,6 @@
     </w:tcPr>
     <w:tblStylePr w:type="firstRow">
       <w:rPr>
-        <w:rFonts w:ascii="Arial" w:eastAsia="Arial" w:hAnsi="Arial" w:cs="Arial"/>
         <w:b/>
         <w:bCs/>
       </w:rPr>
@@ -12454,7 +12136,6 @@
     </w:tblStylePr>
     <w:tblStylePr w:type="lastRow">
       <w:rPr>
-        <w:rFonts w:ascii="Arial" w:eastAsia="Arial" w:hAnsi="Arial" w:cs="Arial"/>
         <w:b/>
         <w:bCs/>
         <w:color w:val="000000" w:themeColor="text1"/>
@@ -12466,7 +12147,6 @@
     </w:tblStylePr>
     <w:tblStylePr w:type="firstCol">
       <w:rPr>
-        <w:rFonts w:ascii="Arial" w:eastAsia="Arial" w:hAnsi="Arial" w:cs="Arial"/>
         <w:color w:val="FFFFFF" w:themeColor="background1"/>
       </w:rPr>
       <w:tblPr/>
@@ -12476,7 +12156,6 @@
     </w:tblStylePr>
     <w:tblStylePr w:type="lastCol">
       <w:rPr>
-        <w:rFonts w:ascii="Arial" w:eastAsia="Arial" w:hAnsi="Arial" w:cs="Arial"/>
         <w:color w:val="FFFFFF" w:themeColor="background1"/>
       </w:rPr>
       <w:tblPr/>
@@ -12496,6 +12175,45 @@
         <w:shd w:val="clear" w:color="auto" w:fill="FBCAA2" w:themeFill="accent6" w:themeFillTint="7F"/>
       </w:tcPr>
     </w:tblStylePr>
+  </w:style>
+  <w:style w:type="paragraph" w:styleId="CommentText">
+    <w:name w:val="annotation text"/>
+    <w:basedOn w:val="Normal"/>
+    <w:link w:val="CommentTextChar"/>
+    <w:uiPriority w:val="99"/>
+    <w:semiHidden/>
+    <w:unhideWhenUsed/>
+    <w:pPr>
+      <w:spacing w:line="240" w:lineRule="auto"/>
+    </w:pPr>
+    <w:rPr>
+      <w:sz w:val="20"/>
+      <w:szCs w:val="20"/>
+    </w:rPr>
+  </w:style>
+  <w:style w:type="character" w:customStyle="1" w:styleId="CommentTextChar">
+    <w:name w:val="Comment Text Char"/>
+    <w:basedOn w:val="DefaultParagraphFont"/>
+    <w:link w:val="CommentText"/>
+    <w:uiPriority w:val="99"/>
+    <w:semiHidden/>
+    <w:rPr>
+      <w:rFonts w:ascii="Arial" w:hAnsi="Arial"/>
+      <w:color w:val="000000"/>
+      <w:sz w:val="20"/>
+      <w:szCs w:val="20"/>
+    </w:rPr>
+  </w:style>
+  <w:style w:type="character" w:styleId="CommentReference">
+    <w:name w:val="annotation reference"/>
+    <w:basedOn w:val="DefaultParagraphFont"/>
+    <w:uiPriority w:val="99"/>
+    <w:semiHidden/>
+    <w:unhideWhenUsed/>
+    <w:rPr>
+      <w:sz w:val="16"/>
+      <w:szCs w:val="16"/>
+    </w:rPr>
   </w:style>
 </w:styles>
 </file>
@@ -12543,7 +12261,7 @@
     </a:clrScheme>
     <a:fontScheme name="Office">
       <a:majorFont>
-        <a:latin typeface="Arial"/>
+        <a:latin typeface="Calibri"/>
         <a:ea typeface=""/>
         <a:cs typeface=""/>
         <a:font script="Jpan" typeface="ＭＳ ゴシック"/>
@@ -12578,7 +12296,7 @@
         <a:font script="Geor" typeface="Sylfaen"/>
       </a:majorFont>
       <a:minorFont>
-        <a:latin typeface="Arial"/>
+        <a:latin typeface="Cambria"/>
         <a:ea typeface=""/>
         <a:cs typeface=""/>
         <a:font script="Jpan" typeface="ＭＳ 明朝"/>

</xml_diff>